<commit_message>
Finalize phase 2 runtime and documentation
</commit_message>
<xml_diff>
--- a/docs/user-guide/K8s-AI-Ops-Platform-menu-guide.docx
+++ b/docs/user-guide/K8s-AI-Ops-Platform-menu-guide.docx
@@ -464,7 +464,7 @@
         <w:drawing>
           <wp:inline xmlns:a="http://schemas.openxmlformats.org/drawingml/2006/main" xmlns:pic="http://schemas.openxmlformats.org/drawingml/2006/picture">
             <wp:extent cx="6400800" cy="3840480"/>
-            <wp:docPr id="1" name="Picture 1"/>
+            <wp:docPr id="1" name="Picture 1" descr="KlueOps 메뉴를 운영 관리, AI, 설정 영역으로 구분한 구조도" title="KlueOps 메뉴를 운영 관리, AI, 설정 영역으로 구분한 구조도"/>
             <wp:cNvGraphicFramePr>
               <a:graphicFrameLocks noChangeAspect="1"/>
             </wp:cNvGraphicFramePr>
@@ -1233,7 +1233,7 @@
         <w:drawing>
           <wp:inline xmlns:a="http://schemas.openxmlformats.org/drawingml/2006/main" xmlns:pic="http://schemas.openxmlformats.org/drawingml/2006/picture">
             <wp:extent cx="6400800" cy="2316480"/>
-            <wp:docPr id="2" name="Picture 2"/>
+            <wp:docPr id="2" name="Picture 2" descr="감지부터 검증과 해결까지 이어지는 권장 운영 흐름도" title="감지부터 검증과 해결까지 이어지는 권장 운영 흐름도"/>
             <wp:cNvGraphicFramePr>
               <a:graphicFrameLocks noChangeAspect="1"/>
             </wp:cNvGraphicFramePr>
@@ -1373,7 +1373,7 @@
         <w:drawing>
           <wp:inline xmlns:a="http://schemas.openxmlformats.org/drawingml/2006/main" xmlns:pic="http://schemas.openxmlformats.org/drawingml/2006/picture">
             <wp:extent cx="6400800" cy="3307080"/>
-            <wp:docPr id="3" name="Picture 3"/>
+            <wp:docPr id="3" name="Picture 3" descr="Platform, Tenant, Workspace, Cluster, Namespace, Resource의 관리 범위와 데이터 흐름도" title="Platform, Tenant, Workspace, Cluster, Namespace, Resource의 관리 범위와 데이터 흐름도"/>
             <wp:cNvGraphicFramePr>
               <a:graphicFrameLocks noChangeAspect="1"/>
             </wp:cNvGraphicFramePr>
@@ -3349,41 +3349,43 @@
       <w:r>
         <w:rPr>
           <w:rFonts w:ascii="AppleGothic" w:hAnsi="AppleGothic" w:eastAsia="AppleGothic" w:cs="AppleGothic"/>
-          <w:b/>
-          <w:color w:val="246BCE"/>
-          <w:sz w:val="21"/>
         </w:rPr>
-        <w:t xml:space="preserve">목적  </w:t>
+        <w:t>목적  Tenant Chart를 Custom Values로 Cluster에 Helm 배포하고 Application 상태와 수명주기를 운영합니다.</w:t>
       </w:r>
+    </w:p>
+    <w:p>
+      <w:pPr>
+        <w:spacing w:after="80"/>
+      </w:pPr>
       <w:r>
         <w:rPr>
           <w:rFonts w:ascii="AppleGothic" w:hAnsi="AppleGothic" w:eastAsia="AppleGothic" w:cs="AppleGothic"/>
-          <w:color w:val="182433"/>
-          <w:sz w:val="21"/>
         </w:rPr>
-        <w:t>관련 Kubernetes 리소스를 애플리케이션 관점으로 묶어 상태와 제한된 운영 조치를 제공합니다.</w:t>
+        <w:t>사용 시점  Artifact Hub Chart를 가져오거나 보유 Chart를 Cluster와 Namespace에 배포하고 상태를 확인할 때 사용합니다.</w:t>
       </w:r>
     </w:p>
     <w:p>
       <w:pPr>
-        <w:spacing w:after="80"/>
+        <w:pStyle w:val="ListBullet"/>
+        <w:spacing w:after="60"/>
       </w:pPr>
       <w:r>
         <w:rPr>
           <w:rFonts w:ascii="AppleGothic" w:hAnsi="AppleGothic" w:eastAsia="AppleGothic" w:cs="AppleGothic"/>
-          <w:b/>
-          <w:color w:val="14866D"/>
-          <w:sz w:val="21"/>
         </w:rPr>
-        <w:t xml:space="preserve">사용 시점  </w:t>
+        <w:t>Chart Library를 기본 시작점으로 사용하고 Chart가 없을 때 Discover 또는 Source/.tgz 가져오기를 선택합니다.</w:t>
       </w:r>
+    </w:p>
+    <w:p>
+      <w:pPr>
+        <w:pStyle w:val="ListBullet"/>
+        <w:spacing w:after="60"/>
+      </w:pPr>
       <w:r>
         <w:rPr>
           <w:rFonts w:ascii="AppleGothic" w:hAnsi="AppleGothic" w:eastAsia="AppleGothic" w:cs="AppleGothic"/>
-          <w:color w:val="182433"/>
-          <w:sz w:val="21"/>
         </w:rPr>
-        <w:t>개별 Pod보다 서비스 단위로 상태, 분석, Restart와 Rollback을 확인할 때 사용합니다.</w:t>
+        <w:t>Values Profile, 대상 Cluster/Namespace, 선택형 HTTPRoute를 설정한 뒤 Preview와 정확한 확인 문구를 거쳐 배포합니다.</w:t>
       </w:r>
     </w:p>
     <w:p>
@@ -3394,84 +3396,32 @@
       <w:r>
         <w:rPr>
           <w:rFonts w:ascii="AppleGothic" w:hAnsi="AppleGothic" w:eastAsia="AppleGothic" w:cs="AppleGothic"/>
-          <w:color w:val="182433"/>
-          <w:sz w:val="20"/>
         </w:rPr>
-        <w:t>AI Analysis에서 식별한 Application의 상태를 확인합니다.</w:t>
+        <w:t>Application 상세에서 workload/Pod, Service·접근 경로, Helm History와 upgrade/rollback/uninstall을 확인합니다.</w:t>
       </w:r>
     </w:p>
     <w:p>
       <w:pPr>
-        <w:pStyle w:val="ListBullet"/>
-        <w:spacing w:after="60"/>
+        <w:spacing w:before="60" w:after="100"/>
+        <w:ind w:left="198"/>
       </w:pPr>
       <w:r>
         <w:rPr>
           <w:rFonts w:ascii="AppleGothic" w:hAnsi="AppleGothic" w:eastAsia="AppleGothic" w:cs="AppleGothic"/>
-          <w:color w:val="182433"/>
-          <w:sz w:val="20"/>
         </w:rPr>
-        <w:t>상태 동기화, 보호된 Restart, Rollback preview와 실행을 제공합니다.</w:t>
+        <w:t>처음 사용할 때  Chart Library에서 검증된 버전을 선택하고 내부 Service 방식으로 작은 테스트 배포부터 시작합니다.</w:t>
       </w:r>
     </w:p>
     <w:p>
       <w:pPr>
-        <w:pStyle w:val="ListBullet"/>
-        <w:spacing w:after="60"/>
+        <w:spacing w:after="120"/>
+        <w:ind w:left="198"/>
       </w:pPr>
       <w:r>
         <w:rPr>
           <w:rFonts w:ascii="AppleGothic" w:hAnsi="AppleGothic" w:eastAsia="AppleGothic" w:cs="AppleGothic"/>
-          <w:color w:val="182433"/>
-          <w:sz w:val="20"/>
         </w:rPr>
-        <w:t>Application 범위 AI Analysis와 최근 운영 작업으로 연결합니다.</w:t>
-      </w:r>
-    </w:p>
-    <w:p>
-      <w:pPr>
-        <w:spacing w:before="60" w:after="100"/>
-        <w:ind w:left="198"/>
-      </w:pPr>
-      <w:r>
-        <w:rPr>
-          <w:rFonts w:ascii="AppleGothic" w:hAnsi="AppleGothic" w:eastAsia="AppleGothic" w:cs="AppleGothic"/>
-          <w:b/>
-          <w:color w:val="A56A00"/>
-          <w:sz w:val="19"/>
-        </w:rPr>
-        <w:t xml:space="preserve">처음 사용할 때  </w:t>
-      </w:r>
-      <w:r>
-        <w:rPr>
-          <w:rFonts w:ascii="AppleGothic" w:hAnsi="AppleGothic" w:eastAsia="AppleGothic" w:cs="AppleGothic"/>
-          <w:color w:val="5E7084"/>
-          <w:sz w:val="19"/>
-        </w:rPr>
-        <w:t>현재는 애플리케이션 운영 화면이며 완성된 Docker 또는 Helm 배포 플랫폼이 아닙니다.</w:t>
-      </w:r>
-    </w:p>
-    <w:p>
-      <w:pPr>
-        <w:spacing w:after="120"/>
-        <w:ind w:left="198"/>
-      </w:pPr>
-      <w:r>
-        <w:rPr>
-          <w:rFonts w:ascii="AppleGothic" w:hAnsi="AppleGothic" w:eastAsia="AppleGothic" w:cs="AppleGothic"/>
-          <w:b/>
-          <w:color w:val="B42318"/>
-          <w:sz w:val="19"/>
-        </w:rPr>
-        <w:t xml:space="preserve">주의  </w:t>
-      </w:r>
-      <w:r>
-        <w:rPr>
-          <w:rFonts w:ascii="AppleGothic" w:hAnsi="AppleGothic" w:eastAsia="AppleGothic" w:cs="AppleGothic"/>
-          <w:color w:val="5E7084"/>
-          <w:sz w:val="19"/>
-        </w:rPr>
-        <w:t>미구현 배포 API를 상용 배포 기능으로 해석하면 안 됩니다. GitOps 연동은 후속 범위입니다.</w:t>
+        <w:t>주의  이 기능은 GitOps Controller가 아닙니다. 대상, Values와 Preview를 확인한 명시적 Helm 작업만 실행합니다.</w:t>
       </w:r>
     </w:p>
     <w:p>
@@ -4869,6 +4819,88 @@
           <w:sz w:val="40"/>
         </w:rPr>
         <w:t>11 설정 메뉴 2와 권한</w:t>
+      </w:r>
+    </w:p>
+    <w:p>
+      <w:pPr>
+        <w:pStyle w:val="Heading2"/>
+      </w:pPr>
+      <w:r>
+        <w:rPr>
+          <w:rFonts w:ascii="AppleGothic" w:hAnsi="AppleGothic" w:eastAsia="AppleGothic" w:cs="AppleGothic"/>
+        </w:rPr>
+        <w:t>AI Provider와 Local Models</w:t>
+      </w:r>
+    </w:p>
+    <w:p>
+      <w:pPr/>
+      <w:r>
+        <w:rPr>
+          <w:rFonts w:ascii="AppleGothic" w:hAnsi="AppleGothic" w:eastAsia="AppleGothic" w:cs="AppleGothic"/>
+        </w:rPr>
+        <w:t>목적  Local Ollama와 선택형 외부 LLM 연결, 모델과 Tenant 목적별 사용 경로를 관리합니다.</w:t>
+      </w:r>
+    </w:p>
+    <w:p>
+      <w:pPr/>
+      <w:r>
+        <w:rPr>
+          <w:rFonts w:ascii="AppleGothic" w:hAnsi="AppleGothic" w:eastAsia="AppleGothic" w:cs="AppleGothic"/>
+        </w:rPr>
+        <w:t>사용 시점  AI Analysis, AI Chat과 Helm Values 제안에 사용할 Provider나 모델을 변경할 때 사용합니다.</w:t>
+      </w:r>
+    </w:p>
+    <w:p>
+      <w:pPr>
+        <w:pStyle w:val="ListBullet"/>
+      </w:pPr>
+      <w:r>
+        <w:rPr>
+          <w:rFonts w:ascii="AppleGothic" w:hAnsi="AppleGothic" w:eastAsia="AppleGothic" w:cs="AppleGothic"/>
+        </w:rPr>
+        <w:t>Platform Manager는 Provider profile과 credential을 등록하고 연결을 검증합니다.</w:t>
+      </w:r>
+    </w:p>
+    <w:p>
+      <w:pPr>
+        <w:pStyle w:val="ListBullet"/>
+      </w:pPr>
+      <w:r>
+        <w:rPr>
+          <w:rFonts w:ascii="AppleGothic" w:hAnsi="AppleGothic" w:eastAsia="AppleGothic" w:cs="AppleGothic"/>
+        </w:rPr>
+        <w:t>Tenant 관리자는 허용된 profile/model을 목적별로 선택하고 외부 전송 여부를 명시적으로 설정합니다.</w:t>
+      </w:r>
+    </w:p>
+    <w:p>
+      <w:pPr>
+        <w:pStyle w:val="ListBullet"/>
+      </w:pPr>
+      <w:r>
+        <w:rPr>
+          <w:rFonts w:ascii="AppleGothic" w:hAnsi="AppleGothic" w:eastAsia="AppleGothic" w:cs="AppleGothic"/>
+        </w:rPr>
+        <w:t>Local Models에서는 Ollama 설치 모델을 동기화하고 승인 목록의 9B 이하 모델만 추가합니다.</w:t>
+      </w:r>
+    </w:p>
+    <w:p>
+      <w:pPr>
+        <w:pStyle w:val="ListBullet"/>
+      </w:pPr>
+      <w:r>
+        <w:rPr>
+          <w:rFonts w:ascii="AppleGothic" w:hAnsi="AppleGothic" w:eastAsia="AppleGothic" w:cs="AppleGothic"/>
+        </w:rPr>
+        <w:t>API key와 credential은 저장 후 다시 표시하지 않으며 화면과 로그에서 마스킹합니다.</w:t>
+      </w:r>
+    </w:p>
+    <w:p>
+      <w:pPr/>
+      <w:r>
+        <w:rPr>
+          <w:rFonts w:ascii="AppleGothic" w:hAnsi="AppleGothic" w:eastAsia="AppleGothic" w:cs="AppleGothic"/>
+        </w:rPr>
+        <w:t>주의  외부 Provider 사용은 Tenant 데이터 반출 결정입니다. 전송 범위와 fallback을 확인한 뒤 활성화합니다.</w:t>
       </w:r>
     </w:p>
     <w:p>
@@ -5974,11 +6006,8 @@
       <w:r>
         <w:rPr>
           <w:rFonts w:ascii="AppleGothic" w:hAnsi="AppleGothic" w:eastAsia="AppleGothic" w:cs="AppleGothic"/>
-          <w:b/>
-          <w:color w:val="000000"/>
-          <w:sz w:val="40"/>
         </w:rPr>
-        <w:t>12 Applications와 Argo CD의 향후 방향</w:t>
+        <w:t>12 Application Delivery 운영 경계</w:t>
       </w:r>
     </w:p>
     <w:p>
@@ -5986,75 +6015,30 @@
         <w:rPr>
           <w:rFonts w:ascii="AppleGothic" w:hAnsi="AppleGothic" w:eastAsia="AppleGothic" w:cs="AppleGothic"/>
         </w:rPr>
-        <w:t>Argo CD는 후속 선택 연동으로 둡니다. 현재 AIOps는 Argo CD가 없어도 Kubernetes API, Event, Log와 Snapshot을 이용해 진단할 수 있어야 합니다. 연동된 환경에서는 배포 변경과 장애의 관계를 더 정확히 설명하고 안전한 수동 Sync를 제공할 수 있습니다.</w:t>
+        <w:t>Application Delivery는 KlueOps가 관리하는 Helm Release를 명시적으로 배포·변경·삭제합니다. Argo CD나 Flux를 설치하거나 Git 상태를 지속 동기화하지 않으며, Tenant가 별도로 운영하는 GitOps Controller와 책임을 섞지 않습니다.</w:t>
       </w:r>
     </w:p>
     <w:p>
       <w:pPr>
-        <w:spacing w:before="100" w:after="80"/>
-        <w:jc w:val="center"/>
+        <w:pStyle w:val="Heading2"/>
       </w:pPr>
       <w:r>
         <w:rPr>
           <w:rFonts w:ascii="AppleGothic" w:hAnsi="AppleGothic" w:eastAsia="AppleGothic" w:cs="AppleGothic"/>
         </w:rPr>
-        <w:drawing>
-          <wp:inline xmlns:a="http://schemas.openxmlformats.org/drawingml/2006/main" xmlns:pic="http://schemas.openxmlformats.org/drawingml/2006/picture">
-            <wp:extent cx="6400800" cy="3301465"/>
-            <wp:docPr id="4" name="Picture 4"/>
-            <wp:cNvGraphicFramePr>
-              <a:graphicFrameLocks noChangeAspect="1"/>
-            </wp:cNvGraphicFramePr>
-            <a:graphic>
-              <a:graphicData uri="http://schemas.openxmlformats.org/drawingml/2006/picture">
-                <pic:pic>
-                  <pic:nvPicPr>
-                    <pic:cNvPr id="0" name="argocd-boundary.png"/>
-                    <pic:cNvPicPr/>
-                  </pic:nvPicPr>
-                  <pic:blipFill>
-                    <a:blip r:embed="rId13"/>
-                    <a:stretch>
-                      <a:fillRect/>
-                    </a:stretch>
-                  </pic:blipFill>
-                  <pic:spPr>
-                    <a:xfrm>
-                      <a:off x="0" y="0"/>
-                      <a:ext cx="6400800" cy="3301465"/>
-                    </a:xfrm>
-                    <a:prstGeom prst="rect"/>
-                  </pic:spPr>
-                </pic:pic>
-              </a:graphicData>
-            </a:graphic>
-          </wp:inline>
-        </w:drawing>
+        <w:t>안전한 운영 순서</w:t>
       </w:r>
     </w:p>
     <w:p>
       <w:pPr>
-        <w:spacing w:after="160"/>
-        <w:jc w:val="center"/>
-      </w:pPr>
-      <w:r>
-        <w:rPr>
-          <w:rFonts w:ascii="AppleGothic" w:hAnsi="AppleGothic" w:eastAsia="AppleGothic" w:cs="AppleGothic"/>
-          <w:color w:val="5E7084"/>
-          <w:sz w:val="17"/>
-        </w:rPr>
-        <w:t>그림 4 AIOps와 Argo CD의 권장 책임 경계</w:t>
-      </w:r>
-    </w:p>
-    <w:p>
-      <w:pPr>
-        <w:pStyle w:val="Heading2"/>
+        <w:spacing w:after="80"/>
+        <w:ind w:left="397" w:hanging="397"/>
       </w:pPr>
       <w:r>
         <w:rPr>
           <w:rFonts w:ascii="AppleGothic" w:hAnsi="AppleGothic" w:eastAsia="AppleGothic" w:cs="AppleGothic"/>
         </w:rPr>
-        <w:t>단계별 연동 순서</w:t>
+        <w:t>1.  Tenant Library의 Chart 버전과 Values revision을 고정하고 대상 Cluster와 Namespace를 확인합니다.</w:t>
       </w:r>
     </w:p>
     <w:p>
@@ -6065,10 +6049,8 @@
       <w:r>
         <w:rPr>
           <w:rFonts w:ascii="AppleGothic" w:hAnsi="AppleGothic" w:eastAsia="AppleGothic" w:cs="AppleGothic"/>
-          <w:color w:val="182433"/>
-          <w:sz w:val="20"/>
         </w:rPr>
-        <w:t>1.  읽기 전용으로 Application, Health, Sync, Drift, Git revision과 배포 이력을 수집합니다.</w:t>
+        <w:t>2.  Preview에서 렌더링 결과, Secret 마스킹, Namespace와 Exposure 계획을 확인합니다.</w:t>
       </w:r>
     </w:p>
     <w:p>
@@ -6079,10 +6061,8 @@
       <w:r>
         <w:rPr>
           <w:rFonts w:ascii="AppleGothic" w:hAnsi="AppleGothic" w:eastAsia="AppleGothic" w:cs="AppleGothic"/>
-          <w:color w:val="182433"/>
-          <w:sz w:val="20"/>
         </w:rPr>
-        <w:t>2.  배포 시각과 Incident, Event, Log, Rollout 상태를 시간축으로 연결합니다.</w:t>
+        <w:t>3.  정확한 확인 문구로 Helm 작업을 시작하고 Job과 Application History에서 진행·실패 단계를 추적합니다.</w:t>
       </w:r>
     </w:p>
     <w:p>
@@ -6093,24 +6073,8 @@
       <w:r>
         <w:rPr>
           <w:rFonts w:ascii="AppleGothic" w:hAnsi="AppleGothic" w:eastAsia="AppleGothic" w:cs="AppleGothic"/>
-          <w:color w:val="182433"/>
-          <w:sz w:val="20"/>
         </w:rPr>
-        <w:t>3.  Diff와 실행 전 검증을 제공하고 RBAC와 Audit가 적용된 수동 Refresh 및 Sync를 허용합니다.</w:t>
-      </w:r>
-    </w:p>
-    <w:p>
-      <w:pPr>
-        <w:spacing w:after="80"/>
-        <w:ind w:left="397" w:hanging="397"/>
-      </w:pPr>
-      <w:r>
-        <w:rPr>
-          <w:rFonts w:ascii="AppleGothic" w:hAnsi="AppleGothic" w:eastAsia="AppleGothic" w:cs="AppleGothic"/>
-          <w:color w:val="182433"/>
-          <w:sz w:val="20"/>
-        </w:rPr>
-        <w:t>4.  자동 Prune, 강제 Sync, Application 삭제와 Git 또는 Helm values 직접 수정은 별도 승인 전까지 제외합니다.</w:t>
+        <w:t>4.  작업 후 workload/Pod, Service와 endpoint를 검증하고 필요할 때 preview 후 rollback 또는 uninstall합니다.</w:t>
       </w:r>
     </w:p>
     <w:p>

</xml_diff>

<commit_message>
Add application exposure delivery paths
</commit_message>
<xml_diff>
--- a/docs/user-guide/K8s-AI-Ops-Platform-menu-guide.docx
+++ b/docs/user-guide/K8s-AI-Ops-Platform-menu-guide.docx
@@ -3385,7 +3385,7 @@
         <w:rPr>
           <w:rFonts w:ascii="AppleGothic" w:hAnsi="AppleGothic" w:eastAsia="AppleGothic" w:cs="AppleGothic"/>
         </w:rPr>
-        <w:t>Values Profile, 대상 Cluster/Namespace, 선택형 HTTPRoute를 설정한 뒤 Preview와 정확한 확인 문구를 거쳐 배포합니다.</w:t>
+        <w:t>Values Profile과 대상 Cluster/Namespace를 정한 뒤 Cluster 내부, Chart에서 관리, KlueOps HTTPRoute 중 노출 방식을 선택하고 Preview와 정확한 확인 문구를 거쳐 배포합니다.</w:t>
       </w:r>
     </w:p>
     <w:p>
@@ -3397,7 +3397,7 @@
         <w:rPr>
           <w:rFonts w:ascii="AppleGothic" w:hAnsi="AppleGothic" w:eastAsia="AppleGothic" w:cs="AppleGothic"/>
         </w:rPr>
-        <w:t>Application 상세에서 workload/Pod, Service·접근 경로, Helm History와 upgrade/rollback/uninstall을 확인합니다.</w:t>
+        <w:t>Application 상세에서 workload/Pod, Service·Ingress·HTTPRoute URL과 endpoint 상태, Helm History와 upgrade/rollback/uninstall을 확인합니다.</w:t>
       </w:r>
     </w:p>
     <w:p>
@@ -6074,7 +6074,7 @@
         <w:rPr>
           <w:rFonts w:ascii="AppleGothic" w:hAnsi="AppleGothic" w:eastAsia="AppleGothic" w:cs="AppleGothic"/>
         </w:rPr>
-        <w:t>4.  작업 후 workload/Pod, Service와 endpoint를 검증하고 필요할 때 preview 후 rollback 또는 uninstall합니다.</w:t>
+        <w:t>4.  작업 후 workload/Pod, Service와 Ingress/HTTPRoute endpoint 상태를 검증하고 필요할 때 preview 후 rollback 또는 uninstall합니다.</w:t>
       </w:r>
     </w:p>
     <w:p>

</xml_diff>

<commit_message>
Reorganize navigation by product domain
</commit_message>
<xml_diff>
--- a/docs/user-guide/K8s-AI-Ops-Platform-menu-guide.docx
+++ b/docs/user-guide/K8s-AI-Ops-Platform-menu-guide.docx
@@ -438,64 +438,535 @@
         <w:rPr>
           <w:rFonts w:ascii="Arial Unicode MS" w:hAnsi="Arial Unicode MS" w:eastAsia="Arial Unicode MS" w:cs="Arial Unicode MS"/>
         </w:rPr>
-        <w:t>플랫폼 기능은 운영 관리, AI, 설정의 세 영역으로 구성됩니다. 메뉴는 로그인 사용자의 capability에 따라 달라지므로 다른 사용자에게 보이는 메뉴가 다를 수 있습니다.</w:t>
+        <w:t>좌측 메뉴는 개요, 운영 대응, 인프라, Application Delivery, AI 운영, 거버넌스, 플랫폼 설정과 개인 영역으로 구성됩니다. 구조는 화면마다 바뀌지 않으며, 로그인 사용자의 capability와 Tenant 기능 정책에 따라 접근할 수 없는 그룹은 제목과 메뉴를 함께 숨깁니다.</w:t>
       </w:r>
     </w:p>
+    <w:tbl>
+      <w:tblPr>
+        <w:tblStyle w:val="TableGrid"/>
+        <w:tblW w:type="auto" w:w="0"/>
+        <w:tblLayout w:type="fixed"/>
+        <w:tblLook w:firstColumn="1" w:firstRow="1" w:lastColumn="0" w:lastRow="0" w:noHBand="0" w:noVBand="1" w:val="04A0"/>
+        <w:tblBorders>
+          <w:top w:val="single" w:sz="6" w:color="D9D9D9"/>
+          <w:left w:val="single" w:sz="6" w:color="D9D9D9"/>
+          <w:bottom w:val="single" w:sz="6" w:color="D9D9D9"/>
+          <w:right w:val="single" w:sz="6" w:color="D9D9D9"/>
+          <w:insideH w:val="single" w:sz="6" w:color="D9D9D9"/>
+          <w:insideV w:val="single" w:sz="6" w:color="D9D9D9"/>
+        </w:tblBorders>
+      </w:tblPr>
+      <w:tblGrid>
+        <w:gridCol w:w="2592"/>
+        <w:gridCol w:w="7200"/>
+      </w:tblGrid>
+      <w:tr>
+        <w:tc>
+          <w:tcPr>
+            <w:tcW w:type="dxa" w:w="4876"/>
+            <w:shd w:fill="173653"/>
+            <w:vAlign w:val="center"/>
+            <w:tcMar>
+              <w:top w:w="70" w:type="dxa"/>
+              <w:start w:w="100" w:type="dxa"/>
+              <w:bottom w:w="70" w:type="dxa"/>
+              <w:end w:w="100" w:type="dxa"/>
+            </w:tcMar>
+          </w:tcPr>
+          <w:p>
+            <w:pPr>
+              <w:jc w:val="center"/>
+            </w:pPr>
+            <w:r>
+              <w:rPr>
+                <w:rFonts w:ascii="Arial Unicode MS" w:hAnsi="Arial Unicode MS" w:eastAsia="Arial Unicode MS" w:cs="Arial Unicode MS"/>
+                <w:b/>
+                <w:sz w:val="18"/>
+                <w:color w:val="FFFFFF"/>
+              </w:rPr>
+              <w:t>업무 영역</w:t>
+            </w:r>
+          </w:p>
+        </w:tc>
+        <w:tc>
+          <w:tcPr>
+            <w:tcW w:type="dxa" w:w="4876"/>
+            <w:shd w:fill="173653"/>
+            <w:vAlign w:val="center"/>
+            <w:tcMar>
+              <w:top w:w="70" w:type="dxa"/>
+              <w:start w:w="100" w:type="dxa"/>
+              <w:bottom w:w="70" w:type="dxa"/>
+              <w:end w:w="100" w:type="dxa"/>
+            </w:tcMar>
+          </w:tcPr>
+          <w:p>
+            <w:pPr>
+              <w:jc w:val="center"/>
+            </w:pPr>
+            <w:r>
+              <w:rPr>
+                <w:rFonts w:ascii="Arial Unicode MS" w:hAnsi="Arial Unicode MS" w:eastAsia="Arial Unicode MS" w:cs="Arial Unicode MS"/>
+                <w:b/>
+                <w:sz w:val="18"/>
+                <w:color w:val="FFFFFF"/>
+              </w:rPr>
+              <w:t>포함 메뉴</w:t>
+            </w:r>
+          </w:p>
+        </w:tc>
+      </w:tr>
+      <w:tr>
+        <w:tc>
+          <w:tcPr>
+            <w:tcW w:type="dxa" w:w="2592"/>
+            <w:vAlign w:val="center"/>
+            <w:tcMar>
+              <w:top w:w="70" w:type="dxa"/>
+              <w:start w:w="100" w:type="dxa"/>
+              <w:bottom w:w="70" w:type="dxa"/>
+              <w:end w:w="100" w:type="dxa"/>
+            </w:tcMar>
+          </w:tcPr>
+          <w:p>
+            <w:pPr>
+              <w:spacing w:before="0" w:after="0" w:line="240" w:lineRule="auto"/>
+              <w:jc w:val="center"/>
+            </w:pPr>
+            <w:r>
+              <w:rPr>
+                <w:rFonts w:ascii="Arial Unicode MS" w:hAnsi="Arial Unicode MS" w:eastAsia="Arial Unicode MS" w:cs="Arial Unicode MS"/>
+                <w:b/>
+                <w:sz w:val="17"/>
+              </w:rPr>
+              <w:t>개요</w:t>
+            </w:r>
+          </w:p>
+        </w:tc>
+        <w:tc>
+          <w:tcPr>
+            <w:tcW w:type="dxa" w:w="7200"/>
+            <w:vAlign w:val="center"/>
+            <w:tcMar>
+              <w:top w:w="70" w:type="dxa"/>
+              <w:start w:w="100" w:type="dxa"/>
+              <w:bottom w:w="70" w:type="dxa"/>
+              <w:end w:w="100" w:type="dxa"/>
+            </w:tcMar>
+          </w:tcPr>
+          <w:p>
+            <w:pPr>
+              <w:spacing w:before="0" w:after="0" w:line="240" w:lineRule="auto"/>
+              <w:jc w:val="left"/>
+            </w:pPr>
+            <w:r>
+              <w:rPr>
+                <w:rFonts w:ascii="Arial Unicode MS" w:hAnsi="Arial Unicode MS" w:eastAsia="Arial Unicode MS" w:cs="Arial Unicode MS"/>
+                <w:b w:val="0"/>
+                <w:sz w:val="17"/>
+              </w:rPr>
+              <w:t>Dashboard</w:t>
+            </w:r>
+          </w:p>
+        </w:tc>
+      </w:tr>
+      <w:tr>
+        <w:tc>
+          <w:tcPr>
+            <w:tcW w:type="dxa" w:w="2592"/>
+            <w:vAlign w:val="center"/>
+            <w:shd w:fill="F3F7FB"/>
+            <w:tcMar>
+              <w:top w:w="70" w:type="dxa"/>
+              <w:start w:w="100" w:type="dxa"/>
+              <w:bottom w:w="70" w:type="dxa"/>
+              <w:end w:w="100" w:type="dxa"/>
+            </w:tcMar>
+          </w:tcPr>
+          <w:p>
+            <w:pPr>
+              <w:spacing w:before="0" w:after="0" w:line="240" w:lineRule="auto"/>
+              <w:jc w:val="center"/>
+            </w:pPr>
+            <w:r>
+              <w:rPr>
+                <w:rFonts w:ascii="Arial Unicode MS" w:hAnsi="Arial Unicode MS" w:eastAsia="Arial Unicode MS" w:cs="Arial Unicode MS"/>
+                <w:b/>
+                <w:sz w:val="17"/>
+              </w:rPr>
+              <w:t>운영 대응</w:t>
+            </w:r>
+          </w:p>
+        </w:tc>
+        <w:tc>
+          <w:tcPr>
+            <w:tcW w:type="dxa" w:w="7200"/>
+            <w:vAlign w:val="center"/>
+            <w:shd w:fill="F3F7FB"/>
+            <w:tcMar>
+              <w:top w:w="70" w:type="dxa"/>
+              <w:start w:w="100" w:type="dxa"/>
+              <w:bottom w:w="70" w:type="dxa"/>
+              <w:end w:w="100" w:type="dxa"/>
+            </w:tcMar>
+          </w:tcPr>
+          <w:p>
+            <w:pPr>
+              <w:spacing w:before="0" w:after="0" w:line="240" w:lineRule="auto"/>
+              <w:jc w:val="left"/>
+            </w:pPr>
+            <w:r>
+              <w:rPr>
+                <w:rFonts w:ascii="Arial Unicode MS" w:hAnsi="Arial Unicode MS" w:eastAsia="Arial Unicode MS" w:cs="Arial Unicode MS"/>
+                <w:b w:val="0"/>
+                <w:sz w:val="17"/>
+              </w:rPr>
+              <w:t>Triage · Fleet Command · Incidents</w:t>
+            </w:r>
+          </w:p>
+        </w:tc>
+      </w:tr>
+      <w:tr>
+        <w:tc>
+          <w:tcPr>
+            <w:tcW w:type="dxa" w:w="2592"/>
+            <w:vAlign w:val="center"/>
+            <w:tcMar>
+              <w:top w:w="70" w:type="dxa"/>
+              <w:start w:w="100" w:type="dxa"/>
+              <w:bottom w:w="70" w:type="dxa"/>
+              <w:end w:w="100" w:type="dxa"/>
+            </w:tcMar>
+          </w:tcPr>
+          <w:p>
+            <w:pPr>
+              <w:spacing w:before="0" w:after="0" w:line="240" w:lineRule="auto"/>
+              <w:jc w:val="center"/>
+            </w:pPr>
+            <w:r>
+              <w:rPr>
+                <w:rFonts w:ascii="Arial Unicode MS" w:hAnsi="Arial Unicode MS" w:eastAsia="Arial Unicode MS" w:cs="Arial Unicode MS"/>
+                <w:b/>
+                <w:sz w:val="17"/>
+              </w:rPr>
+              <w:t>인프라</w:t>
+            </w:r>
+          </w:p>
+        </w:tc>
+        <w:tc>
+          <w:tcPr>
+            <w:tcW w:type="dxa" w:w="7200"/>
+            <w:vAlign w:val="center"/>
+            <w:tcMar>
+              <w:top w:w="70" w:type="dxa"/>
+              <w:start w:w="100" w:type="dxa"/>
+              <w:bottom w:w="70" w:type="dxa"/>
+              <w:end w:w="100" w:type="dxa"/>
+            </w:tcMar>
+          </w:tcPr>
+          <w:p>
+            <w:pPr>
+              <w:spacing w:before="0" w:after="0" w:line="240" w:lineRule="auto"/>
+              <w:jc w:val="left"/>
+            </w:pPr>
+            <w:r>
+              <w:rPr>
+                <w:rFonts w:ascii="Arial Unicode MS" w:hAnsi="Arial Unicode MS" w:eastAsia="Arial Unicode MS" w:cs="Arial Unicode MS"/>
+                <w:b w:val="0"/>
+                <w:sz w:val="17"/>
+              </w:rPr>
+              <w:t>Clusters</w:t>
+            </w:r>
+          </w:p>
+        </w:tc>
+      </w:tr>
+      <w:tr>
+        <w:tc>
+          <w:tcPr>
+            <w:tcW w:type="dxa" w:w="2592"/>
+            <w:vAlign w:val="center"/>
+            <w:shd w:fill="F3F7FB"/>
+            <w:tcMar>
+              <w:top w:w="70" w:type="dxa"/>
+              <w:start w:w="100" w:type="dxa"/>
+              <w:bottom w:w="70" w:type="dxa"/>
+              <w:end w:w="100" w:type="dxa"/>
+            </w:tcMar>
+          </w:tcPr>
+          <w:p>
+            <w:pPr>
+              <w:spacing w:before="0" w:after="0" w:line="240" w:lineRule="auto"/>
+              <w:jc w:val="center"/>
+            </w:pPr>
+            <w:r>
+              <w:rPr>
+                <w:rFonts w:ascii="Arial Unicode MS" w:hAnsi="Arial Unicode MS" w:eastAsia="Arial Unicode MS" w:cs="Arial Unicode MS"/>
+                <w:b/>
+                <w:sz w:val="17"/>
+              </w:rPr>
+              <w:t>Application Delivery</w:t>
+            </w:r>
+          </w:p>
+        </w:tc>
+        <w:tc>
+          <w:tcPr>
+            <w:tcW w:type="dxa" w:w="7200"/>
+            <w:vAlign w:val="center"/>
+            <w:shd w:fill="F3F7FB"/>
+            <w:tcMar>
+              <w:top w:w="70" w:type="dxa"/>
+              <w:start w:w="100" w:type="dxa"/>
+              <w:bottom w:w="70" w:type="dxa"/>
+              <w:end w:w="100" w:type="dxa"/>
+            </w:tcMar>
+          </w:tcPr>
+          <w:p>
+            <w:pPr>
+              <w:spacing w:before="0" w:after="0" w:line="240" w:lineRule="auto"/>
+              <w:jc w:val="left"/>
+            </w:pPr>
+            <w:r>
+              <w:rPr>
+                <w:rFonts w:ascii="Arial Unicode MS" w:hAnsi="Arial Unicode MS" w:eastAsia="Arial Unicode MS" w:cs="Arial Unicode MS"/>
+                <w:b w:val="0"/>
+                <w:sz w:val="17"/>
+              </w:rPr>
+              <w:t>Applications</w:t>
+            </w:r>
+          </w:p>
+        </w:tc>
+      </w:tr>
+      <w:tr>
+        <w:tc>
+          <w:tcPr>
+            <w:tcW w:type="dxa" w:w="2592"/>
+            <w:vAlign w:val="center"/>
+            <w:tcMar>
+              <w:top w:w="70" w:type="dxa"/>
+              <w:start w:w="100" w:type="dxa"/>
+              <w:bottom w:w="70" w:type="dxa"/>
+              <w:end w:w="100" w:type="dxa"/>
+            </w:tcMar>
+          </w:tcPr>
+          <w:p>
+            <w:pPr>
+              <w:spacing w:before="0" w:after="0" w:line="240" w:lineRule="auto"/>
+              <w:jc w:val="center"/>
+            </w:pPr>
+            <w:r>
+              <w:rPr>
+                <w:rFonts w:ascii="Arial Unicode MS" w:hAnsi="Arial Unicode MS" w:eastAsia="Arial Unicode MS" w:cs="Arial Unicode MS"/>
+                <w:b/>
+                <w:sz w:val="17"/>
+              </w:rPr>
+              <w:t>AI 운영</w:t>
+            </w:r>
+          </w:p>
+        </w:tc>
+        <w:tc>
+          <w:tcPr>
+            <w:tcW w:type="dxa" w:w="7200"/>
+            <w:vAlign w:val="center"/>
+            <w:tcMar>
+              <w:top w:w="70" w:type="dxa"/>
+              <w:start w:w="100" w:type="dxa"/>
+              <w:bottom w:w="70" w:type="dxa"/>
+              <w:end w:w="100" w:type="dxa"/>
+            </w:tcMar>
+          </w:tcPr>
+          <w:p>
+            <w:pPr>
+              <w:spacing w:before="0" w:after="0" w:line="240" w:lineRule="auto"/>
+              <w:jc w:val="left"/>
+            </w:pPr>
+            <w:r>
+              <w:rPr>
+                <w:rFonts w:ascii="Arial Unicode MS" w:hAnsi="Arial Unicode MS" w:eastAsia="Arial Unicode MS" w:cs="Arial Unicode MS"/>
+                <w:b w:val="0"/>
+                <w:sz w:val="17"/>
+              </w:rPr>
+              <w:t>AI Analysis · AI Chat · Runbooks · AI 신뢰 센터</w:t>
+            </w:r>
+          </w:p>
+        </w:tc>
+      </w:tr>
+      <w:tr>
+        <w:tc>
+          <w:tcPr>
+            <w:tcW w:type="dxa" w:w="2592"/>
+            <w:vAlign w:val="center"/>
+            <w:shd w:fill="F3F7FB"/>
+            <w:tcMar>
+              <w:top w:w="70" w:type="dxa"/>
+              <w:start w:w="100" w:type="dxa"/>
+              <w:bottom w:w="70" w:type="dxa"/>
+              <w:end w:w="100" w:type="dxa"/>
+            </w:tcMar>
+          </w:tcPr>
+          <w:p>
+            <w:pPr>
+              <w:spacing w:before="0" w:after="0" w:line="240" w:lineRule="auto"/>
+              <w:jc w:val="center"/>
+            </w:pPr>
+            <w:r>
+              <w:rPr>
+                <w:rFonts w:ascii="Arial Unicode MS" w:hAnsi="Arial Unicode MS" w:eastAsia="Arial Unicode MS" w:cs="Arial Unicode MS"/>
+                <w:b/>
+                <w:sz w:val="17"/>
+              </w:rPr>
+              <w:t>거버넌스</w:t>
+            </w:r>
+          </w:p>
+        </w:tc>
+        <w:tc>
+          <w:tcPr>
+            <w:tcW w:type="dxa" w:w="7200"/>
+            <w:vAlign w:val="center"/>
+            <w:shd w:fill="F3F7FB"/>
+            <w:tcMar>
+              <w:top w:w="70" w:type="dxa"/>
+              <w:start w:w="100" w:type="dxa"/>
+              <w:bottom w:w="70" w:type="dxa"/>
+              <w:end w:w="100" w:type="dxa"/>
+            </w:tcMar>
+          </w:tcPr>
+          <w:p>
+            <w:pPr>
+              <w:spacing w:before="0" w:after="0" w:line="240" w:lineRule="auto"/>
+              <w:jc w:val="left"/>
+            </w:pPr>
+            <w:r>
+              <w:rPr>
+                <w:rFonts w:ascii="Arial Unicode MS" w:hAnsi="Arial Unicode MS" w:eastAsia="Arial Unicode MS" w:cs="Arial Unicode MS"/>
+                <w:b w:val="0"/>
+                <w:sz w:val="17"/>
+              </w:rPr>
+              <w:t>Policies · Audit · Operations Reliability</w:t>
+            </w:r>
+          </w:p>
+        </w:tc>
+      </w:tr>
+      <w:tr>
+        <w:tc>
+          <w:tcPr>
+            <w:tcW w:type="dxa" w:w="2592"/>
+            <w:vAlign w:val="center"/>
+            <w:tcMar>
+              <w:top w:w="70" w:type="dxa"/>
+              <w:start w:w="100" w:type="dxa"/>
+              <w:bottom w:w="70" w:type="dxa"/>
+              <w:end w:w="100" w:type="dxa"/>
+            </w:tcMar>
+          </w:tcPr>
+          <w:p>
+            <w:pPr>
+              <w:spacing w:before="0" w:after="0" w:line="240" w:lineRule="auto"/>
+              <w:jc w:val="center"/>
+            </w:pPr>
+            <w:r>
+              <w:rPr>
+                <w:rFonts w:ascii="Arial Unicode MS" w:hAnsi="Arial Unicode MS" w:eastAsia="Arial Unicode MS" w:cs="Arial Unicode MS"/>
+                <w:b/>
+                <w:sz w:val="17"/>
+              </w:rPr>
+              <w:t>플랫폼 설정</w:t>
+            </w:r>
+          </w:p>
+        </w:tc>
+        <w:tc>
+          <w:tcPr>
+            <w:tcW w:type="dxa" w:w="7200"/>
+            <w:vAlign w:val="center"/>
+            <w:tcMar>
+              <w:top w:w="70" w:type="dxa"/>
+              <w:start w:w="100" w:type="dxa"/>
+              <w:bottom w:w="70" w:type="dxa"/>
+              <w:end w:w="100" w:type="dxa"/>
+            </w:tcMar>
+          </w:tcPr>
+          <w:p>
+            <w:pPr>
+              <w:spacing w:before="0" w:after="0" w:line="240" w:lineRule="auto"/>
+              <w:jc w:val="left"/>
+            </w:pPr>
+            <w:r>
+              <w:rPr>
+                <w:rFonts w:ascii="Arial Unicode MS" w:hAnsi="Arial Unicode MS" w:eastAsia="Arial Unicode MS" w:cs="Arial Unicode MS"/>
+                <w:b w:val="0"/>
+                <w:sz w:val="17"/>
+              </w:rPr>
+              <w:t>Data &amp; Runtime · AI Providers · 사용자 및 권한 · Tenant 관리</w:t>
+            </w:r>
+          </w:p>
+        </w:tc>
+      </w:tr>
+      <w:tr>
+        <w:tc>
+          <w:tcPr>
+            <w:tcW w:type="dxa" w:w="2592"/>
+            <w:vAlign w:val="center"/>
+            <w:shd w:fill="F3F7FB"/>
+            <w:tcMar>
+              <w:top w:w="70" w:type="dxa"/>
+              <w:start w:w="100" w:type="dxa"/>
+              <w:bottom w:w="70" w:type="dxa"/>
+              <w:end w:w="100" w:type="dxa"/>
+            </w:tcMar>
+          </w:tcPr>
+          <w:p>
+            <w:pPr>
+              <w:spacing w:before="0" w:after="0" w:line="240" w:lineRule="auto"/>
+              <w:jc w:val="center"/>
+            </w:pPr>
+            <w:r>
+              <w:rPr>
+                <w:rFonts w:ascii="Arial Unicode MS" w:hAnsi="Arial Unicode MS" w:eastAsia="Arial Unicode MS" w:cs="Arial Unicode MS"/>
+                <w:b/>
+                <w:sz w:val="17"/>
+              </w:rPr>
+              <w:t>개인 영역</w:t>
+            </w:r>
+          </w:p>
+        </w:tc>
+        <w:tc>
+          <w:tcPr>
+            <w:tcW w:type="dxa" w:w="7200"/>
+            <w:vAlign w:val="center"/>
+            <w:shd w:fill="F3F7FB"/>
+            <w:tcMar>
+              <w:top w:w="70" w:type="dxa"/>
+              <w:start w:w="100" w:type="dxa"/>
+              <w:bottom w:w="70" w:type="dxa"/>
+              <w:end w:w="100" w:type="dxa"/>
+            </w:tcMar>
+          </w:tcPr>
+          <w:p>
+            <w:pPr>
+              <w:spacing w:before="0" w:after="0" w:line="240" w:lineRule="auto"/>
+              <w:jc w:val="left"/>
+            </w:pPr>
+            <w:r>
+              <w:rPr>
+                <w:rFonts w:ascii="Arial Unicode MS" w:hAnsi="Arial Unicode MS" w:eastAsia="Arial Unicode MS" w:cs="Arial Unicode MS"/>
+                <w:b w:val="0"/>
+                <w:sz w:val="17"/>
+              </w:rPr>
+              <w:t>사용자 설정</w:t>
+            </w:r>
+          </w:p>
+        </w:tc>
+      </w:tr>
+    </w:tbl>
     <w:p>
       <w:pPr>
-        <w:spacing w:before="100" w:after="80"/>
+        <w:spacing w:after="160"/>
         <w:jc w:val="center"/>
       </w:pPr>
       <w:r>
         <w:rPr>
           <w:rFonts w:ascii="Arial Unicode MS" w:hAnsi="Arial Unicode MS" w:eastAsia="Arial Unicode MS" w:cs="Arial Unicode MS"/>
         </w:rPr>
-        <w:drawing>
-          <wp:inline xmlns:a="http://schemas.openxmlformats.org/drawingml/2006/main" xmlns:pic="http://schemas.openxmlformats.org/drawingml/2006/picture">
-            <wp:extent cx="6400800" cy="3840480"/>
-            <wp:docPr id="1" name="Picture 1" descr="KlueOps 메뉴를 운영 관리, AI, 설정 영역으로 구분한 구조도" title="KlueOps 메뉴를 운영 관리, AI, 설정 영역으로 구분한 구조도"/>
-            <wp:cNvGraphicFramePr>
-              <a:graphicFrameLocks noChangeAspect="1"/>
-            </wp:cNvGraphicFramePr>
-            <a:graphic>
-              <a:graphicData uri="http://schemas.openxmlformats.org/drawingml/2006/picture">
-                <pic:pic>
-                  <pic:nvPicPr>
-                    <pic:cNvPr id="0" name="menu-map.png"/>
-                    <pic:cNvPicPr/>
-                  </pic:nvPicPr>
-                  <pic:blipFill>
-                    <a:blip r:embed="rId10"/>
-                    <a:stretch>
-                      <a:fillRect/>
-                    </a:stretch>
-                  </pic:blipFill>
-                  <pic:spPr>
-                    <a:xfrm>
-                      <a:off x="0" y="0"/>
-                      <a:ext cx="6400800" cy="3840480"/>
-                    </a:xfrm>
-                    <a:prstGeom prst="rect"/>
-                  </pic:spPr>
-                </pic:pic>
-              </a:graphicData>
-            </a:graphic>
-          </wp:inline>
-        </w:drawing>
-      </w:r>
-    </w:p>
-    <w:p>
-      <w:pPr>
-        <w:spacing w:after="160"/>
-        <w:jc w:val="center"/>
-      </w:pPr>
-      <w:r>
-        <w:rPr>
-          <w:rFonts w:ascii="Arial Unicode MS" w:hAnsi="Arial Unicode MS" w:eastAsia="Arial Unicode MS" w:cs="Arial Unicode MS"/>
-          <w:color w:val="5E7084"/>
-          <w:sz w:val="17"/>
-        </w:rPr>
-        <w:t>그림 1 좌측 메뉴의 기능 그룹</w:t>
+        <w:t>그림 1 역할과 기능에 따른 좌측 메뉴 그룹</w:t>
       </w:r>
     </w:p>
     <w:p>
@@ -528,7 +999,7 @@
         <w:rPr>
           <w:rFonts w:ascii="Arial Unicode MS" w:hAnsi="Arial Unicode MS" w:eastAsia="Arial Unicode MS" w:cs="Arial Unicode MS"/>
         </w:rPr>
-        <w:t>짙은 좌측 내비게이션은 운영 관리, AI와 설정 기능을 구분하며 현재 메뉴를 파란 표시선으로 보여줍니다.</w:t>
+        <w:t>짙은 좌측 내비게이션은 기능을 업무 영역별로 구분하며 현재 메뉴를 파란 표시선으로 보여줍니다. 권한이 없는 그룹은 제목과 메뉴를 함께 표시하지 않습니다.</w:t>
       </w:r>
     </w:p>
     <w:p>

</xml_diff>

<commit_message>
fix: finalize application cleanup lifecycle
</commit_message>
<xml_diff>
--- a/docs/user-guide/K8s-AI-Ops-Platform-menu-guide.docx
+++ b/docs/user-guide/K8s-AI-Ops-Platform-menu-guide.docx
@@ -10,7 +10,7 @@
       </w:pPr>
       <w:r>
         <w:rPr>
-          <w:rFonts w:ascii="Apple SD Gothic Neo" w:hAnsi="Apple SD Gothic Neo" w:eastAsia="Apple SD Gothic Neo" w:cs="Apple SD Gothic Neo"/>
+          <w:rFonts w:ascii="AppleGothic" w:hAnsi="AppleGothic" w:eastAsia="AppleGothic" w:cs="AppleGothic"/>
           <w:b/>
           <w:color w:val="000000"/>
           <w:sz w:val="47"/>
@@ -24,7 +24,7 @@
       </w:pPr>
       <w:r>
         <w:rPr>
-          <w:rFonts w:ascii="Apple SD Gothic Neo" w:hAnsi="Apple SD Gothic Neo" w:eastAsia="Apple SD Gothic Neo" w:cs="Apple SD Gothic Neo"/>
+          <w:rFonts w:ascii="AppleGothic" w:hAnsi="AppleGothic" w:eastAsia="AppleGothic" w:cs="AppleGothic"/>
         </w:rPr>
         <w:t>플랫폼 기능과 권장 운영 흐름</w:t>
       </w:r>
@@ -35,7 +35,7 @@
       </w:pPr>
       <w:r>
         <w:rPr>
-          <w:rFonts w:ascii="Apple SD Gothic Neo" w:hAnsi="Apple SD Gothic Neo" w:eastAsia="Apple SD Gothic Neo" w:cs="Apple SD Gothic Neo"/>
+          <w:rFonts w:ascii="AppleGothic" w:hAnsi="AppleGothic" w:eastAsia="AppleGothic" w:cs="AppleGothic"/>
           <w:color w:val="182433"/>
           <w:sz w:val="22"/>
         </w:rPr>
@@ -45,7 +45,7 @@
     <w:p>
       <w:r>
         <w:rPr>
-          <w:rFonts w:ascii="Apple SD Gothic Neo" w:hAnsi="Apple SD Gothic Neo" w:eastAsia="Apple SD Gothic Neo" w:cs="Apple SD Gothic Neo"/>
+          <w:rFonts w:ascii="AppleGothic" w:hAnsi="AppleGothic" w:eastAsia="AppleGothic" w:cs="AppleGothic"/>
         </w:rPr>
         <w:t>제품 방향  KlueOps는 Kubernetes 운영 AIOps와 Tenant별 Helm Application Delivery를 제공합니다. Argo CD나 Flux를 설치하거나 Git 상태를 지속 동기화하지 않으며, 별도 GitOps Controller의 책임과 섞지 않습니다.</w:t>
       </w:r>
@@ -91,7 +91,7 @@
             </w:pPr>
             <w:r>
               <w:rPr>
-                <w:rFonts w:ascii="Apple SD Gothic Neo" w:hAnsi="Apple SD Gothic Neo" w:eastAsia="Apple SD Gothic Neo" w:cs="Apple SD Gothic Neo"/>
+                <w:rFonts w:ascii="AppleGothic" w:hAnsi="AppleGothic" w:eastAsia="AppleGothic" w:cs="AppleGothic"/>
                 <w:b/>
                 <w:color w:val="FFFFFF"/>
                 <w:sz w:val="19"/>
@@ -126,7 +126,7 @@
             </w:pPr>
             <w:r>
               <w:rPr>
-                <w:rFonts w:ascii="Apple SD Gothic Neo" w:hAnsi="Apple SD Gothic Neo" w:eastAsia="Apple SD Gothic Neo" w:cs="Apple SD Gothic Neo"/>
+                <w:rFonts w:ascii="AppleGothic" w:hAnsi="AppleGothic" w:eastAsia="AppleGothic" w:cs="AppleGothic"/>
                 <w:b/>
                 <w:color w:val="FFFFFF"/>
                 <w:sz w:val="19"/>
@@ -163,7 +163,7 @@
             </w:pPr>
             <w:r>
               <w:rPr>
-                <w:rFonts w:ascii="Apple SD Gothic Neo" w:hAnsi="Apple SD Gothic Neo" w:eastAsia="Apple SD Gothic Neo" w:cs="Apple SD Gothic Neo"/>
+                <w:rFonts w:ascii="AppleGothic" w:hAnsi="AppleGothic" w:eastAsia="AppleGothic" w:cs="AppleGothic"/>
                 <w:color w:val="182433"/>
                 <w:sz w:val="18"/>
               </w:rPr>
@@ -197,7 +197,7 @@
             </w:pPr>
             <w:r>
               <w:rPr>
-                <w:rFonts w:ascii="Apple SD Gothic Neo" w:hAnsi="Apple SD Gothic Neo" w:eastAsia="Apple SD Gothic Neo" w:cs="Apple SD Gothic Neo"/>
+                <w:rFonts w:ascii="AppleGothic" w:hAnsi="AppleGothic" w:eastAsia="AppleGothic" w:cs="AppleGothic"/>
                 <w:color w:val="182433"/>
                 <w:sz w:val="18"/>
               </w:rPr>
@@ -233,7 +233,7 @@
             </w:pPr>
             <w:r>
               <w:rPr>
-                <w:rFonts w:ascii="Apple SD Gothic Neo" w:hAnsi="Apple SD Gothic Neo" w:eastAsia="Apple SD Gothic Neo" w:cs="Apple SD Gothic Neo"/>
+                <w:rFonts w:ascii="AppleGothic" w:hAnsi="AppleGothic" w:eastAsia="AppleGothic" w:cs="AppleGothic"/>
                 <w:color w:val="182433"/>
                 <w:sz w:val="18"/>
               </w:rPr>
@@ -267,7 +267,7 @@
             </w:pPr>
             <w:r>
               <w:rPr>
-                <w:rFonts w:ascii="Apple SD Gothic Neo" w:hAnsi="Apple SD Gothic Neo" w:eastAsia="Apple SD Gothic Neo" w:cs="Apple SD Gothic Neo"/>
+                <w:rFonts w:ascii="AppleGothic" w:hAnsi="AppleGothic" w:eastAsia="AppleGothic" w:cs="AppleGothic"/>
                 <w:color w:val="182433"/>
                 <w:sz w:val="18"/>
               </w:rPr>
@@ -303,7 +303,7 @@
             </w:pPr>
             <w:r>
               <w:rPr>
-                <w:rFonts w:ascii="Apple SD Gothic Neo" w:hAnsi="Apple SD Gothic Neo" w:eastAsia="Apple SD Gothic Neo" w:cs="Apple SD Gothic Neo"/>
+                <w:rFonts w:ascii="AppleGothic" w:hAnsi="AppleGothic" w:eastAsia="AppleGothic" w:cs="AppleGothic"/>
                 <w:color w:val="182433"/>
                 <w:sz w:val="18"/>
               </w:rPr>
@@ -337,7 +337,7 @@
             </w:pPr>
             <w:r>
               <w:rPr>
-                <w:rFonts w:ascii="Apple SD Gothic Neo" w:hAnsi="Apple SD Gothic Neo" w:eastAsia="Apple SD Gothic Neo" w:cs="Apple SD Gothic Neo"/>
+                <w:rFonts w:ascii="AppleGothic" w:hAnsi="AppleGothic" w:eastAsia="AppleGothic" w:cs="AppleGothic"/>
                 <w:color w:val="182433"/>
                 <w:sz w:val="18"/>
               </w:rPr>
@@ -373,7 +373,7 @@
             </w:pPr>
             <w:r>
               <w:rPr>
-                <w:rFonts w:ascii="Apple SD Gothic Neo" w:hAnsi="Apple SD Gothic Neo" w:eastAsia="Apple SD Gothic Neo" w:cs="Apple SD Gothic Neo"/>
+                <w:rFonts w:ascii="AppleGothic" w:hAnsi="AppleGothic" w:eastAsia="AppleGothic" w:cs="AppleGothic"/>
                 <w:color w:val="182433"/>
                 <w:sz w:val="18"/>
               </w:rPr>
@@ -407,7 +407,7 @@
             </w:pPr>
             <w:r>
               <w:rPr>
-                <w:rFonts w:ascii="Apple SD Gothic Neo" w:hAnsi="Apple SD Gothic Neo" w:eastAsia="Apple SD Gothic Neo" w:cs="Apple SD Gothic Neo"/>
+                <w:rFonts w:ascii="AppleGothic" w:hAnsi="AppleGothic" w:eastAsia="AppleGothic" w:cs="AppleGothic"/>
                 <w:color w:val="182433"/>
                 <w:sz w:val="18"/>
               </w:rPr>
@@ -425,7 +425,7 @@
       </w:pPr>
       <w:r>
         <w:rPr>
-          <w:rFonts w:ascii="Apple SD Gothic Neo" w:hAnsi="Apple SD Gothic Neo" w:eastAsia="Apple SD Gothic Neo" w:cs="Apple SD Gothic Neo"/>
+          <w:rFonts w:ascii="AppleGothic" w:hAnsi="AppleGothic" w:eastAsia="AppleGothic" w:cs="AppleGothic"/>
           <w:b/>
           <w:color w:val="000000"/>
           <w:sz w:val="40"/>
@@ -436,7 +436,7 @@
     <w:p>
       <w:r>
         <w:rPr>
-          <w:rFonts w:ascii="Apple SD Gothic Neo" w:hAnsi="Apple SD Gothic Neo" w:eastAsia="Apple SD Gothic Neo" w:cs="Apple SD Gothic Neo"/>
+          <w:rFonts w:ascii="AppleGothic" w:hAnsi="AppleGothic" w:eastAsia="AppleGothic" w:cs="AppleGothic"/>
         </w:rPr>
         <w:t>좌측 메뉴는 개요, 운영 대응, 인프라, Application Delivery, AI 운영, 거버넌스, 플랫폼 설정과 개인 영역으로 구성됩니다. 구조는 화면마다 바뀌지 않으며, 로그인 사용자의 capability와 Tenant 기능 정책에 따라 접근할 수 없는 그룹은 제목과 메뉴를 함께 숨깁니다.</w:t>
       </w:r>
@@ -479,7 +479,7 @@
             </w:pPr>
             <w:r>
               <w:rPr>
-                <w:rFonts w:ascii="Apple SD Gothic Neo" w:hAnsi="Apple SD Gothic Neo" w:eastAsia="Apple SD Gothic Neo" w:cs="Apple SD Gothic Neo"/>
+                <w:rFonts w:ascii="AppleGothic" w:hAnsi="AppleGothic" w:eastAsia="AppleGothic" w:cs="AppleGothic"/>
                 <w:b/>
                 <w:sz w:val="18"/>
                 <w:color w:val="FFFFFF"/>
@@ -506,7 +506,7 @@
             </w:pPr>
             <w:r>
               <w:rPr>
-                <w:rFonts w:ascii="Apple SD Gothic Neo" w:hAnsi="Apple SD Gothic Neo" w:eastAsia="Apple SD Gothic Neo" w:cs="Apple SD Gothic Neo"/>
+                <w:rFonts w:ascii="AppleGothic" w:hAnsi="AppleGothic" w:eastAsia="AppleGothic" w:cs="AppleGothic"/>
                 <w:b/>
                 <w:sz w:val="18"/>
                 <w:color w:val="FFFFFF"/>
@@ -535,7 +535,7 @@
             </w:pPr>
             <w:r>
               <w:rPr>
-                <w:rFonts w:ascii="Apple SD Gothic Neo" w:hAnsi="Apple SD Gothic Neo" w:eastAsia="Apple SD Gothic Neo" w:cs="Apple SD Gothic Neo"/>
+                <w:rFonts w:ascii="AppleGothic" w:hAnsi="AppleGothic" w:eastAsia="AppleGothic" w:cs="AppleGothic"/>
                 <w:b/>
                 <w:sz w:val="17"/>
               </w:rPr>
@@ -561,7 +561,7 @@
             </w:pPr>
             <w:r>
               <w:rPr>
-                <w:rFonts w:ascii="Apple SD Gothic Neo" w:hAnsi="Apple SD Gothic Neo" w:eastAsia="Apple SD Gothic Neo" w:cs="Apple SD Gothic Neo"/>
+                <w:rFonts w:ascii="AppleGothic" w:hAnsi="AppleGothic" w:eastAsia="AppleGothic" w:cs="AppleGothic"/>
                 <w:b w:val="0"/>
                 <w:sz w:val="17"/>
               </w:rPr>
@@ -590,7 +590,7 @@
             </w:pPr>
             <w:r>
               <w:rPr>
-                <w:rFonts w:ascii="Apple SD Gothic Neo" w:hAnsi="Apple SD Gothic Neo" w:eastAsia="Apple SD Gothic Neo" w:cs="Apple SD Gothic Neo"/>
+                <w:rFonts w:ascii="AppleGothic" w:hAnsi="AppleGothic" w:eastAsia="AppleGothic" w:cs="AppleGothic"/>
                 <w:b/>
                 <w:sz w:val="17"/>
               </w:rPr>
@@ -617,7 +617,7 @@
             </w:pPr>
             <w:r>
               <w:rPr>
-                <w:rFonts w:ascii="Apple SD Gothic Neo" w:hAnsi="Apple SD Gothic Neo" w:eastAsia="Apple SD Gothic Neo" w:cs="Apple SD Gothic Neo"/>
+                <w:rFonts w:ascii="AppleGothic" w:hAnsi="AppleGothic" w:eastAsia="AppleGothic" w:cs="AppleGothic"/>
                 <w:b w:val="0"/>
                 <w:sz w:val="17"/>
               </w:rPr>
@@ -645,7 +645,7 @@
             </w:pPr>
             <w:r>
               <w:rPr>
-                <w:rFonts w:ascii="Apple SD Gothic Neo" w:hAnsi="Apple SD Gothic Neo" w:eastAsia="Apple SD Gothic Neo" w:cs="Apple SD Gothic Neo"/>
+                <w:rFonts w:ascii="AppleGothic" w:hAnsi="AppleGothic" w:eastAsia="AppleGothic" w:cs="AppleGothic"/>
                 <w:b/>
                 <w:sz w:val="17"/>
               </w:rPr>
@@ -671,7 +671,7 @@
             </w:pPr>
             <w:r>
               <w:rPr>
-                <w:rFonts w:ascii="Apple SD Gothic Neo" w:hAnsi="Apple SD Gothic Neo" w:eastAsia="Apple SD Gothic Neo" w:cs="Apple SD Gothic Neo"/>
+                <w:rFonts w:ascii="AppleGothic" w:hAnsi="AppleGothic" w:eastAsia="AppleGothic" w:cs="AppleGothic"/>
                 <w:b w:val="0"/>
                 <w:sz w:val="17"/>
               </w:rPr>
@@ -700,7 +700,7 @@
             </w:pPr>
             <w:r>
               <w:rPr>
-                <w:rFonts w:ascii="Apple SD Gothic Neo" w:hAnsi="Apple SD Gothic Neo" w:eastAsia="Apple SD Gothic Neo" w:cs="Apple SD Gothic Neo"/>
+                <w:rFonts w:ascii="AppleGothic" w:hAnsi="AppleGothic" w:eastAsia="AppleGothic" w:cs="AppleGothic"/>
                 <w:b/>
                 <w:sz w:val="17"/>
               </w:rPr>
@@ -727,7 +727,7 @@
             </w:pPr>
             <w:r>
               <w:rPr>
-                <w:rFonts w:ascii="Apple SD Gothic Neo" w:hAnsi="Apple SD Gothic Neo" w:eastAsia="Apple SD Gothic Neo" w:cs="Apple SD Gothic Neo"/>
+                <w:rFonts w:ascii="AppleGothic" w:hAnsi="AppleGothic" w:eastAsia="AppleGothic" w:cs="AppleGothic"/>
                 <w:b w:val="0"/>
                 <w:sz w:val="17"/>
               </w:rPr>
@@ -755,7 +755,7 @@
             </w:pPr>
             <w:r>
               <w:rPr>
-                <w:rFonts w:ascii="Apple SD Gothic Neo" w:hAnsi="Apple SD Gothic Neo" w:eastAsia="Apple SD Gothic Neo" w:cs="Apple SD Gothic Neo"/>
+                <w:rFonts w:ascii="AppleGothic" w:hAnsi="AppleGothic" w:eastAsia="AppleGothic" w:cs="AppleGothic"/>
                 <w:b/>
                 <w:sz w:val="17"/>
               </w:rPr>
@@ -781,7 +781,7 @@
             </w:pPr>
             <w:r>
               <w:rPr>
-                <w:rFonts w:ascii="Apple SD Gothic Neo" w:hAnsi="Apple SD Gothic Neo" w:eastAsia="Apple SD Gothic Neo" w:cs="Apple SD Gothic Neo"/>
+                <w:rFonts w:ascii="AppleGothic" w:hAnsi="AppleGothic" w:eastAsia="AppleGothic" w:cs="AppleGothic"/>
                 <w:b w:val="0"/>
                 <w:sz w:val="17"/>
               </w:rPr>
@@ -810,7 +810,7 @@
             </w:pPr>
             <w:r>
               <w:rPr>
-                <w:rFonts w:ascii="Apple SD Gothic Neo" w:hAnsi="Apple SD Gothic Neo" w:eastAsia="Apple SD Gothic Neo" w:cs="Apple SD Gothic Neo"/>
+                <w:rFonts w:ascii="AppleGothic" w:hAnsi="AppleGothic" w:eastAsia="AppleGothic" w:cs="AppleGothic"/>
                 <w:b/>
                 <w:sz w:val="17"/>
               </w:rPr>
@@ -837,7 +837,7 @@
             </w:pPr>
             <w:r>
               <w:rPr>
-                <w:rFonts w:ascii="Apple SD Gothic Neo" w:hAnsi="Apple SD Gothic Neo" w:eastAsia="Apple SD Gothic Neo" w:cs="Apple SD Gothic Neo"/>
+                <w:rFonts w:ascii="AppleGothic" w:hAnsi="AppleGothic" w:eastAsia="AppleGothic" w:cs="AppleGothic"/>
                 <w:b w:val="0"/>
                 <w:sz w:val="17"/>
               </w:rPr>
@@ -865,7 +865,7 @@
             </w:pPr>
             <w:r>
               <w:rPr>
-                <w:rFonts w:ascii="Apple SD Gothic Neo" w:hAnsi="Apple SD Gothic Neo" w:eastAsia="Apple SD Gothic Neo" w:cs="Apple SD Gothic Neo"/>
+                <w:rFonts w:ascii="AppleGothic" w:hAnsi="AppleGothic" w:eastAsia="AppleGothic" w:cs="AppleGothic"/>
                 <w:b/>
                 <w:sz w:val="17"/>
               </w:rPr>
@@ -891,7 +891,7 @@
             </w:pPr>
             <w:r>
               <w:rPr>
-                <w:rFonts w:ascii="Apple SD Gothic Neo" w:hAnsi="Apple SD Gothic Neo" w:eastAsia="Apple SD Gothic Neo" w:cs="Apple SD Gothic Neo"/>
+                <w:rFonts w:ascii="AppleGothic" w:hAnsi="AppleGothic" w:eastAsia="AppleGothic" w:cs="AppleGothic"/>
                 <w:b w:val="0"/>
                 <w:sz w:val="17"/>
               </w:rPr>
@@ -920,7 +920,7 @@
             </w:pPr>
             <w:r>
               <w:rPr>
-                <w:rFonts w:ascii="Apple SD Gothic Neo" w:hAnsi="Apple SD Gothic Neo" w:eastAsia="Apple SD Gothic Neo" w:cs="Apple SD Gothic Neo"/>
+                <w:rFonts w:ascii="AppleGothic" w:hAnsi="AppleGothic" w:eastAsia="AppleGothic" w:cs="AppleGothic"/>
                 <w:b/>
                 <w:sz w:val="17"/>
               </w:rPr>
@@ -947,7 +947,7 @@
             </w:pPr>
             <w:r>
               <w:rPr>
-                <w:rFonts w:ascii="Apple SD Gothic Neo" w:hAnsi="Apple SD Gothic Neo" w:eastAsia="Apple SD Gothic Neo" w:cs="Apple SD Gothic Neo"/>
+                <w:rFonts w:ascii="AppleGothic" w:hAnsi="AppleGothic" w:eastAsia="AppleGothic" w:cs="AppleGothic"/>
                 <w:b w:val="0"/>
                 <w:sz w:val="17"/>
               </w:rPr>
@@ -964,7 +964,7 @@
       </w:pPr>
       <w:r>
         <w:rPr>
-          <w:rFonts w:ascii="Apple SD Gothic Neo" w:hAnsi="Apple SD Gothic Neo" w:eastAsia="Apple SD Gothic Neo" w:cs="Apple SD Gothic Neo"/>
+          <w:rFonts w:ascii="AppleGothic" w:hAnsi="AppleGothic" w:eastAsia="AppleGothic" w:cs="AppleGothic"/>
         </w:rPr>
         <w:t>그림 1 역할과 기능에 따른 좌측 메뉴 그룹</w:t>
       </w:r>
@@ -975,7 +975,7 @@
       </w:pPr>
       <w:r>
         <w:rPr>
-          <w:rFonts w:ascii="Apple SD Gothic Neo" w:hAnsi="Apple SD Gothic Neo" w:eastAsia="Apple SD Gothic Neo" w:cs="Apple SD Gothic Neo"/>
+          <w:rFonts w:ascii="AppleGothic" w:hAnsi="AppleGothic" w:eastAsia="AppleGothic" w:cs="AppleGothic"/>
         </w:rPr>
         <w:t>공통 화면 요소</w:t>
       </w:r>
@@ -986,7 +986,7 @@
       </w:pPr>
       <w:r>
         <w:rPr>
-          <w:rFonts w:ascii="Apple SD Gothic Neo" w:hAnsi="Apple SD Gothic Neo" w:eastAsia="Apple SD Gothic Neo" w:cs="Apple SD Gothic Neo"/>
+          <w:rFonts w:ascii="AppleGothic" w:hAnsi="AppleGothic" w:eastAsia="AppleGothic" w:cs="AppleGothic"/>
         </w:rPr>
         <w:t>상단 컨텍스트 바에서 현재 Tenant와 Workspace를 확인하고 변경합니다. 목록과 분석 결과는 선택한 운영 범위에 맞춰 다시 조회됩니다.</w:t>
       </w:r>
@@ -997,7 +997,7 @@
       </w:pPr>
       <w:r>
         <w:rPr>
-          <w:rFonts w:ascii="Apple SD Gothic Neo" w:hAnsi="Apple SD Gothic Neo" w:eastAsia="Apple SD Gothic Neo" w:cs="Apple SD Gothic Neo"/>
+          <w:rFonts w:ascii="AppleGothic" w:hAnsi="AppleGothic" w:eastAsia="AppleGothic" w:cs="AppleGothic"/>
         </w:rPr>
         <w:t>짙은 좌측 내비게이션은 기능을 업무 영역별로 구분하며 현재 메뉴를 파란 표시선으로 보여줍니다. 권한이 없는 그룹은 제목과 메뉴를 함께 표시하지 않습니다.</w:t>
       </w:r>
@@ -1008,7 +1008,7 @@
       </w:pPr>
       <w:r>
         <w:rPr>
-          <w:rFonts w:ascii="Apple SD Gothic Neo" w:hAnsi="Apple SD Gothic Neo" w:eastAsia="Apple SD Gothic Neo" w:cs="Apple SD Gothic Neo"/>
+          <w:rFonts w:ascii="AppleGothic" w:hAnsi="AppleGothic" w:eastAsia="AppleGothic" w:cs="AppleGothic"/>
         </w:rPr>
         <w:t>상단 검색과 운영 알림은 어느 메뉴에서도 사용할 수 있으며, 알림을 열면 관련 화면으로 이동할 수 있습니다.</w:t>
       </w:r>
@@ -1019,7 +1019,7 @@
       </w:pPr>
       <w:r>
         <w:rPr>
-          <w:rFonts w:ascii="Apple SD Gothic Neo" w:hAnsi="Apple SD Gothic Neo" w:eastAsia="Apple SD Gothic Neo" w:cs="Apple SD Gothic Neo"/>
+          <w:rFonts w:ascii="AppleGothic" w:hAnsi="AppleGothic" w:eastAsia="AppleGothic" w:cs="AppleGothic"/>
         </w:rPr>
         <w:t>좁은 화면에서는 메뉴 버튼으로 내비게이션을 열고, 배경을 선택하거나 메뉴를 고르면 자동으로 닫힙니다.</w:t>
       </w:r>
@@ -1068,7 +1068,7 @@
             </w:pPr>
             <w:r>
               <w:rPr>
-                <w:rFonts w:ascii="Apple SD Gothic Neo" w:hAnsi="Apple SD Gothic Neo" w:eastAsia="Apple SD Gothic Neo" w:cs="Apple SD Gothic Neo"/>
+                <w:rFonts w:ascii="AppleGothic" w:hAnsi="AppleGothic" w:eastAsia="AppleGothic" w:cs="AppleGothic"/>
                 <w:b/>
                 <w:color w:val="FFFFFF"/>
                 <w:sz w:val="17"/>
@@ -1104,7 +1104,7 @@
             </w:pPr>
             <w:r>
               <w:rPr>
-                <w:rFonts w:ascii="Apple SD Gothic Neo" w:hAnsi="Apple SD Gothic Neo" w:eastAsia="Apple SD Gothic Neo" w:cs="Apple SD Gothic Neo"/>
+                <w:rFonts w:ascii="AppleGothic" w:hAnsi="AppleGothic" w:eastAsia="AppleGothic" w:cs="AppleGothic"/>
                 <w:b/>
                 <w:color w:val="FFFFFF"/>
                 <w:sz w:val="17"/>
@@ -1140,7 +1140,7 @@
             </w:pPr>
             <w:r>
               <w:rPr>
-                <w:rFonts w:ascii="Apple SD Gothic Neo" w:hAnsi="Apple SD Gothic Neo" w:eastAsia="Apple SD Gothic Neo" w:cs="Apple SD Gothic Neo"/>
+                <w:rFonts w:ascii="AppleGothic" w:hAnsi="AppleGothic" w:eastAsia="AppleGothic" w:cs="AppleGothic"/>
                 <w:b/>
                 <w:color w:val="FFFFFF"/>
                 <w:sz w:val="17"/>
@@ -1181,7 +1181,7 @@
             </w:pPr>
             <w:r>
               <w:rPr>
-                <w:rFonts w:ascii="Apple SD Gothic Neo" w:hAnsi="Apple SD Gothic Neo" w:eastAsia="Apple SD Gothic Neo" w:cs="Apple SD Gothic Neo"/>
+                <w:rFonts w:ascii="AppleGothic" w:hAnsi="AppleGothic" w:eastAsia="AppleGothic" w:cs="AppleGothic"/>
                 <w:color w:val="182433"/>
                 <w:sz w:val="16"/>
               </w:rPr>
@@ -1216,7 +1216,7 @@
             </w:pPr>
             <w:r>
               <w:rPr>
-                <w:rFonts w:ascii="Apple SD Gothic Neo" w:hAnsi="Apple SD Gothic Neo" w:eastAsia="Apple SD Gothic Neo" w:cs="Apple SD Gothic Neo"/>
+                <w:rFonts w:ascii="AppleGothic" w:hAnsi="AppleGothic" w:eastAsia="AppleGothic" w:cs="AppleGothic"/>
                 <w:color w:val="182433"/>
                 <w:sz w:val="16"/>
               </w:rPr>
@@ -1251,7 +1251,7 @@
             </w:pPr>
             <w:r>
               <w:rPr>
-                <w:rFonts w:ascii="Apple SD Gothic Neo" w:hAnsi="Apple SD Gothic Neo" w:eastAsia="Apple SD Gothic Neo" w:cs="Apple SD Gothic Neo"/>
+                <w:rFonts w:ascii="AppleGothic" w:hAnsi="AppleGothic" w:eastAsia="AppleGothic" w:cs="AppleGothic"/>
                 <w:color w:val="182433"/>
                 <w:sz w:val="16"/>
               </w:rPr>
@@ -1291,7 +1291,7 @@
             </w:pPr>
             <w:r>
               <w:rPr>
-                <w:rFonts w:ascii="Apple SD Gothic Neo" w:hAnsi="Apple SD Gothic Neo" w:eastAsia="Apple SD Gothic Neo" w:cs="Apple SD Gothic Neo"/>
+                <w:rFonts w:ascii="AppleGothic" w:hAnsi="AppleGothic" w:eastAsia="AppleGothic" w:cs="AppleGothic"/>
                 <w:color w:val="182433"/>
                 <w:sz w:val="16"/>
               </w:rPr>
@@ -1326,7 +1326,7 @@
             </w:pPr>
             <w:r>
               <w:rPr>
-                <w:rFonts w:ascii="Apple SD Gothic Neo" w:hAnsi="Apple SD Gothic Neo" w:eastAsia="Apple SD Gothic Neo" w:cs="Apple SD Gothic Neo"/>
+                <w:rFonts w:ascii="AppleGothic" w:hAnsi="AppleGothic" w:eastAsia="AppleGothic" w:cs="AppleGothic"/>
                 <w:color w:val="182433"/>
                 <w:sz w:val="16"/>
               </w:rPr>
@@ -1361,7 +1361,7 @@
             </w:pPr>
             <w:r>
               <w:rPr>
-                <w:rFonts w:ascii="Apple SD Gothic Neo" w:hAnsi="Apple SD Gothic Neo" w:eastAsia="Apple SD Gothic Neo" w:cs="Apple SD Gothic Neo"/>
+                <w:rFonts w:ascii="AppleGothic" w:hAnsi="AppleGothic" w:eastAsia="AppleGothic" w:cs="AppleGothic"/>
                 <w:color w:val="182433"/>
                 <w:sz w:val="16"/>
               </w:rPr>
@@ -1401,7 +1401,7 @@
             </w:pPr>
             <w:r>
               <w:rPr>
-                <w:rFonts w:ascii="Apple SD Gothic Neo" w:hAnsi="Apple SD Gothic Neo" w:eastAsia="Apple SD Gothic Neo" w:cs="Apple SD Gothic Neo"/>
+                <w:rFonts w:ascii="AppleGothic" w:hAnsi="AppleGothic" w:eastAsia="AppleGothic" w:cs="AppleGothic"/>
                 <w:color w:val="182433"/>
                 <w:sz w:val="16"/>
               </w:rPr>
@@ -1436,7 +1436,7 @@
             </w:pPr>
             <w:r>
               <w:rPr>
-                <w:rFonts w:ascii="Apple SD Gothic Neo" w:hAnsi="Apple SD Gothic Neo" w:eastAsia="Apple SD Gothic Neo" w:cs="Apple SD Gothic Neo"/>
+                <w:rFonts w:ascii="AppleGothic" w:hAnsi="AppleGothic" w:eastAsia="AppleGothic" w:cs="AppleGothic"/>
                 <w:color w:val="182433"/>
                 <w:sz w:val="16"/>
               </w:rPr>
@@ -1471,7 +1471,7 @@
             </w:pPr>
             <w:r>
               <w:rPr>
-                <w:rFonts w:ascii="Apple SD Gothic Neo" w:hAnsi="Apple SD Gothic Neo" w:eastAsia="Apple SD Gothic Neo" w:cs="Apple SD Gothic Neo"/>
+                <w:rFonts w:ascii="AppleGothic" w:hAnsi="AppleGothic" w:eastAsia="AppleGothic" w:cs="AppleGothic"/>
                 <w:color w:val="182433"/>
                 <w:sz w:val="16"/>
               </w:rPr>
@@ -1511,7 +1511,7 @@
             </w:pPr>
             <w:r>
               <w:rPr>
-                <w:rFonts w:ascii="Apple SD Gothic Neo" w:hAnsi="Apple SD Gothic Neo" w:eastAsia="Apple SD Gothic Neo" w:cs="Apple SD Gothic Neo"/>
+                <w:rFonts w:ascii="AppleGothic" w:hAnsi="AppleGothic" w:eastAsia="AppleGothic" w:cs="AppleGothic"/>
                 <w:color w:val="182433"/>
                 <w:sz w:val="16"/>
               </w:rPr>
@@ -1546,7 +1546,7 @@
             </w:pPr>
             <w:r>
               <w:rPr>
-                <w:rFonts w:ascii="Apple SD Gothic Neo" w:hAnsi="Apple SD Gothic Neo" w:eastAsia="Apple SD Gothic Neo" w:cs="Apple SD Gothic Neo"/>
+                <w:rFonts w:ascii="AppleGothic" w:hAnsi="AppleGothic" w:eastAsia="AppleGothic" w:cs="AppleGothic"/>
                 <w:color w:val="182433"/>
                 <w:sz w:val="16"/>
               </w:rPr>
@@ -1581,7 +1581,7 @@
             </w:pPr>
             <w:r>
               <w:rPr>
-                <w:rFonts w:ascii="Apple SD Gothic Neo" w:hAnsi="Apple SD Gothic Neo" w:eastAsia="Apple SD Gothic Neo" w:cs="Apple SD Gothic Neo"/>
+                <w:rFonts w:ascii="AppleGothic" w:hAnsi="AppleGothic" w:eastAsia="AppleGothic" w:cs="AppleGothic"/>
                 <w:color w:val="182433"/>
                 <w:sz w:val="16"/>
               </w:rPr>
@@ -1621,7 +1621,7 @@
             </w:pPr>
             <w:r>
               <w:rPr>
-                <w:rFonts w:ascii="Apple SD Gothic Neo" w:hAnsi="Apple SD Gothic Neo" w:eastAsia="Apple SD Gothic Neo" w:cs="Apple SD Gothic Neo"/>
+                <w:rFonts w:ascii="AppleGothic" w:hAnsi="AppleGothic" w:eastAsia="AppleGothic" w:cs="AppleGothic"/>
                 <w:color w:val="182433"/>
                 <w:sz w:val="16"/>
               </w:rPr>
@@ -1656,7 +1656,7 @@
             </w:pPr>
             <w:r>
               <w:rPr>
-                <w:rFonts w:ascii="Apple SD Gothic Neo" w:hAnsi="Apple SD Gothic Neo" w:eastAsia="Apple SD Gothic Neo" w:cs="Apple SD Gothic Neo"/>
+                <w:rFonts w:ascii="AppleGothic" w:hAnsi="AppleGothic" w:eastAsia="AppleGothic" w:cs="AppleGothic"/>
                 <w:color w:val="182433"/>
                 <w:sz w:val="16"/>
               </w:rPr>
@@ -1691,7 +1691,7 @@
             </w:pPr>
             <w:r>
               <w:rPr>
-                <w:rFonts w:ascii="Apple SD Gothic Neo" w:hAnsi="Apple SD Gothic Neo" w:eastAsia="Apple SD Gothic Neo" w:cs="Apple SD Gothic Neo"/>
+                <w:rFonts w:ascii="AppleGothic" w:hAnsi="AppleGothic" w:eastAsia="AppleGothic" w:cs="AppleGothic"/>
                 <w:color w:val="182433"/>
                 <w:sz w:val="16"/>
               </w:rPr>
@@ -1709,7 +1709,7 @@
       </w:pPr>
       <w:r>
         <w:rPr>
-          <w:rFonts w:ascii="Apple SD Gothic Neo" w:hAnsi="Apple SD Gothic Neo" w:eastAsia="Apple SD Gothic Neo" w:cs="Apple SD Gothic Neo"/>
+          <w:rFonts w:ascii="AppleGothic" w:hAnsi="AppleGothic" w:eastAsia="AppleGothic" w:cs="AppleGothic"/>
           <w:b/>
           <w:color w:val="000000"/>
           <w:sz w:val="40"/>
@@ -1720,7 +1720,7 @@
     <w:p>
       <w:r>
         <w:rPr>
-          <w:rFonts w:ascii="Apple SD Gothic Neo" w:hAnsi="Apple SD Gothic Neo" w:eastAsia="Apple SD Gothic Neo" w:cs="Apple SD Gothic Neo"/>
+          <w:rFonts w:ascii="AppleGothic" w:hAnsi="AppleGothic" w:eastAsia="AppleGothic" w:cs="AppleGothic"/>
         </w:rPr>
         <w:t>운영자는 처음부터 AI 분석을 실행하기보다 우선순위와 실제 Kubernetes 근거를 먼저 확인하는 것이 좋습니다. 분석 결과는 단독 사실이 아니라 Evidence Ledger, 이벤트, 로그, 검증 명령과 함께 판단합니다.</w:t>
       </w:r>
@@ -1732,7 +1732,7 @@
       </w:pPr>
       <w:r>
         <w:rPr>
-          <w:rFonts w:ascii="Apple SD Gothic Neo" w:hAnsi="Apple SD Gothic Neo" w:eastAsia="Apple SD Gothic Neo" w:cs="Apple SD Gothic Neo"/>
+          <w:rFonts w:ascii="AppleGothic" w:hAnsi="AppleGothic" w:eastAsia="AppleGothic" w:cs="AppleGothic"/>
         </w:rPr>
         <w:drawing>
           <wp:inline xmlns:a="http://schemas.openxmlformats.org/drawingml/2006/main" xmlns:pic="http://schemas.openxmlformats.org/drawingml/2006/picture">
@@ -1775,7 +1775,7 @@
       </w:pPr>
       <w:r>
         <w:rPr>
-          <w:rFonts w:ascii="Apple SD Gothic Neo" w:hAnsi="Apple SD Gothic Neo" w:eastAsia="Apple SD Gothic Neo" w:cs="Apple SD Gothic Neo"/>
+          <w:rFonts w:ascii="AppleGothic" w:hAnsi="AppleGothic" w:eastAsia="AppleGothic" w:cs="AppleGothic"/>
           <w:color w:val="5E7084"/>
           <w:sz w:val="17"/>
         </w:rPr>
@@ -1788,7 +1788,7 @@
       </w:pPr>
       <w:r>
         <w:rPr>
-          <w:rFonts w:ascii="Apple SD Gothic Neo" w:hAnsi="Apple SD Gothic Neo" w:eastAsia="Apple SD Gothic Neo" w:cs="Apple SD Gothic Neo"/>
+          <w:rFonts w:ascii="AppleGothic" w:hAnsi="AppleGothic" w:eastAsia="AppleGothic" w:cs="AppleGothic"/>
         </w:rPr>
         <w:t>완료의 기준</w:t>
       </w:r>
@@ -1800,7 +1800,7 @@
       </w:pPr>
       <w:r>
         <w:rPr>
-          <w:rFonts w:ascii="Apple SD Gothic Neo" w:hAnsi="Apple SD Gothic Neo" w:eastAsia="Apple SD Gothic Neo" w:cs="Apple SD Gothic Neo"/>
+          <w:rFonts w:ascii="AppleGothic" w:hAnsi="AppleGothic" w:eastAsia="AppleGothic" w:cs="AppleGothic"/>
           <w:color w:val="182433"/>
           <w:sz w:val="20"/>
         </w:rPr>
@@ -1814,7 +1814,7 @@
       </w:pPr>
       <w:r>
         <w:rPr>
-          <w:rFonts w:ascii="Apple SD Gothic Neo" w:hAnsi="Apple SD Gothic Neo" w:eastAsia="Apple SD Gothic Neo" w:cs="Apple SD Gothic Neo"/>
+          <w:rFonts w:ascii="AppleGothic" w:hAnsi="AppleGothic" w:eastAsia="AppleGothic" w:cs="AppleGothic"/>
           <w:color w:val="182433"/>
           <w:sz w:val="20"/>
         </w:rPr>
@@ -1828,7 +1828,7 @@
       </w:pPr>
       <w:r>
         <w:rPr>
-          <w:rFonts w:ascii="Apple SD Gothic Neo" w:hAnsi="Apple SD Gothic Neo" w:eastAsia="Apple SD Gothic Neo" w:cs="Apple SD Gothic Neo"/>
+          <w:rFonts w:ascii="AppleGothic" w:hAnsi="AppleGothic" w:eastAsia="AppleGothic" w:cs="AppleGothic"/>
           <w:color w:val="182433"/>
           <w:sz w:val="20"/>
         </w:rPr>
@@ -1842,7 +1842,7 @@
       </w:pPr>
       <w:r>
         <w:rPr>
-          <w:rFonts w:ascii="Apple SD Gothic Neo" w:hAnsi="Apple SD Gothic Neo" w:eastAsia="Apple SD Gothic Neo" w:cs="Apple SD Gothic Neo"/>
+          <w:rFonts w:ascii="AppleGothic" w:hAnsi="AppleGothic" w:eastAsia="AppleGothic" w:cs="AppleGothic"/>
           <w:color w:val="182433"/>
           <w:sz w:val="20"/>
         </w:rPr>
@@ -1857,7 +1857,7 @@
       </w:pPr>
       <w:r>
         <w:rPr>
-          <w:rFonts w:ascii="Apple SD Gothic Neo" w:hAnsi="Apple SD Gothic Neo" w:eastAsia="Apple SD Gothic Neo" w:cs="Apple SD Gothic Neo"/>
+          <w:rFonts w:ascii="AppleGothic" w:hAnsi="AppleGothic" w:eastAsia="AppleGothic" w:cs="AppleGothic"/>
           <w:b/>
           <w:color w:val="000000"/>
           <w:sz w:val="40"/>
@@ -1872,7 +1872,7 @@
       </w:pPr>
       <w:r>
         <w:rPr>
-          <w:rFonts w:ascii="Apple SD Gothic Neo" w:hAnsi="Apple SD Gothic Neo" w:eastAsia="Apple SD Gothic Neo" w:cs="Apple SD Gothic Neo"/>
+          <w:rFonts w:ascii="AppleGothic" w:hAnsi="AppleGothic" w:eastAsia="AppleGothic" w:cs="AppleGothic"/>
         </w:rPr>
         <w:drawing>
           <wp:inline xmlns:a="http://schemas.openxmlformats.org/drawingml/2006/main" xmlns:pic="http://schemas.openxmlformats.org/drawingml/2006/picture">
@@ -1915,7 +1915,7 @@
       </w:pPr>
       <w:r>
         <w:rPr>
-          <w:rFonts w:ascii="Apple SD Gothic Neo" w:hAnsi="Apple SD Gothic Neo" w:eastAsia="Apple SD Gothic Neo" w:cs="Apple SD Gothic Neo"/>
+          <w:rFonts w:ascii="AppleGothic" w:hAnsi="AppleGothic" w:eastAsia="AppleGothic" w:cs="AppleGothic"/>
           <w:color w:val="5E7084"/>
           <w:sz w:val="17"/>
         </w:rPr>
@@ -1925,7 +1925,7 @@
     <w:p>
       <w:r>
         <w:rPr>
-          <w:rFonts w:ascii="Apple SD Gothic Neo" w:hAnsi="Apple SD Gothic Neo" w:eastAsia="Apple SD Gothic Neo" w:cs="Apple SD Gothic Neo"/>
+          <w:rFonts w:ascii="AppleGothic" w:hAnsi="AppleGothic" w:eastAsia="AppleGothic" w:cs="AppleGothic"/>
         </w:rPr>
         <w:t>Tenant는 회사나 고객처럼 격리해야 하는 최상위 업무 조직이며, Workspace는 Tenant 내부의 서비스나 운영팀 단위입니다. Cluster와 Namespace는 이 범위 아래에서만 조회됩니다.</w:t>
       </w:r>
@@ -1972,7 +1972,7 @@
             </w:pPr>
             <w:r>
               <w:rPr>
-                <w:rFonts w:ascii="Apple SD Gothic Neo" w:hAnsi="Apple SD Gothic Neo" w:eastAsia="Apple SD Gothic Neo" w:cs="Apple SD Gothic Neo"/>
+                <w:rFonts w:ascii="AppleGothic" w:hAnsi="AppleGothic" w:eastAsia="AppleGothic" w:cs="AppleGothic"/>
                 <w:b/>
                 <w:color w:val="FFFFFF"/>
                 <w:sz w:val="19"/>
@@ -2007,7 +2007,7 @@
             </w:pPr>
             <w:r>
               <w:rPr>
-                <w:rFonts w:ascii="Apple SD Gothic Neo" w:hAnsi="Apple SD Gothic Neo" w:eastAsia="Apple SD Gothic Neo" w:cs="Apple SD Gothic Neo"/>
+                <w:rFonts w:ascii="AppleGothic" w:hAnsi="AppleGothic" w:eastAsia="AppleGothic" w:cs="AppleGothic"/>
                 <w:b/>
                 <w:color w:val="FFFFFF"/>
                 <w:sz w:val="19"/>
@@ -2042,7 +2042,7 @@
             </w:pPr>
             <w:r>
               <w:rPr>
-                <w:rFonts w:ascii="Apple SD Gothic Neo" w:hAnsi="Apple SD Gothic Neo" w:eastAsia="Apple SD Gothic Neo" w:cs="Apple SD Gothic Neo"/>
+                <w:rFonts w:ascii="AppleGothic" w:hAnsi="AppleGothic" w:eastAsia="AppleGothic" w:cs="AppleGothic"/>
                 <w:b/>
                 <w:color w:val="FFFFFF"/>
                 <w:sz w:val="19"/>
@@ -2079,7 +2079,7 @@
             </w:pPr>
             <w:r>
               <w:rPr>
-                <w:rFonts w:ascii="Apple SD Gothic Neo" w:hAnsi="Apple SD Gothic Neo" w:eastAsia="Apple SD Gothic Neo" w:cs="Apple SD Gothic Neo"/>
+                <w:rFonts w:ascii="AppleGothic" w:hAnsi="AppleGothic" w:eastAsia="AppleGothic" w:cs="AppleGothic"/>
                 <w:color w:val="182433"/>
                 <w:sz w:val="18"/>
               </w:rPr>
@@ -2113,7 +2113,7 @@
             </w:pPr>
             <w:r>
               <w:rPr>
-                <w:rFonts w:ascii="Apple SD Gothic Neo" w:hAnsi="Apple SD Gothic Neo" w:eastAsia="Apple SD Gothic Neo" w:cs="Apple SD Gothic Neo"/>
+                <w:rFonts w:ascii="AppleGothic" w:hAnsi="AppleGothic" w:eastAsia="AppleGothic" w:cs="AppleGothic"/>
                 <w:color w:val="182433"/>
                 <w:sz w:val="18"/>
               </w:rPr>
@@ -2147,7 +2147,7 @@
             </w:pPr>
             <w:r>
               <w:rPr>
-                <w:rFonts w:ascii="Apple SD Gothic Neo" w:hAnsi="Apple SD Gothic Neo" w:eastAsia="Apple SD Gothic Neo" w:cs="Apple SD Gothic Neo"/>
+                <w:rFonts w:ascii="AppleGothic" w:hAnsi="AppleGothic" w:eastAsia="AppleGothic" w:cs="AppleGothic"/>
                 <w:color w:val="182433"/>
                 <w:sz w:val="18"/>
               </w:rPr>
@@ -2183,7 +2183,7 @@
             </w:pPr>
             <w:r>
               <w:rPr>
-                <w:rFonts w:ascii="Apple SD Gothic Neo" w:hAnsi="Apple SD Gothic Neo" w:eastAsia="Apple SD Gothic Neo" w:cs="Apple SD Gothic Neo"/>
+                <w:rFonts w:ascii="AppleGothic" w:hAnsi="AppleGothic" w:eastAsia="AppleGothic" w:cs="AppleGothic"/>
                 <w:color w:val="182433"/>
                 <w:sz w:val="18"/>
               </w:rPr>
@@ -2217,7 +2217,7 @@
             </w:pPr>
             <w:r>
               <w:rPr>
-                <w:rFonts w:ascii="Apple SD Gothic Neo" w:hAnsi="Apple SD Gothic Neo" w:eastAsia="Apple SD Gothic Neo" w:cs="Apple SD Gothic Neo"/>
+                <w:rFonts w:ascii="AppleGothic" w:hAnsi="AppleGothic" w:eastAsia="AppleGothic" w:cs="AppleGothic"/>
                 <w:color w:val="182433"/>
                 <w:sz w:val="18"/>
               </w:rPr>
@@ -2251,7 +2251,7 @@
             </w:pPr>
             <w:r>
               <w:rPr>
-                <w:rFonts w:ascii="Apple SD Gothic Neo" w:hAnsi="Apple SD Gothic Neo" w:eastAsia="Apple SD Gothic Neo" w:cs="Apple SD Gothic Neo"/>
+                <w:rFonts w:ascii="AppleGothic" w:hAnsi="AppleGothic" w:eastAsia="AppleGothic" w:cs="AppleGothic"/>
                 <w:color w:val="182433"/>
                 <w:sz w:val="18"/>
               </w:rPr>
@@ -2287,7 +2287,7 @@
             </w:pPr>
             <w:r>
               <w:rPr>
-                <w:rFonts w:ascii="Apple SD Gothic Neo" w:hAnsi="Apple SD Gothic Neo" w:eastAsia="Apple SD Gothic Neo" w:cs="Apple SD Gothic Neo"/>
+                <w:rFonts w:ascii="AppleGothic" w:hAnsi="AppleGothic" w:eastAsia="AppleGothic" w:cs="AppleGothic"/>
                 <w:color w:val="182433"/>
                 <w:sz w:val="18"/>
               </w:rPr>
@@ -2321,7 +2321,7 @@
             </w:pPr>
             <w:r>
               <w:rPr>
-                <w:rFonts w:ascii="Apple SD Gothic Neo" w:hAnsi="Apple SD Gothic Neo" w:eastAsia="Apple SD Gothic Neo" w:cs="Apple SD Gothic Neo"/>
+                <w:rFonts w:ascii="AppleGothic" w:hAnsi="AppleGothic" w:eastAsia="AppleGothic" w:cs="AppleGothic"/>
                 <w:color w:val="182433"/>
                 <w:sz w:val="18"/>
               </w:rPr>
@@ -2355,7 +2355,7 @@
             </w:pPr>
             <w:r>
               <w:rPr>
-                <w:rFonts w:ascii="Apple SD Gothic Neo" w:hAnsi="Apple SD Gothic Neo" w:eastAsia="Apple SD Gothic Neo" w:cs="Apple SD Gothic Neo"/>
+                <w:rFonts w:ascii="AppleGothic" w:hAnsi="AppleGothic" w:eastAsia="AppleGothic" w:cs="AppleGothic"/>
                 <w:color w:val="182433"/>
                 <w:sz w:val="18"/>
               </w:rPr>
@@ -2391,7 +2391,7 @@
             </w:pPr>
             <w:r>
               <w:rPr>
-                <w:rFonts w:ascii="Apple SD Gothic Neo" w:hAnsi="Apple SD Gothic Neo" w:eastAsia="Apple SD Gothic Neo" w:cs="Apple SD Gothic Neo"/>
+                <w:rFonts w:ascii="AppleGothic" w:hAnsi="AppleGothic" w:eastAsia="AppleGothic" w:cs="AppleGothic"/>
                 <w:color w:val="182433"/>
                 <w:sz w:val="18"/>
               </w:rPr>
@@ -2425,7 +2425,7 @@
             </w:pPr>
             <w:r>
               <w:rPr>
-                <w:rFonts w:ascii="Apple SD Gothic Neo" w:hAnsi="Apple SD Gothic Neo" w:eastAsia="Apple SD Gothic Neo" w:cs="Apple SD Gothic Neo"/>
+                <w:rFonts w:ascii="AppleGothic" w:hAnsi="AppleGothic" w:eastAsia="AppleGothic" w:cs="AppleGothic"/>
                 <w:color w:val="182433"/>
                 <w:sz w:val="18"/>
               </w:rPr>
@@ -2459,7 +2459,7 @@
             </w:pPr>
             <w:r>
               <w:rPr>
-                <w:rFonts w:ascii="Apple SD Gothic Neo" w:hAnsi="Apple SD Gothic Neo" w:eastAsia="Apple SD Gothic Neo" w:cs="Apple SD Gothic Neo"/>
+                <w:rFonts w:ascii="AppleGothic" w:hAnsi="AppleGothic" w:eastAsia="AppleGothic" w:cs="AppleGothic"/>
                 <w:color w:val="182433"/>
                 <w:sz w:val="18"/>
               </w:rPr>
@@ -2495,7 +2495,7 @@
             </w:pPr>
             <w:r>
               <w:rPr>
-                <w:rFonts w:ascii="Apple SD Gothic Neo" w:hAnsi="Apple SD Gothic Neo" w:eastAsia="Apple SD Gothic Neo" w:cs="Apple SD Gothic Neo"/>
+                <w:rFonts w:ascii="AppleGothic" w:hAnsi="AppleGothic" w:eastAsia="AppleGothic" w:cs="AppleGothic"/>
                 <w:color w:val="182433"/>
                 <w:sz w:val="18"/>
               </w:rPr>
@@ -2529,7 +2529,7 @@
             </w:pPr>
             <w:r>
               <w:rPr>
-                <w:rFonts w:ascii="Apple SD Gothic Neo" w:hAnsi="Apple SD Gothic Neo" w:eastAsia="Apple SD Gothic Neo" w:cs="Apple SD Gothic Neo"/>
+                <w:rFonts w:ascii="AppleGothic" w:hAnsi="AppleGothic" w:eastAsia="AppleGothic" w:cs="AppleGothic"/>
                 <w:color w:val="182433"/>
                 <w:sz w:val="18"/>
               </w:rPr>
@@ -2563,7 +2563,7 @@
             </w:pPr>
             <w:r>
               <w:rPr>
-                <w:rFonts w:ascii="Apple SD Gothic Neo" w:hAnsi="Apple SD Gothic Neo" w:eastAsia="Apple SD Gothic Neo" w:cs="Apple SD Gothic Neo"/>
+                <w:rFonts w:ascii="AppleGothic" w:hAnsi="AppleGothic" w:eastAsia="AppleGothic" w:cs="AppleGothic"/>
                 <w:color w:val="182433"/>
                 <w:sz w:val="18"/>
               </w:rPr>
@@ -2581,7 +2581,7 @@
       </w:pPr>
       <w:r>
         <w:rPr>
-          <w:rFonts w:ascii="Apple SD Gothic Neo" w:hAnsi="Apple SD Gothic Neo" w:eastAsia="Apple SD Gothic Neo" w:cs="Apple SD Gothic Neo"/>
+          <w:rFonts w:ascii="AppleGothic" w:hAnsi="AppleGothic" w:eastAsia="AppleGothic" w:cs="AppleGothic"/>
           <w:b/>
           <w:color w:val="000000"/>
           <w:sz w:val="40"/>
@@ -2597,7 +2597,7 @@
       </w:pPr>
       <w:r>
         <w:rPr>
-          <w:rFonts w:ascii="Apple SD Gothic Neo" w:hAnsi="Apple SD Gothic Neo" w:eastAsia="Apple SD Gothic Neo" w:cs="Apple SD Gothic Neo"/>
+          <w:rFonts w:ascii="AppleGothic" w:hAnsi="AppleGothic" w:eastAsia="AppleGothic" w:cs="AppleGothic"/>
           <w:b/>
           <w:color w:val="000000"/>
           <w:sz w:val="30"/>
@@ -2611,7 +2611,7 @@
       </w:pPr>
       <w:r>
         <w:rPr>
-          <w:rFonts w:ascii="Apple SD Gothic Neo" w:hAnsi="Apple SD Gothic Neo" w:eastAsia="Apple SD Gothic Neo" w:cs="Apple SD Gothic Neo"/>
+          <w:rFonts w:ascii="AppleGothic" w:hAnsi="AppleGothic" w:eastAsia="AppleGothic" w:cs="AppleGothic"/>
           <w:b/>
           <w:color w:val="246BCE"/>
           <w:sz w:val="21"/>
@@ -2620,7 +2620,7 @@
       </w:r>
       <w:r>
         <w:rPr>
-          <w:rFonts w:ascii="Apple SD Gothic Neo" w:hAnsi="Apple SD Gothic Neo" w:eastAsia="Apple SD Gothic Neo" w:cs="Apple SD Gothic Neo"/>
+          <w:rFonts w:ascii="AppleGothic" w:hAnsi="AppleGothic" w:eastAsia="AppleGothic" w:cs="AppleGothic"/>
           <w:color w:val="182433"/>
           <w:sz w:val="21"/>
         </w:rPr>
@@ -2633,7 +2633,7 @@
       </w:pPr>
       <w:r>
         <w:rPr>
-          <w:rFonts w:ascii="Apple SD Gothic Neo" w:hAnsi="Apple SD Gothic Neo" w:eastAsia="Apple SD Gothic Neo" w:cs="Apple SD Gothic Neo"/>
+          <w:rFonts w:ascii="AppleGothic" w:hAnsi="AppleGothic" w:eastAsia="AppleGothic" w:cs="AppleGothic"/>
           <w:b/>
           <w:color w:val="14866D"/>
           <w:sz w:val="21"/>
@@ -2642,7 +2642,7 @@
       </w:r>
       <w:r>
         <w:rPr>
-          <w:rFonts w:ascii="Apple SD Gothic Neo" w:hAnsi="Apple SD Gothic Neo" w:eastAsia="Apple SD Gothic Neo" w:cs="Apple SD Gothic Neo"/>
+          <w:rFonts w:ascii="AppleGothic" w:hAnsi="AppleGothic" w:eastAsia="AppleGothic" w:cs="AppleGothic"/>
           <w:color w:val="182433"/>
           <w:sz w:val="21"/>
         </w:rPr>
@@ -2656,7 +2656,7 @@
       </w:pPr>
       <w:r>
         <w:rPr>
-          <w:rFonts w:ascii="Apple SD Gothic Neo" w:hAnsi="Apple SD Gothic Neo" w:eastAsia="Apple SD Gothic Neo" w:cs="Apple SD Gothic Neo"/>
+          <w:rFonts w:ascii="AppleGothic" w:hAnsi="AppleGothic" w:eastAsia="AppleGothic" w:cs="AppleGothic"/>
           <w:color w:val="182433"/>
           <w:sz w:val="20"/>
         </w:rPr>
@@ -2670,7 +2670,7 @@
       </w:pPr>
       <w:r>
         <w:rPr>
-          <w:rFonts w:ascii="Apple SD Gothic Neo" w:hAnsi="Apple SD Gothic Neo" w:eastAsia="Apple SD Gothic Neo" w:cs="Apple SD Gothic Neo"/>
+          <w:rFonts w:ascii="AppleGothic" w:hAnsi="AppleGothic" w:eastAsia="AppleGothic" w:cs="AppleGothic"/>
           <w:color w:val="182433"/>
           <w:sz w:val="20"/>
         </w:rPr>
@@ -2684,7 +2684,7 @@
       </w:pPr>
       <w:r>
         <w:rPr>
-          <w:rFonts w:ascii="Apple SD Gothic Neo" w:hAnsi="Apple SD Gothic Neo" w:eastAsia="Apple SD Gothic Neo" w:cs="Apple SD Gothic Neo"/>
+          <w:rFonts w:ascii="AppleGothic" w:hAnsi="AppleGothic" w:eastAsia="AppleGothic" w:cs="AppleGothic"/>
           <w:color w:val="182433"/>
           <w:sz w:val="20"/>
         </w:rPr>
@@ -2698,7 +2698,7 @@
       </w:pPr>
       <w:r>
         <w:rPr>
-          <w:rFonts w:ascii="Apple SD Gothic Neo" w:hAnsi="Apple SD Gothic Neo" w:eastAsia="Apple SD Gothic Neo" w:cs="Apple SD Gothic Neo"/>
+          <w:rFonts w:ascii="AppleGothic" w:hAnsi="AppleGothic" w:eastAsia="AppleGothic" w:cs="AppleGothic"/>
           <w:b/>
           <w:color w:val="A56A00"/>
           <w:sz w:val="19"/>
@@ -2707,7 +2707,7 @@
       </w:r>
       <w:r>
         <w:rPr>
-          <w:rFonts w:ascii="Apple SD Gothic Neo" w:hAnsi="Apple SD Gothic Neo" w:eastAsia="Apple SD Gothic Neo" w:cs="Apple SD Gothic Neo"/>
+          <w:rFonts w:ascii="AppleGothic" w:hAnsi="AppleGothic" w:eastAsia="AppleGothic" w:cs="AppleGothic"/>
           <w:color w:val="5E7084"/>
           <w:sz w:val="19"/>
         </w:rPr>
@@ -2721,7 +2721,7 @@
       </w:pPr>
       <w:r>
         <w:rPr>
-          <w:rFonts w:ascii="Apple SD Gothic Neo" w:hAnsi="Apple SD Gothic Neo" w:eastAsia="Apple SD Gothic Neo" w:cs="Apple SD Gothic Neo"/>
+          <w:rFonts w:ascii="AppleGothic" w:hAnsi="AppleGothic" w:eastAsia="AppleGothic" w:cs="AppleGothic"/>
           <w:b/>
           <w:color w:val="B42318"/>
           <w:sz w:val="19"/>
@@ -2730,7 +2730,7 @@
       </w:r>
       <w:r>
         <w:rPr>
-          <w:rFonts w:ascii="Apple SD Gothic Neo" w:hAnsi="Apple SD Gothic Neo" w:eastAsia="Apple SD Gothic Neo" w:cs="Apple SD Gothic Neo"/>
+          <w:rFonts w:ascii="AppleGothic" w:hAnsi="AppleGothic" w:eastAsia="AppleGothic" w:cs="AppleGothic"/>
           <w:color w:val="5E7084"/>
           <w:sz w:val="19"/>
         </w:rPr>
@@ -2745,7 +2745,7 @@
       </w:pPr>
       <w:r>
         <w:rPr>
-          <w:rFonts w:ascii="Apple SD Gothic Neo" w:hAnsi="Apple SD Gothic Neo" w:eastAsia="Apple SD Gothic Neo" w:cs="Apple SD Gothic Neo"/>
+          <w:rFonts w:ascii="AppleGothic" w:hAnsi="AppleGothic" w:eastAsia="AppleGothic" w:cs="AppleGothic"/>
           <w:b/>
           <w:color w:val="000000"/>
           <w:sz w:val="30"/>
@@ -2759,7 +2759,7 @@
       </w:pPr>
       <w:r>
         <w:rPr>
-          <w:rFonts w:ascii="Apple SD Gothic Neo" w:hAnsi="Apple SD Gothic Neo" w:eastAsia="Apple SD Gothic Neo" w:cs="Apple SD Gothic Neo"/>
+          <w:rFonts w:ascii="AppleGothic" w:hAnsi="AppleGothic" w:eastAsia="AppleGothic" w:cs="AppleGothic"/>
           <w:b/>
           <w:color w:val="246BCE"/>
           <w:sz w:val="21"/>
@@ -2768,7 +2768,7 @@
       </w:r>
       <w:r>
         <w:rPr>
-          <w:rFonts w:ascii="Apple SD Gothic Neo" w:hAnsi="Apple SD Gothic Neo" w:eastAsia="Apple SD Gothic Neo" w:cs="Apple SD Gothic Neo"/>
+          <w:rFonts w:ascii="AppleGothic" w:hAnsi="AppleGothic" w:eastAsia="AppleGothic" w:cs="AppleGothic"/>
           <w:color w:val="182433"/>
           <w:sz w:val="21"/>
         </w:rPr>
@@ -2781,7 +2781,7 @@
       </w:pPr>
       <w:r>
         <w:rPr>
-          <w:rFonts w:ascii="Apple SD Gothic Neo" w:hAnsi="Apple SD Gothic Neo" w:eastAsia="Apple SD Gothic Neo" w:cs="Apple SD Gothic Neo"/>
+          <w:rFonts w:ascii="AppleGothic" w:hAnsi="AppleGothic" w:eastAsia="AppleGothic" w:cs="AppleGothic"/>
           <w:b/>
           <w:color w:val="14866D"/>
           <w:sz w:val="21"/>
@@ -2790,7 +2790,7 @@
       </w:r>
       <w:r>
         <w:rPr>
-          <w:rFonts w:ascii="Apple SD Gothic Neo" w:hAnsi="Apple SD Gothic Neo" w:eastAsia="Apple SD Gothic Neo" w:cs="Apple SD Gothic Neo"/>
+          <w:rFonts w:ascii="AppleGothic" w:hAnsi="AppleGothic" w:eastAsia="AppleGothic" w:cs="AppleGothic"/>
           <w:color w:val="182433"/>
           <w:sz w:val="21"/>
         </w:rPr>
@@ -2804,7 +2804,7 @@
       </w:pPr>
       <w:r>
         <w:rPr>
-          <w:rFonts w:ascii="Apple SD Gothic Neo" w:hAnsi="Apple SD Gothic Neo" w:eastAsia="Apple SD Gothic Neo" w:cs="Apple SD Gothic Neo"/>
+          <w:rFonts w:ascii="AppleGothic" w:hAnsi="AppleGothic" w:eastAsia="AppleGothic" w:cs="AppleGothic"/>
           <w:color w:val="182433"/>
           <w:sz w:val="20"/>
         </w:rPr>
@@ -2818,7 +2818,7 @@
       </w:pPr>
       <w:r>
         <w:rPr>
-          <w:rFonts w:ascii="Apple SD Gothic Neo" w:hAnsi="Apple SD Gothic Neo" w:eastAsia="Apple SD Gothic Neo" w:cs="Apple SD Gothic Neo"/>
+          <w:rFonts w:ascii="AppleGothic" w:hAnsi="AppleGothic" w:eastAsia="AppleGothic" w:cs="AppleGothic"/>
           <w:color w:val="182433"/>
           <w:sz w:val="20"/>
         </w:rPr>
@@ -2832,7 +2832,7 @@
       </w:pPr>
       <w:r>
         <w:rPr>
-          <w:rFonts w:ascii="Apple SD Gothic Neo" w:hAnsi="Apple SD Gothic Neo" w:eastAsia="Apple SD Gothic Neo" w:cs="Apple SD Gothic Neo"/>
+          <w:rFonts w:ascii="AppleGothic" w:hAnsi="AppleGothic" w:eastAsia="AppleGothic" w:cs="AppleGothic"/>
           <w:color w:val="182433"/>
           <w:sz w:val="20"/>
         </w:rPr>
@@ -2846,7 +2846,7 @@
       </w:pPr>
       <w:r>
         <w:rPr>
-          <w:rFonts w:ascii="Apple SD Gothic Neo" w:hAnsi="Apple SD Gothic Neo" w:eastAsia="Apple SD Gothic Neo" w:cs="Apple SD Gothic Neo"/>
+          <w:rFonts w:ascii="AppleGothic" w:hAnsi="AppleGothic" w:eastAsia="AppleGothic" w:cs="AppleGothic"/>
           <w:b/>
           <w:color w:val="A56A00"/>
           <w:sz w:val="19"/>
@@ -2855,7 +2855,7 @@
       </w:r>
       <w:r>
         <w:rPr>
-          <w:rFonts w:ascii="Apple SD Gothic Neo" w:hAnsi="Apple SD Gothic Neo" w:eastAsia="Apple SD Gothic Neo" w:cs="Apple SD Gothic Neo"/>
+          <w:rFonts w:ascii="AppleGothic" w:hAnsi="AppleGothic" w:eastAsia="AppleGothic" w:cs="AppleGothic"/>
           <w:color w:val="5E7084"/>
           <w:sz w:val="19"/>
         </w:rPr>
@@ -2870,7 +2870,7 @@
       </w:pPr>
       <w:r>
         <w:rPr>
-          <w:rFonts w:ascii="Apple SD Gothic Neo" w:hAnsi="Apple SD Gothic Neo" w:eastAsia="Apple SD Gothic Neo" w:cs="Apple SD Gothic Neo"/>
+          <w:rFonts w:ascii="AppleGothic" w:hAnsi="AppleGothic" w:eastAsia="AppleGothic" w:cs="AppleGothic"/>
           <w:b/>
           <w:color w:val="000000"/>
           <w:sz w:val="40"/>
@@ -2886,7 +2886,7 @@
       </w:pPr>
       <w:r>
         <w:rPr>
-          <w:rFonts w:ascii="Apple SD Gothic Neo" w:hAnsi="Apple SD Gothic Neo" w:eastAsia="Apple SD Gothic Neo" w:cs="Apple SD Gothic Neo"/>
+          <w:rFonts w:ascii="AppleGothic" w:hAnsi="AppleGothic" w:eastAsia="AppleGothic" w:cs="AppleGothic"/>
           <w:b/>
           <w:color w:val="000000"/>
           <w:sz w:val="30"/>
@@ -2900,7 +2900,7 @@
       </w:pPr>
       <w:r>
         <w:rPr>
-          <w:rFonts w:ascii="Apple SD Gothic Neo" w:hAnsi="Apple SD Gothic Neo" w:eastAsia="Apple SD Gothic Neo" w:cs="Apple SD Gothic Neo"/>
+          <w:rFonts w:ascii="AppleGothic" w:hAnsi="AppleGothic" w:eastAsia="AppleGothic" w:cs="AppleGothic"/>
           <w:b/>
           <w:color w:val="246BCE"/>
           <w:sz w:val="21"/>
@@ -2909,7 +2909,7 @@
       </w:r>
       <w:r>
         <w:rPr>
-          <w:rFonts w:ascii="Apple SD Gothic Neo" w:hAnsi="Apple SD Gothic Neo" w:eastAsia="Apple SD Gothic Neo" w:cs="Apple SD Gothic Neo"/>
+          <w:rFonts w:ascii="AppleGothic" w:hAnsi="AppleGothic" w:eastAsia="AppleGothic" w:cs="AppleGothic"/>
           <w:color w:val="182433"/>
           <w:sz w:val="21"/>
         </w:rPr>
@@ -2922,7 +2922,7 @@
       </w:pPr>
       <w:r>
         <w:rPr>
-          <w:rFonts w:ascii="Apple SD Gothic Neo" w:hAnsi="Apple SD Gothic Neo" w:eastAsia="Apple SD Gothic Neo" w:cs="Apple SD Gothic Neo"/>
+          <w:rFonts w:ascii="AppleGothic" w:hAnsi="AppleGothic" w:eastAsia="AppleGothic" w:cs="AppleGothic"/>
           <w:b/>
           <w:color w:val="14866D"/>
           <w:sz w:val="21"/>
@@ -2931,7 +2931,7 @@
       </w:r>
       <w:r>
         <w:rPr>
-          <w:rFonts w:ascii="Apple SD Gothic Neo" w:hAnsi="Apple SD Gothic Neo" w:eastAsia="Apple SD Gothic Neo" w:cs="Apple SD Gothic Neo"/>
+          <w:rFonts w:ascii="AppleGothic" w:hAnsi="AppleGothic" w:eastAsia="AppleGothic" w:cs="AppleGothic"/>
           <w:color w:val="182433"/>
           <w:sz w:val="21"/>
         </w:rPr>
@@ -2945,7 +2945,7 @@
       </w:pPr>
       <w:r>
         <w:rPr>
-          <w:rFonts w:ascii="Apple SD Gothic Neo" w:hAnsi="Apple SD Gothic Neo" w:eastAsia="Apple SD Gothic Neo" w:cs="Apple SD Gothic Neo"/>
+          <w:rFonts w:ascii="AppleGothic" w:hAnsi="AppleGothic" w:eastAsia="AppleGothic" w:cs="AppleGothic"/>
           <w:color w:val="182433"/>
           <w:sz w:val="20"/>
         </w:rPr>
@@ -2959,7 +2959,7 @@
       </w:pPr>
       <w:r>
         <w:rPr>
-          <w:rFonts w:ascii="Apple SD Gothic Neo" w:hAnsi="Apple SD Gothic Neo" w:eastAsia="Apple SD Gothic Neo" w:cs="Apple SD Gothic Neo"/>
+          <w:rFonts w:ascii="AppleGothic" w:hAnsi="AppleGothic" w:eastAsia="AppleGothic" w:cs="AppleGothic"/>
           <w:color w:val="182433"/>
           <w:sz w:val="20"/>
         </w:rPr>
@@ -2973,7 +2973,7 @@
       </w:pPr>
       <w:r>
         <w:rPr>
-          <w:rFonts w:ascii="Apple SD Gothic Neo" w:hAnsi="Apple SD Gothic Neo" w:eastAsia="Apple SD Gothic Neo" w:cs="Apple SD Gothic Neo"/>
+          <w:rFonts w:ascii="AppleGothic" w:hAnsi="AppleGothic" w:eastAsia="AppleGothic" w:cs="AppleGothic"/>
           <w:color w:val="182433"/>
           <w:sz w:val="20"/>
         </w:rPr>
@@ -2987,7 +2987,7 @@
       </w:pPr>
       <w:r>
         <w:rPr>
-          <w:rFonts w:ascii="Apple SD Gothic Neo" w:hAnsi="Apple SD Gothic Neo" w:eastAsia="Apple SD Gothic Neo" w:cs="Apple SD Gothic Neo"/>
+          <w:rFonts w:ascii="AppleGothic" w:hAnsi="AppleGothic" w:eastAsia="AppleGothic" w:cs="AppleGothic"/>
           <w:b/>
           <w:color w:val="A56A00"/>
           <w:sz w:val="19"/>
@@ -2996,7 +2996,7 @@
       </w:r>
       <w:r>
         <w:rPr>
-          <w:rFonts w:ascii="Apple SD Gothic Neo" w:hAnsi="Apple SD Gothic Neo" w:eastAsia="Apple SD Gothic Neo" w:cs="Apple SD Gothic Neo"/>
+          <w:rFonts w:ascii="AppleGothic" w:hAnsi="AppleGothic" w:eastAsia="AppleGothic" w:cs="AppleGothic"/>
           <w:color w:val="5E7084"/>
           <w:sz w:val="19"/>
         </w:rPr>
@@ -3011,7 +3011,7 @@
       </w:pPr>
       <w:r>
         <w:rPr>
-          <w:rFonts w:ascii="Apple SD Gothic Neo" w:hAnsi="Apple SD Gothic Neo" w:eastAsia="Apple SD Gothic Neo" w:cs="Apple SD Gothic Neo"/>
+          <w:rFonts w:ascii="AppleGothic" w:hAnsi="AppleGothic" w:eastAsia="AppleGothic" w:cs="AppleGothic"/>
           <w:b/>
           <w:color w:val="000000"/>
           <w:sz w:val="30"/>
@@ -3025,7 +3025,7 @@
       </w:pPr>
       <w:r>
         <w:rPr>
-          <w:rFonts w:ascii="Apple SD Gothic Neo" w:hAnsi="Apple SD Gothic Neo" w:eastAsia="Apple SD Gothic Neo" w:cs="Apple SD Gothic Neo"/>
+          <w:rFonts w:ascii="AppleGothic" w:hAnsi="AppleGothic" w:eastAsia="AppleGothic" w:cs="AppleGothic"/>
           <w:b/>
           <w:color w:val="246BCE"/>
           <w:sz w:val="21"/>
@@ -3034,7 +3034,7 @@
       </w:r>
       <w:r>
         <w:rPr>
-          <w:rFonts w:ascii="Apple SD Gothic Neo" w:hAnsi="Apple SD Gothic Neo" w:eastAsia="Apple SD Gothic Neo" w:cs="Apple SD Gothic Neo"/>
+          <w:rFonts w:ascii="AppleGothic" w:hAnsi="AppleGothic" w:eastAsia="AppleGothic" w:cs="AppleGothic"/>
           <w:color w:val="182433"/>
           <w:sz w:val="21"/>
         </w:rPr>
@@ -3047,7 +3047,7 @@
       </w:pPr>
       <w:r>
         <w:rPr>
-          <w:rFonts w:ascii="Apple SD Gothic Neo" w:hAnsi="Apple SD Gothic Neo" w:eastAsia="Apple SD Gothic Neo" w:cs="Apple SD Gothic Neo"/>
+          <w:rFonts w:ascii="AppleGothic" w:hAnsi="AppleGothic" w:eastAsia="AppleGothic" w:cs="AppleGothic"/>
           <w:b/>
           <w:color w:val="14866D"/>
           <w:sz w:val="21"/>
@@ -3056,7 +3056,7 @@
       </w:r>
       <w:r>
         <w:rPr>
-          <w:rFonts w:ascii="Apple SD Gothic Neo" w:hAnsi="Apple SD Gothic Neo" w:eastAsia="Apple SD Gothic Neo" w:cs="Apple SD Gothic Neo"/>
+          <w:rFonts w:ascii="AppleGothic" w:hAnsi="AppleGothic" w:eastAsia="AppleGothic" w:cs="AppleGothic"/>
           <w:color w:val="182433"/>
           <w:sz w:val="21"/>
         </w:rPr>
@@ -3070,7 +3070,7 @@
       </w:pPr>
       <w:r>
         <w:rPr>
-          <w:rFonts w:ascii="Apple SD Gothic Neo" w:hAnsi="Apple SD Gothic Neo" w:eastAsia="Apple SD Gothic Neo" w:cs="Apple SD Gothic Neo"/>
+          <w:rFonts w:ascii="AppleGothic" w:hAnsi="AppleGothic" w:eastAsia="AppleGothic" w:cs="AppleGothic"/>
           <w:color w:val="182433"/>
           <w:sz w:val="20"/>
         </w:rPr>
@@ -3084,7 +3084,7 @@
       </w:pPr>
       <w:r>
         <w:rPr>
-          <w:rFonts w:ascii="Apple SD Gothic Neo" w:hAnsi="Apple SD Gothic Neo" w:eastAsia="Apple SD Gothic Neo" w:cs="Apple SD Gothic Neo"/>
+          <w:rFonts w:ascii="AppleGothic" w:hAnsi="AppleGothic" w:eastAsia="AppleGothic" w:cs="AppleGothic"/>
           <w:color w:val="182433"/>
           <w:sz w:val="20"/>
         </w:rPr>
@@ -3098,7 +3098,7 @@
       </w:pPr>
       <w:r>
         <w:rPr>
-          <w:rFonts w:ascii="Apple SD Gothic Neo" w:hAnsi="Apple SD Gothic Neo" w:eastAsia="Apple SD Gothic Neo" w:cs="Apple SD Gothic Neo"/>
+          <w:rFonts w:ascii="AppleGothic" w:hAnsi="AppleGothic" w:eastAsia="AppleGothic" w:cs="AppleGothic"/>
           <w:color w:val="182433"/>
           <w:sz w:val="20"/>
         </w:rPr>
@@ -3112,7 +3112,7 @@
       </w:pPr>
       <w:r>
         <w:rPr>
-          <w:rFonts w:ascii="Apple SD Gothic Neo" w:hAnsi="Apple SD Gothic Neo" w:eastAsia="Apple SD Gothic Neo" w:cs="Apple SD Gothic Neo"/>
+          <w:rFonts w:ascii="AppleGothic" w:hAnsi="AppleGothic" w:eastAsia="AppleGothic" w:cs="AppleGothic"/>
           <w:b/>
           <w:color w:val="A56A00"/>
           <w:sz w:val="19"/>
@@ -3121,7 +3121,7 @@
       </w:r>
       <w:r>
         <w:rPr>
-          <w:rFonts w:ascii="Apple SD Gothic Neo" w:hAnsi="Apple SD Gothic Neo" w:eastAsia="Apple SD Gothic Neo" w:cs="Apple SD Gothic Neo"/>
+          <w:rFonts w:ascii="AppleGothic" w:hAnsi="AppleGothic" w:eastAsia="AppleGothic" w:cs="AppleGothic"/>
           <w:color w:val="5E7084"/>
           <w:sz w:val="19"/>
         </w:rPr>
@@ -3135,7 +3135,7 @@
       </w:pPr>
       <w:r>
         <w:rPr>
-          <w:rFonts w:ascii="Apple SD Gothic Neo" w:hAnsi="Apple SD Gothic Neo" w:eastAsia="Apple SD Gothic Neo" w:cs="Apple SD Gothic Neo"/>
+          <w:rFonts w:ascii="AppleGothic" w:hAnsi="AppleGothic" w:eastAsia="AppleGothic" w:cs="AppleGothic"/>
           <w:b/>
           <w:color w:val="B42318"/>
           <w:sz w:val="19"/>
@@ -3144,7 +3144,7 @@
       </w:r>
       <w:r>
         <w:rPr>
-          <w:rFonts w:ascii="Apple SD Gothic Neo" w:hAnsi="Apple SD Gothic Neo" w:eastAsia="Apple SD Gothic Neo" w:cs="Apple SD Gothic Neo"/>
+          <w:rFonts w:ascii="AppleGothic" w:hAnsi="AppleGothic" w:eastAsia="AppleGothic" w:cs="AppleGothic"/>
           <w:color w:val="5E7084"/>
           <w:sz w:val="19"/>
         </w:rPr>
@@ -3159,7 +3159,7 @@
       </w:pPr>
       <w:r>
         <w:rPr>
-          <w:rFonts w:ascii="Apple SD Gothic Neo" w:hAnsi="Apple SD Gothic Neo" w:eastAsia="Apple SD Gothic Neo" w:cs="Apple SD Gothic Neo"/>
+          <w:rFonts w:ascii="AppleGothic" w:hAnsi="AppleGothic" w:eastAsia="AppleGothic" w:cs="AppleGothic"/>
           <w:b/>
           <w:color w:val="000000"/>
           <w:sz w:val="40"/>
@@ -3175,7 +3175,7 @@
       </w:pPr>
       <w:r>
         <w:rPr>
-          <w:rFonts w:ascii="Apple SD Gothic Neo" w:hAnsi="Apple SD Gothic Neo" w:eastAsia="Apple SD Gothic Neo" w:cs="Apple SD Gothic Neo"/>
+          <w:rFonts w:ascii="AppleGothic" w:hAnsi="AppleGothic" w:eastAsia="AppleGothic" w:cs="AppleGothic"/>
           <w:b/>
           <w:color w:val="000000"/>
           <w:sz w:val="30"/>
@@ -3189,7 +3189,7 @@
       </w:pPr>
       <w:r>
         <w:rPr>
-          <w:rFonts w:ascii="Apple SD Gothic Neo" w:hAnsi="Apple SD Gothic Neo" w:eastAsia="Apple SD Gothic Neo" w:cs="Apple SD Gothic Neo"/>
+          <w:rFonts w:ascii="AppleGothic" w:hAnsi="AppleGothic" w:eastAsia="AppleGothic" w:cs="AppleGothic"/>
           <w:b/>
           <w:color w:val="246BCE"/>
           <w:sz w:val="21"/>
@@ -3198,7 +3198,7 @@
       </w:r>
       <w:r>
         <w:rPr>
-          <w:rFonts w:ascii="Apple SD Gothic Neo" w:hAnsi="Apple SD Gothic Neo" w:eastAsia="Apple SD Gothic Neo" w:cs="Apple SD Gothic Neo"/>
+          <w:rFonts w:ascii="AppleGothic" w:hAnsi="AppleGothic" w:eastAsia="AppleGothic" w:cs="AppleGothic"/>
           <w:color w:val="182433"/>
           <w:sz w:val="21"/>
         </w:rPr>
@@ -3211,7 +3211,7 @@
       </w:pPr>
       <w:r>
         <w:rPr>
-          <w:rFonts w:ascii="Apple SD Gothic Neo" w:hAnsi="Apple SD Gothic Neo" w:eastAsia="Apple SD Gothic Neo" w:cs="Apple SD Gothic Neo"/>
+          <w:rFonts w:ascii="AppleGothic" w:hAnsi="AppleGothic" w:eastAsia="AppleGothic" w:cs="AppleGothic"/>
           <w:b/>
           <w:color w:val="14866D"/>
           <w:sz w:val="21"/>
@@ -3220,7 +3220,7 @@
       </w:r>
       <w:r>
         <w:rPr>
-          <w:rFonts w:ascii="Apple SD Gothic Neo" w:hAnsi="Apple SD Gothic Neo" w:eastAsia="Apple SD Gothic Neo" w:cs="Apple SD Gothic Neo"/>
+          <w:rFonts w:ascii="AppleGothic" w:hAnsi="AppleGothic" w:eastAsia="AppleGothic" w:cs="AppleGothic"/>
           <w:color w:val="182433"/>
           <w:sz w:val="21"/>
         </w:rPr>
@@ -3234,7 +3234,7 @@
       </w:pPr>
       <w:r>
         <w:rPr>
-          <w:rFonts w:ascii="Apple SD Gothic Neo" w:hAnsi="Apple SD Gothic Neo" w:eastAsia="Apple SD Gothic Neo" w:cs="Apple SD Gothic Neo"/>
+          <w:rFonts w:ascii="AppleGothic" w:hAnsi="AppleGothic" w:eastAsia="AppleGothic" w:cs="AppleGothic"/>
           <w:color w:val="182433"/>
           <w:sz w:val="20"/>
         </w:rPr>
@@ -3248,7 +3248,7 @@
       </w:pPr>
       <w:r>
         <w:rPr>
-          <w:rFonts w:ascii="Apple SD Gothic Neo" w:hAnsi="Apple SD Gothic Neo" w:eastAsia="Apple SD Gothic Neo" w:cs="Apple SD Gothic Neo"/>
+          <w:rFonts w:ascii="AppleGothic" w:hAnsi="AppleGothic" w:eastAsia="AppleGothic" w:cs="AppleGothic"/>
           <w:color w:val="182433"/>
           <w:sz w:val="20"/>
         </w:rPr>
@@ -3262,7 +3262,7 @@
       </w:pPr>
       <w:r>
         <w:rPr>
-          <w:rFonts w:ascii="Apple SD Gothic Neo" w:hAnsi="Apple SD Gothic Neo" w:eastAsia="Apple SD Gothic Neo" w:cs="Apple SD Gothic Neo"/>
+          <w:rFonts w:ascii="AppleGothic" w:hAnsi="AppleGothic" w:eastAsia="AppleGothic" w:cs="AppleGothic"/>
           <w:color w:val="182433"/>
           <w:sz w:val="20"/>
         </w:rPr>
@@ -3276,7 +3276,7 @@
       </w:pPr>
       <w:r>
         <w:rPr>
-          <w:rFonts w:ascii="Apple SD Gothic Neo" w:hAnsi="Apple SD Gothic Neo" w:eastAsia="Apple SD Gothic Neo" w:cs="Apple SD Gothic Neo"/>
+          <w:rFonts w:ascii="AppleGothic" w:hAnsi="AppleGothic" w:eastAsia="AppleGothic" w:cs="AppleGothic"/>
           <w:color w:val="182433"/>
           <w:sz w:val="20"/>
         </w:rPr>
@@ -3290,7 +3290,7 @@
       </w:pPr>
       <w:r>
         <w:rPr>
-          <w:rFonts w:ascii="Apple SD Gothic Neo" w:hAnsi="Apple SD Gothic Neo" w:eastAsia="Apple SD Gothic Neo" w:cs="Apple SD Gothic Neo"/>
+          <w:rFonts w:ascii="AppleGothic" w:hAnsi="AppleGothic" w:eastAsia="AppleGothic" w:cs="AppleGothic"/>
           <w:color w:val="182433"/>
           <w:sz w:val="20"/>
         </w:rPr>
@@ -3304,7 +3304,7 @@
       </w:pPr>
       <w:r>
         <w:rPr>
-          <w:rFonts w:ascii="Apple SD Gothic Neo" w:hAnsi="Apple SD Gothic Neo" w:eastAsia="Apple SD Gothic Neo" w:cs="Apple SD Gothic Neo"/>
+          <w:rFonts w:ascii="AppleGothic" w:hAnsi="AppleGothic" w:eastAsia="AppleGothic" w:cs="AppleGothic"/>
           <w:color w:val="182433"/>
           <w:sz w:val="20"/>
         </w:rPr>
@@ -3317,7 +3317,7 @@
       </w:pPr>
       <w:r>
         <w:rPr>
-          <w:rFonts w:ascii="Apple SD Gothic Neo" w:hAnsi="Apple SD Gothic Neo" w:eastAsia="Apple SD Gothic Neo" w:cs="Apple SD Gothic Neo"/>
+          <w:rFonts w:ascii="AppleGothic" w:hAnsi="AppleGothic" w:eastAsia="AppleGothic" w:cs="AppleGothic"/>
         </w:rPr>
         <w:t>Incident 보고서를 내보내면 원본 분석과 연결된 명령의 실행자, 시각, 종료 코드, 검증 판정과 전후 Snapshot 해시가 포함됩니다. credential, 실시간 로그와 Snapshot 원문은 포함되지 않습니다.</w:t>
       </w:r>
@@ -3329,7 +3329,7 @@
       </w:pPr>
       <w:r>
         <w:rPr>
-          <w:rFonts w:ascii="Apple SD Gothic Neo" w:hAnsi="Apple SD Gothic Neo" w:eastAsia="Apple SD Gothic Neo" w:cs="Apple SD Gothic Neo"/>
+          <w:rFonts w:ascii="AppleGothic" w:hAnsi="AppleGothic" w:eastAsia="AppleGothic" w:cs="AppleGothic"/>
           <w:b/>
           <w:color w:val="A56A00"/>
           <w:sz w:val="19"/>
@@ -3338,7 +3338,7 @@
       </w:r>
       <w:r>
         <w:rPr>
-          <w:rFonts w:ascii="Apple SD Gothic Neo" w:hAnsi="Apple SD Gothic Neo" w:eastAsia="Apple SD Gothic Neo" w:cs="Apple SD Gothic Neo"/>
+          <w:rFonts w:ascii="AppleGothic" w:hAnsi="AppleGothic" w:eastAsia="AppleGothic" w:cs="AppleGothic"/>
           <w:color w:val="5E7084"/>
           <w:sz w:val="19"/>
         </w:rPr>
@@ -3353,7 +3353,7 @@
       </w:pPr>
       <w:r>
         <w:rPr>
-          <w:rFonts w:ascii="Apple SD Gothic Neo" w:hAnsi="Apple SD Gothic Neo" w:eastAsia="Apple SD Gothic Neo" w:cs="Apple SD Gothic Neo"/>
+          <w:rFonts w:ascii="AppleGothic" w:hAnsi="AppleGothic" w:eastAsia="AppleGothic" w:cs="AppleGothic"/>
           <w:b/>
           <w:color w:val="000000"/>
           <w:sz w:val="30"/>
@@ -3367,7 +3367,7 @@
       </w:pPr>
       <w:r>
         <w:rPr>
-          <w:rFonts w:ascii="Apple SD Gothic Neo" w:hAnsi="Apple SD Gothic Neo" w:eastAsia="Apple SD Gothic Neo" w:cs="Apple SD Gothic Neo"/>
+          <w:rFonts w:ascii="AppleGothic" w:hAnsi="AppleGothic" w:eastAsia="AppleGothic" w:cs="AppleGothic"/>
           <w:b/>
           <w:color w:val="246BCE"/>
           <w:sz w:val="21"/>
@@ -3376,7 +3376,7 @@
       </w:r>
       <w:r>
         <w:rPr>
-          <w:rFonts w:ascii="Apple SD Gothic Neo" w:hAnsi="Apple SD Gothic Neo" w:eastAsia="Apple SD Gothic Neo" w:cs="Apple SD Gothic Neo"/>
+          <w:rFonts w:ascii="AppleGothic" w:hAnsi="AppleGothic" w:eastAsia="AppleGothic" w:cs="AppleGothic"/>
           <w:color w:val="182433"/>
           <w:sz w:val="21"/>
         </w:rPr>
@@ -3389,7 +3389,7 @@
       </w:pPr>
       <w:r>
         <w:rPr>
-          <w:rFonts w:ascii="Apple SD Gothic Neo" w:hAnsi="Apple SD Gothic Neo" w:eastAsia="Apple SD Gothic Neo" w:cs="Apple SD Gothic Neo"/>
+          <w:rFonts w:ascii="AppleGothic" w:hAnsi="AppleGothic" w:eastAsia="AppleGothic" w:cs="AppleGothic"/>
           <w:b/>
           <w:color w:val="14866D"/>
           <w:sz w:val="21"/>
@@ -3398,7 +3398,7 @@
       </w:r>
       <w:r>
         <w:rPr>
-          <w:rFonts w:ascii="Apple SD Gothic Neo" w:hAnsi="Apple SD Gothic Neo" w:eastAsia="Apple SD Gothic Neo" w:cs="Apple SD Gothic Neo"/>
+          <w:rFonts w:ascii="AppleGothic" w:hAnsi="AppleGothic" w:eastAsia="AppleGothic" w:cs="AppleGothic"/>
           <w:color w:val="182433"/>
           <w:sz w:val="21"/>
         </w:rPr>
@@ -3412,7 +3412,7 @@
       </w:pPr>
       <w:r>
         <w:rPr>
-          <w:rFonts w:ascii="Apple SD Gothic Neo" w:hAnsi="Apple SD Gothic Neo" w:eastAsia="Apple SD Gothic Neo" w:cs="Apple SD Gothic Neo"/>
+          <w:rFonts w:ascii="AppleGothic" w:hAnsi="AppleGothic" w:eastAsia="AppleGothic" w:cs="AppleGothic"/>
           <w:color w:val="182433"/>
           <w:sz w:val="20"/>
         </w:rPr>
@@ -3426,7 +3426,7 @@
       </w:pPr>
       <w:r>
         <w:rPr>
-          <w:rFonts w:ascii="Apple SD Gothic Neo" w:hAnsi="Apple SD Gothic Neo" w:eastAsia="Apple SD Gothic Neo" w:cs="Apple SD Gothic Neo"/>
+          <w:rFonts w:ascii="AppleGothic" w:hAnsi="AppleGothic" w:eastAsia="AppleGothic" w:cs="AppleGothic"/>
           <w:color w:val="182433"/>
           <w:sz w:val="20"/>
         </w:rPr>
@@ -3440,7 +3440,7 @@
       </w:pPr>
       <w:r>
         <w:rPr>
-          <w:rFonts w:ascii="Apple SD Gothic Neo" w:hAnsi="Apple SD Gothic Neo" w:eastAsia="Apple SD Gothic Neo" w:cs="Apple SD Gothic Neo"/>
+          <w:rFonts w:ascii="AppleGothic" w:hAnsi="AppleGothic" w:eastAsia="AppleGothic" w:cs="AppleGothic"/>
           <w:color w:val="182433"/>
           <w:sz w:val="20"/>
         </w:rPr>
@@ -3454,7 +3454,7 @@
       </w:pPr>
       <w:r>
         <w:rPr>
-          <w:rFonts w:ascii="Apple SD Gothic Neo" w:hAnsi="Apple SD Gothic Neo" w:eastAsia="Apple SD Gothic Neo" w:cs="Apple SD Gothic Neo"/>
+          <w:rFonts w:ascii="AppleGothic" w:hAnsi="AppleGothic" w:eastAsia="AppleGothic" w:cs="AppleGothic"/>
           <w:color w:val="182433"/>
           <w:sz w:val="20"/>
         </w:rPr>
@@ -3468,7 +3468,7 @@
       </w:pPr>
       <w:r>
         <w:rPr>
-          <w:rFonts w:ascii="Apple SD Gothic Neo" w:hAnsi="Apple SD Gothic Neo" w:eastAsia="Apple SD Gothic Neo" w:cs="Apple SD Gothic Neo"/>
+          <w:rFonts w:ascii="AppleGothic" w:hAnsi="AppleGothic" w:eastAsia="AppleGothic" w:cs="AppleGothic"/>
           <w:color w:val="182433"/>
           <w:sz w:val="20"/>
         </w:rPr>
@@ -3482,7 +3482,7 @@
       </w:pPr>
       <w:r>
         <w:rPr>
-          <w:rFonts w:ascii="Apple SD Gothic Neo" w:hAnsi="Apple SD Gothic Neo" w:eastAsia="Apple SD Gothic Neo" w:cs="Apple SD Gothic Neo"/>
+          <w:rFonts w:ascii="AppleGothic" w:hAnsi="AppleGothic" w:eastAsia="AppleGothic" w:cs="AppleGothic"/>
           <w:b/>
           <w:color w:val="A56A00"/>
           <w:sz w:val="19"/>
@@ -3491,7 +3491,7 @@
       </w:r>
       <w:r>
         <w:rPr>
-          <w:rFonts w:ascii="Apple SD Gothic Neo" w:hAnsi="Apple SD Gothic Neo" w:eastAsia="Apple SD Gothic Neo" w:cs="Apple SD Gothic Neo"/>
+          <w:rFonts w:ascii="AppleGothic" w:hAnsi="AppleGothic" w:eastAsia="AppleGothic" w:cs="AppleGothic"/>
           <w:color w:val="5E7084"/>
           <w:sz w:val="19"/>
         </w:rPr>
@@ -3505,7 +3505,7 @@
       </w:pPr>
       <w:r>
         <w:rPr>
-          <w:rFonts w:ascii="Apple SD Gothic Neo" w:hAnsi="Apple SD Gothic Neo" w:eastAsia="Apple SD Gothic Neo" w:cs="Apple SD Gothic Neo"/>
+          <w:rFonts w:ascii="AppleGothic" w:hAnsi="AppleGothic" w:eastAsia="AppleGothic" w:cs="AppleGothic"/>
           <w:b/>
           <w:color w:val="B42318"/>
           <w:sz w:val="19"/>
@@ -3514,7 +3514,7 @@
       </w:r>
       <w:r>
         <w:rPr>
-          <w:rFonts w:ascii="Apple SD Gothic Neo" w:hAnsi="Apple SD Gothic Neo" w:eastAsia="Apple SD Gothic Neo" w:cs="Apple SD Gothic Neo"/>
+          <w:rFonts w:ascii="AppleGothic" w:hAnsi="AppleGothic" w:eastAsia="AppleGothic" w:cs="AppleGothic"/>
           <w:color w:val="5E7084"/>
           <w:sz w:val="19"/>
         </w:rPr>
@@ -3527,7 +3527,7 @@
       </w:pPr>
       <w:r>
         <w:rPr>
-          <w:rFonts w:ascii="Apple SD Gothic Neo" w:hAnsi="Apple SD Gothic Neo" w:eastAsia="Apple SD Gothic Neo" w:cs="Apple SD Gothic Neo"/>
+          <w:rFonts w:ascii="AppleGothic" w:hAnsi="AppleGothic" w:eastAsia="AppleGothic" w:cs="AppleGothic"/>
         </w:rPr>
         <w:t>Kubernetes 콘솔</w:t>
       </w:r>
@@ -3538,7 +3538,7 @@
       </w:pPr>
       <w:r>
         <w:rPr>
-          <w:rFonts w:ascii="Apple SD Gothic Neo" w:hAnsi="Apple SD Gothic Neo" w:eastAsia="Apple SD Gothic Neo" w:cs="Apple SD Gothic Neo"/>
+          <w:rFonts w:ascii="AppleGothic" w:hAnsi="AppleGothic" w:eastAsia="AppleGothic" w:cs="AppleGothic"/>
           <w:sz w:val="16"/>
         </w:rPr>
         <w:t>목적  선택한 원격 클러스터에서 kubectl 명령과 Pod 터미널을 플랫폼 권한 및 감사 경계 안에서 실행합니다.</w:t>
@@ -3550,7 +3550,7 @@
       </w:pPr>
       <w:r>
         <w:rPr>
-          <w:rFonts w:ascii="Apple SD Gothic Neo" w:hAnsi="Apple SD Gothic Neo" w:eastAsia="Apple SD Gothic Neo" w:cs="Apple SD Gothic Neo"/>
+          <w:rFonts w:ascii="AppleGothic" w:hAnsi="AppleGothic" w:eastAsia="AppleGothic" w:cs="AppleGothic"/>
           <w:sz w:val="16"/>
         </w:rPr>
         <w:t>사용 시점  리소스 상세 확인, AI 분석 검증 명령 실행, Pod 내부 상태 확인이 필요할 때 사용합니다.</w:t>
@@ -3563,7 +3563,7 @@
       </w:pPr>
       <w:r>
         <w:rPr>
-          <w:rFonts w:ascii="Apple SD Gothic Neo" w:hAnsi="Apple SD Gothic Neo" w:eastAsia="Apple SD Gothic Neo" w:cs="Apple SD Gothic Neo"/>
+          <w:rFonts w:ascii="AppleGothic" w:hAnsi="AppleGothic" w:eastAsia="AppleGothic" w:cs="AppleGothic"/>
           <w:sz w:val="16"/>
         </w:rPr>
         <w:t>Cluster와 Namespace는 플랫폼이 고정하며 kubeconfig와 context 변경 옵션은 사용할 수 없습니다.</w:t>
@@ -3576,7 +3576,7 @@
       </w:pPr>
       <w:r>
         <w:rPr>
-          <w:rFonts w:ascii="Apple SD Gothic Neo" w:hAnsi="Apple SD Gothic Neo" w:eastAsia="Apple SD Gothic Neo" w:cs="Apple SD Gothic Neo"/>
+          <w:rFonts w:ascii="AppleGothic" w:hAnsi="AppleGothic" w:eastAsia="AppleGothic" w:cs="AppleGothic"/>
           <w:sz w:val="16"/>
         </w:rPr>
         <w:t>조회 명령은 바로 실행하고 변경·삭제·대화형 명령은 대상과 위험도를 확인한 뒤 실행합니다.</w:t>
@@ -3589,7 +3589,7 @@
       </w:pPr>
       <w:r>
         <w:rPr>
-          <w:rFonts w:ascii="Apple SD Gothic Neo" w:hAnsi="Apple SD Gothic Neo" w:eastAsia="Apple SD Gothic Neo" w:cs="Apple SD Gothic Neo"/>
+          <w:rFonts w:ascii="AppleGothic" w:hAnsi="AppleGothic" w:eastAsia="AppleGothic" w:cs="AppleGothic"/>
           <w:sz w:val="16"/>
         </w:rPr>
         <w:t>실행 이력에서 상태, 종료 코드, 소요 시간, stdout과 stderr를 확인합니다.</w:t>
@@ -3602,7 +3602,7 @@
       </w:pPr>
       <w:r>
         <w:rPr>
-          <w:rFonts w:ascii="Apple SD Gothic Neo" w:hAnsi="Apple SD Gothic Neo" w:eastAsia="Apple SD Gothic Neo" w:cs="Apple SD Gothic Neo"/>
+          <w:rFonts w:ascii="AppleGothic" w:hAnsi="AppleGothic" w:eastAsia="AppleGothic" w:cs="AppleGothic"/>
           <w:sz w:val="16"/>
         </w:rPr>
         <w:t>AI Analysis의 콘솔에서 검증을 사용하면 실행 이력이 원본 분석과 연결됩니다.</w:t>
@@ -3615,7 +3615,7 @@
       </w:pPr>
       <w:r>
         <w:rPr>
-          <w:rFonts w:ascii="Apple SD Gothic Neo" w:hAnsi="Apple SD Gothic Neo" w:eastAsia="Apple SD Gothic Neo" w:cs="Apple SD Gothic Neo"/>
+          <w:rFonts w:ascii="AppleGothic" w:hAnsi="AppleGothic" w:eastAsia="AppleGothic" w:cs="AppleGothic"/>
           <w:sz w:val="16"/>
         </w:rPr>
         <w:t>동시 실행 제한 메시지가 표시되면 진행 중인 작업을 확인하고 안내된 시간 뒤 다시 실행합니다.</w:t>
@@ -3627,7 +3627,7 @@
       </w:pPr>
       <w:r>
         <w:rPr>
-          <w:rFonts w:ascii="Apple SD Gothic Neo" w:hAnsi="Apple SD Gothic Neo" w:eastAsia="Apple SD Gothic Neo" w:cs="Apple SD Gothic Neo"/>
+          <w:rFonts w:ascii="AppleGothic" w:hAnsi="AppleGothic" w:eastAsia="AppleGothic" w:cs="AppleGothic"/>
           <w:sz w:val="16"/>
         </w:rPr>
         <w:t>처음 사용할 때  kubectl get pods -o wide 같은 읽기 전용 명령으로 권한과 연결을 확인합니다.</w:t>
@@ -3639,7 +3639,7 @@
       </w:pPr>
       <w:r>
         <w:rPr>
-          <w:rFonts w:ascii="Apple SD Gothic Neo" w:hAnsi="Apple SD Gothic Neo" w:eastAsia="Apple SD Gothic Neo" w:cs="Apple SD Gothic Neo"/>
+          <w:rFonts w:ascii="AppleGothic" w:hAnsi="AppleGothic" w:eastAsia="AppleGothic" w:cs="AppleGothic"/>
           <w:sz w:val="16"/>
         </w:rPr>
         <w:t>주의  Pod 터미널 종료 전 exit를 실행하고, 변경 명령은 실행 후 리소스 상태 확인과 재분석으로 결과를 검증합니다.</w:t>
@@ -3651,7 +3651,7 @@
       </w:pPr>
       <w:r>
         <w:rPr>
-          <w:rFonts w:ascii="Apple SD Gothic Neo" w:hAnsi="Apple SD Gothic Neo" w:eastAsia="Apple SD Gothic Neo" w:cs="Apple SD Gothic Neo"/>
+          <w:rFonts w:ascii="AppleGothic" w:hAnsi="AppleGothic" w:eastAsia="AppleGothic" w:cs="AppleGothic"/>
           <w:sz w:val="16"/>
         </w:rPr>
         <w:t>변경 또는 삭제 명령이 끝나면 운영 결과 검증에서 Kubernetes 상태의 전후 비교 판정과 확인 시각을 먼저 봅니다. 상태가 확인되지 않으면 성공 exit code만으로 조치 완료를 선언하지 않습니다.</w:t>
@@ -3664,7 +3664,7 @@
       </w:pPr>
       <w:r>
         <w:rPr>
-          <w:rFonts w:ascii="Apple SD Gothic Neo" w:hAnsi="Apple SD Gothic Neo" w:eastAsia="Apple SD Gothic Neo" w:cs="Apple SD Gothic Neo"/>
+          <w:rFonts w:ascii="AppleGothic" w:hAnsi="AppleGothic" w:eastAsia="AppleGothic" w:cs="AppleGothic"/>
           <w:sz w:val="16"/>
         </w:rPr>
         <w:t>리소스 기반 명령 만들기에서 Kind와 이름을 입력하면 Get, Describe, Logs, YAML 명령을 안전하게 작성할 수 있습니다.</w:t>
@@ -3677,7 +3677,7 @@
       </w:pPr>
       <w:r>
         <w:rPr>
-          <w:rFonts w:ascii="Apple SD Gothic Neo" w:hAnsi="Apple SD Gothic Neo" w:eastAsia="Apple SD Gothic Neo" w:cs="Apple SD Gothic Neo"/>
+          <w:rFonts w:ascii="AppleGothic" w:hAnsi="AppleGothic" w:eastAsia="AppleGothic" w:cs="AppleGothic"/>
           <w:sz w:val="16"/>
         </w:rPr>
         <w:t>Cook Book 탭에서는 기본 현황, Pod, 로그, Service, workload, 자원, Node, storage, network와 권한 점검 명령을 검색합니다. 항목의 목적, 실행 범위와 요구 조건을 확인한 뒤 명령 가져오기를 선택합니다.</w:t>
@@ -3690,7 +3690,7 @@
       </w:pPr>
       <w:r>
         <w:rPr>
-          <w:rFonts w:ascii="Apple SD Gothic Neo" w:hAnsi="Apple SD Gothic Neo" w:eastAsia="Apple SD Gothic Neo" w:cs="Apple SD Gothic Neo"/>
+          <w:rFonts w:ascii="AppleGothic" w:hAnsi="AppleGothic" w:eastAsia="AppleGothic" w:cs="AppleGothic"/>
           <w:sz w:val="16"/>
         </w:rPr>
         <w:t>증상별 단계 점검에서 Pod 기동, Service 연결, PVC Pending, Node Pressure 절차를 순서대로 실행하고 각 항목의 정상 기준과 다음 권장 점검을 확인합니다.</w:t>
@@ -3703,7 +3703,7 @@
       </w:pPr>
       <w:r>
         <w:rPr>
-          <w:rFonts w:ascii="Apple SD Gothic Neo" w:hAnsi="Apple SD Gothic Neo" w:eastAsia="Apple SD Gothic Neo" w:cs="Apple SD Gothic Neo"/>
+          <w:rFonts w:ascii="AppleGothic" w:hAnsi="AppleGothic" w:eastAsia="AppleGothic" w:cs="AppleGothic"/>
           <w:sz w:val="16"/>
         </w:rPr>
         <w:t>리소스 기반 명령 만들기에 입력한 이름과 컨테이너는 Cook Book 명령의 placeholder에 자동 반영됩니다.</w:t>
@@ -3716,7 +3716,7 @@
       </w:pPr>
       <w:r>
         <w:rPr>
-          <w:rFonts w:ascii="Apple SD Gothic Neo" w:hAnsi="Apple SD Gothic Neo" w:eastAsia="Apple SD Gothic Neo" w:cs="Apple SD Gothic Neo"/>
+          <w:rFonts w:ascii="AppleGothic" w:hAnsi="AppleGothic" w:eastAsia="AppleGothic" w:cs="AppleGothic"/>
           <w:sz w:val="16"/>
         </w:rPr>
         <w:t>Metrics APIService가 Available 상태가 아니면 kubectl top 점검은 선택할 수 없습니다.</w:t>
@@ -3729,7 +3729,7 @@
       </w:pPr>
       <w:r>
         <w:rPr>
-          <w:rFonts w:ascii="Apple SD Gothic Neo" w:hAnsi="Apple SD Gothic Neo" w:eastAsia="Apple SD Gothic Neo" w:cs="Apple SD Gothic Neo"/>
+          <w:rFonts w:ascii="AppleGothic" w:hAnsi="AppleGothic" w:eastAsia="AppleGothic" w:cs="AppleGothic"/>
           <w:sz w:val="16"/>
         </w:rPr>
         <w:t>POD_NAME, SERVICE_NAME 같은 표시가 있으면 실제 리소스 이름으로 바꾸기 전에는 실행할 수 없습니다.</w:t>
@@ -3742,7 +3742,7 @@
       </w:pPr>
       <w:r>
         <w:rPr>
-          <w:rFonts w:ascii="Apple SD Gothic Neo" w:hAnsi="Apple SD Gothic Neo" w:eastAsia="Apple SD Gothic Neo" w:cs="Apple SD Gothic Neo"/>
+          <w:rFonts w:ascii="AppleGothic" w:hAnsi="AppleGothic" w:eastAsia="AppleGothic" w:cs="AppleGothic"/>
           <w:sz w:val="16"/>
         </w:rPr>
         <w:t>클러스터 범위 항목은 전체 Namespace로, Namespace 항목은 현재 선택한 Namespace로 작업 범위를 맞춥니다.</w:t>
@@ -3755,7 +3755,7 @@
       </w:pPr>
       <w:r>
         <w:rPr>
-          <w:rFonts w:ascii="Apple SD Gothic Neo" w:hAnsi="Apple SD Gothic Neo" w:eastAsia="Apple SD Gothic Neo" w:cs="Apple SD Gothic Neo"/>
+          <w:rFonts w:ascii="AppleGothic" w:hAnsi="AppleGothic" w:eastAsia="AppleGothic" w:cs="AppleGothic"/>
           <w:sz w:val="16"/>
         </w:rPr>
         <w:t>Metrics Server 필요 표시가 있는 사용량 명령은 대상 클러스터에 지표 API가 없으면 결과를 제공하지 못합니다.</w:t>
@@ -3768,7 +3768,7 @@
       </w:pPr>
       <w:r>
         <w:rPr>
-          <w:rFonts w:ascii="Apple SD Gothic Neo" w:hAnsi="Apple SD Gothic Neo" w:eastAsia="Apple SD Gothic Neo" w:cs="Apple SD Gothic Neo"/>
+          <w:rFonts w:ascii="AppleGothic" w:hAnsi="AppleGothic" w:eastAsia="AppleGothic" w:cs="AppleGothic"/>
           <w:sz w:val="16"/>
         </w:rPr>
         <w:t>Cook Book은 Secret 값 출력, shell pipe, port-forward와 임시 리소스 생성 명령을 제공하지 않습니다.</w:t>
@@ -3781,7 +3781,7 @@
       </w:pPr>
       <w:r>
         <w:rPr>
-          <w:rFonts w:ascii="Apple SD Gothic Neo" w:hAnsi="Apple SD Gothic Neo" w:eastAsia="Apple SD Gothic Neo" w:cs="Apple SD Gothic Neo"/>
+          <w:rFonts w:ascii="AppleGothic" w:hAnsi="AppleGothic" w:eastAsia="AppleGothic" w:cs="AppleGothic"/>
           <w:sz w:val="16"/>
         </w:rPr>
         <w:t>Event 확인, 로그 확인, YAML 확인 버튼은 같은 Cluster와 Namespace를 유지한 후속 명령을 준비합니다.</w:t>
@@ -3794,7 +3794,7 @@
       </w:pPr>
       <w:r>
         <w:rPr>
-          <w:rFonts w:ascii="Apple SD Gothic Neo" w:hAnsi="Apple SD Gothic Neo" w:eastAsia="Apple SD Gothic Neo" w:cs="Apple SD Gothic Neo"/>
+          <w:rFonts w:ascii="AppleGothic" w:hAnsi="AppleGothic" w:eastAsia="AppleGothic" w:cs="AppleGothic"/>
           <w:sz w:val="16"/>
         </w:rPr>
         <w:t>전후 Snapshot은 필요할 때만 펼쳐 보고, 롤백 후보는 현재 상태와 영향을 다시 확인한 뒤 별도 명령으로 실행합니다.</w:t>
@@ -3807,7 +3807,7 @@
       </w:pPr>
       <w:r>
         <w:rPr>
-          <w:rFonts w:ascii="Apple SD Gothic Neo" w:hAnsi="Apple SD Gothic Neo" w:eastAsia="Apple SD Gothic Neo" w:cs="Apple SD Gothic Neo"/>
+          <w:rFonts w:ascii="AppleGothic" w:hAnsi="AppleGothic" w:eastAsia="AppleGothic" w:cs="AppleGothic"/>
           <w:sz w:val="16"/>
         </w:rPr>
         <w:t>일반 명령은 격리 실행기를 사용합니다. Pod 터미널은 현재 Backend Fabric8 WebSocket 경계를 사용하며 화면의 실행 경계 표시로 구분합니다.</w:t>
@@ -3822,7 +3822,7 @@
       </w:pPr>
       <w:r>
         <w:rPr>
-          <w:rFonts w:ascii="Apple SD Gothic Neo" w:hAnsi="Apple SD Gothic Neo" w:eastAsia="Apple SD Gothic Neo" w:cs="Apple SD Gothic Neo"/>
+          <w:rFonts w:ascii="AppleGothic" w:hAnsi="AppleGothic" w:eastAsia="AppleGothic" w:cs="AppleGothic"/>
           <w:b/>
           <w:color w:val="000000"/>
           <w:sz w:val="16"/>
@@ -3838,7 +3838,7 @@
       </w:pPr>
       <w:r>
         <w:rPr>
-          <w:rFonts w:ascii="Apple SD Gothic Neo" w:hAnsi="Apple SD Gothic Neo" w:eastAsia="Apple SD Gothic Neo" w:cs="Apple SD Gothic Neo"/>
+          <w:rFonts w:ascii="AppleGothic" w:hAnsi="AppleGothic" w:eastAsia="AppleGothic" w:cs="AppleGothic"/>
           <w:b/>
           <w:color w:val="000000"/>
           <w:sz w:val="30"/>
@@ -3852,7 +3852,7 @@
       </w:pPr>
       <w:r>
         <w:rPr>
-          <w:rFonts w:ascii="Apple SD Gothic Neo" w:hAnsi="Apple SD Gothic Neo" w:eastAsia="Apple SD Gothic Neo" w:cs="Apple SD Gothic Neo"/>
+          <w:rFonts w:ascii="AppleGothic" w:hAnsi="AppleGothic" w:eastAsia="AppleGothic" w:cs="AppleGothic"/>
         </w:rPr>
         <w:t>목적  Tenant Chart를 Custom Values로 Cluster에 Helm 배포하고 Application 상태와 수명주기를 운영합니다.</w:t>
       </w:r>
@@ -3863,7 +3863,7 @@
       </w:pPr>
       <w:r>
         <w:rPr>
-          <w:rFonts w:ascii="Apple SD Gothic Neo" w:hAnsi="Apple SD Gothic Neo" w:eastAsia="Apple SD Gothic Neo" w:cs="Apple SD Gothic Neo"/>
+          <w:rFonts w:ascii="AppleGothic" w:hAnsi="AppleGothic" w:eastAsia="AppleGothic" w:cs="AppleGothic"/>
         </w:rPr>
         <w:t>사용 시점  Artifact Hub Chart를 가져오거나 보유 Chart를 Cluster와 Namespace에 배포하고 상태를 확인할 때 사용합니다.</w:t>
       </w:r>
@@ -3875,7 +3875,7 @@
       </w:pPr>
       <w:r>
         <w:rPr>
-          <w:rFonts w:ascii="Apple SD Gothic Neo" w:hAnsi="Apple SD Gothic Neo" w:eastAsia="Apple SD Gothic Neo" w:cs="Apple SD Gothic Neo"/>
+          <w:rFonts w:ascii="AppleGothic" w:hAnsi="AppleGothic" w:eastAsia="AppleGothic" w:cs="AppleGothic"/>
         </w:rPr>
         <w:t>Chart Library를 기본 시작점으로 사용하고 Chart가 없을 때 Discover 또는 Source/.tgz 가져오기를 선택합니다.</w:t>
       </w:r>
@@ -3883,11 +3883,22 @@
     <w:p>
       <w:pPr>
         <w:pStyle w:val="ListBullet"/>
-        <w:spacing w:after="60"/>
       </w:pPr>
       <w:r>
         <w:rPr>
-          <w:rFonts w:ascii="Apple SD Gothic Neo" w:hAnsi="Apple SD Gothic Neo" w:eastAsia="Apple SD Gothic Neo" w:cs="Apple SD Gothic Neo"/>
+          <w:rFonts w:eastAsia="AppleGothic" w:ascii="AppleGothic" w:hAnsi="AppleGothic" w:cs="AppleGothic"/>
+        </w:rPr>
+        <w:t>Discover는 빈 검색 화면으로 시작합니다. 특정 Chart가 자동 입력되지 않으며 제품명이나 기능 키워드를 직접 입력해 검색합니다.</w:t>
+      </w:r>
+    </w:p>
+    <w:p>
+      <w:pPr>
+        <w:pStyle w:val="ListBullet"/>
+        <w:spacing w:after="60"/>
+      </w:pPr>
+      <w:r>
+        <w:rPr>
+          <w:rFonts w:ascii="AppleGothic" w:hAnsi="AppleGothic" w:eastAsia="AppleGothic" w:cs="AppleGothic"/>
         </w:rPr>
         <w:t>Values Profile과 대상 Cluster/Namespace를 정한 뒤 Cluster 내부, Chart에서 관리, KlueOps HTTPRoute 중 노출 방식을 선택하고 Preview와 정확한 확인 문구를 거쳐 배포합니다.</w:t>
       </w:r>
@@ -3898,7 +3909,7 @@
       </w:pPr>
       <w:r>
         <w:rPr>
-          <w:rFonts w:ascii="Apple SD Gothic Neo" w:hAnsi="Apple SD Gothic Neo" w:eastAsia="Apple SD Gothic Neo" w:cs="Apple SD Gothic Neo"/>
+          <w:rFonts w:ascii="AppleGothic" w:hAnsi="AppleGothic" w:eastAsia="AppleGothic" w:cs="AppleGothic"/>
         </w:rPr>
         <w:t>KlueOps HTTPRoute에서는 현재 Values로 렌더링된 Service와 대상 Cluster의 READY Gateway를 목록에서 선택합니다. Service Port는 spec.ports[].port이며 Pod의 targetPort나 Node 외부 노출용 nodePort가 아닙니다.</w:t>
       </w:r>
@@ -3909,7 +3920,7 @@
       </w:pPr>
       <w:r>
         <w:rPr>
-          <w:rFonts w:ascii="Apple SD Gothic Neo" w:hAnsi="Apple SD Gothic Neo" w:eastAsia="Apple SD Gothic Neo" w:cs="Apple SD Gothic Neo"/>
+          <w:rFonts w:ascii="AppleGothic" w:hAnsi="AppleGothic" w:eastAsia="AppleGothic" w:cs="AppleGothic"/>
         </w:rPr>
         <w:t>Gateway 목록이 비어 있으면 Cluster Admin이 Gateway API CRD, Controller와 HTTP/HTTPS Gateway를 준비하고, 등록 Cluster credential에 Gateway get/list 읽기 권한을 부여합니다. KlueOps는 이를 자동 설치하지 않으며, 나중에 준비한 경우 다시 조회하거나 기존 내부 Application의 Upgrade에서 노출을 추가할 수 있습니다.</w:t>
       </w:r>
@@ -3921,19 +3932,30 @@
       </w:pPr>
       <w:r>
         <w:rPr>
-          <w:rFonts w:ascii="Apple SD Gothic Neo" w:hAnsi="Apple SD Gothic Neo" w:eastAsia="Apple SD Gothic Neo" w:cs="Apple SD Gothic Neo"/>
+          <w:rFonts w:ascii="AppleGothic" w:hAnsi="AppleGothic" w:eastAsia="AppleGothic" w:cs="AppleGothic"/>
         </w:rPr>
         <w:t>Application 상세에서 workload/Pod, Service·Ingress·HTTPRoute URL과 endpoint 상태, Helm History와 upgrade/rollback/uninstall을 확인합니다.</w:t>
       </w:r>
     </w:p>
     <w:p>
       <w:pPr>
+        <w:pStyle w:val="ListBullet"/>
+      </w:pPr>
+      <w:r>
+        <w:rPr>
+          <w:rFonts w:eastAsia="AppleGothic" w:ascii="AppleGothic" w:hAnsi="AppleGothic" w:cs="AppleGothic"/>
+        </w:rPr>
+        <w:t>Uninstall 작업은 Job Center가 서버 상태를 자동 갱신합니다. 성공하면 Application과 연결된 Endpoint, Release, Operation, Plan metadata가 목록과 상세에서 함께 제거되고 공유 Namespace와 Tenant Chart Library는 유지됩니다.</w:t>
+      </w:r>
+    </w:p>
+    <w:p>
+      <w:pPr>
         <w:spacing w:before="60" w:after="100"/>
         <w:ind w:left="198"/>
       </w:pPr>
       <w:r>
         <w:rPr>
-          <w:rFonts w:ascii="Apple SD Gothic Neo" w:hAnsi="Apple SD Gothic Neo" w:eastAsia="Apple SD Gothic Neo" w:cs="Apple SD Gothic Neo"/>
+          <w:rFonts w:ascii="AppleGothic" w:hAnsi="AppleGothic" w:eastAsia="AppleGothic" w:cs="AppleGothic"/>
         </w:rPr>
         <w:t>처음 사용할 때  Chart Library에서 검증된 버전을 선택하고 내부 Service 방식으로 작은 테스트 배포부터 시작합니다.</w:t>
       </w:r>
@@ -3945,7 +3967,7 @@
       </w:pPr>
       <w:r>
         <w:rPr>
-          <w:rFonts w:ascii="Apple SD Gothic Neo" w:hAnsi="Apple SD Gothic Neo" w:eastAsia="Apple SD Gothic Neo" w:cs="Apple SD Gothic Neo"/>
+          <w:rFonts w:ascii="AppleGothic" w:hAnsi="AppleGothic" w:eastAsia="AppleGothic" w:cs="AppleGothic"/>
         </w:rPr>
         <w:t>주의  이 기능은 GitOps Controller가 아닙니다. 대상, Values와 Preview를 확인한 명시적 Helm 작업만 실행합니다.</w:t>
       </w:r>
@@ -3958,7 +3980,7 @@
       </w:pPr>
       <w:r>
         <w:rPr>
-          <w:rFonts w:ascii="Apple SD Gothic Neo" w:hAnsi="Apple SD Gothic Neo" w:eastAsia="Apple SD Gothic Neo" w:cs="Apple SD Gothic Neo"/>
+          <w:rFonts w:ascii="AppleGothic" w:hAnsi="AppleGothic" w:eastAsia="AppleGothic" w:cs="AppleGothic"/>
           <w:b/>
           <w:color w:val="000000"/>
           <w:sz w:val="30"/>
@@ -3972,7 +3994,7 @@
       </w:pPr>
       <w:r>
         <w:rPr>
-          <w:rFonts w:ascii="Apple SD Gothic Neo" w:hAnsi="Apple SD Gothic Neo" w:eastAsia="Apple SD Gothic Neo" w:cs="Apple SD Gothic Neo"/>
+          <w:rFonts w:ascii="AppleGothic" w:hAnsi="AppleGothic" w:eastAsia="AppleGothic" w:cs="AppleGothic"/>
           <w:b/>
           <w:color w:val="246BCE"/>
           <w:sz w:val="21"/>
@@ -3981,7 +4003,7 @@
       </w:r>
       <w:r>
         <w:rPr>
-          <w:rFonts w:ascii="Apple SD Gothic Neo" w:hAnsi="Apple SD Gothic Neo" w:eastAsia="Apple SD Gothic Neo" w:cs="Apple SD Gothic Neo"/>
+          <w:rFonts w:ascii="AppleGothic" w:hAnsi="AppleGothic" w:eastAsia="AppleGothic" w:cs="AppleGothic"/>
           <w:color w:val="182433"/>
           <w:sz w:val="21"/>
         </w:rPr>
@@ -3994,7 +4016,7 @@
       </w:pPr>
       <w:r>
         <w:rPr>
-          <w:rFonts w:ascii="Apple SD Gothic Neo" w:hAnsi="Apple SD Gothic Neo" w:eastAsia="Apple SD Gothic Neo" w:cs="Apple SD Gothic Neo"/>
+          <w:rFonts w:ascii="AppleGothic" w:hAnsi="AppleGothic" w:eastAsia="AppleGothic" w:cs="AppleGothic"/>
           <w:b/>
           <w:color w:val="14866D"/>
           <w:sz w:val="21"/>
@@ -4003,7 +4025,7 @@
       </w:r>
       <w:r>
         <w:rPr>
-          <w:rFonts w:ascii="Apple SD Gothic Neo" w:hAnsi="Apple SD Gothic Neo" w:eastAsia="Apple SD Gothic Neo" w:cs="Apple SD Gothic Neo"/>
+          <w:rFonts w:ascii="AppleGothic" w:hAnsi="AppleGothic" w:eastAsia="AppleGothic" w:cs="AppleGothic"/>
           <w:color w:val="182433"/>
           <w:sz w:val="21"/>
         </w:rPr>
@@ -4017,7 +4039,7 @@
       </w:pPr>
       <w:r>
         <w:rPr>
-          <w:rFonts w:ascii="Apple SD Gothic Neo" w:hAnsi="Apple SD Gothic Neo" w:eastAsia="Apple SD Gothic Neo" w:cs="Apple SD Gothic Neo"/>
+          <w:rFonts w:ascii="AppleGothic" w:hAnsi="AppleGothic" w:eastAsia="AppleGothic" w:cs="AppleGothic"/>
           <w:color w:val="182433"/>
           <w:sz w:val="20"/>
         </w:rPr>
@@ -4031,7 +4053,7 @@
       </w:pPr>
       <w:r>
         <w:rPr>
-          <w:rFonts w:ascii="Apple SD Gothic Neo" w:hAnsi="Apple SD Gothic Neo" w:eastAsia="Apple SD Gothic Neo" w:cs="Apple SD Gothic Neo"/>
+          <w:rFonts w:ascii="AppleGothic" w:hAnsi="AppleGothic" w:eastAsia="AppleGothic" w:cs="AppleGothic"/>
           <w:color w:val="182433"/>
           <w:sz w:val="20"/>
         </w:rPr>
@@ -4045,7 +4067,7 @@
       </w:pPr>
       <w:r>
         <w:rPr>
-          <w:rFonts w:ascii="Apple SD Gothic Neo" w:hAnsi="Apple SD Gothic Neo" w:eastAsia="Apple SD Gothic Neo" w:cs="Apple SD Gothic Neo"/>
+          <w:rFonts w:ascii="AppleGothic" w:hAnsi="AppleGothic" w:eastAsia="AppleGothic" w:cs="AppleGothic"/>
           <w:color w:val="182433"/>
           <w:sz w:val="20"/>
         </w:rPr>
@@ -4059,7 +4081,7 @@
       </w:pPr>
       <w:r>
         <w:rPr>
-          <w:rFonts w:ascii="Apple SD Gothic Neo" w:hAnsi="Apple SD Gothic Neo" w:eastAsia="Apple SD Gothic Neo" w:cs="Apple SD Gothic Neo"/>
+          <w:rFonts w:ascii="AppleGothic" w:hAnsi="AppleGothic" w:eastAsia="AppleGothic" w:cs="AppleGothic"/>
           <w:b/>
           <w:color w:val="A56A00"/>
           <w:sz w:val="19"/>
@@ -4068,7 +4090,7 @@
       </w:r>
       <w:r>
         <w:rPr>
-          <w:rFonts w:ascii="Apple SD Gothic Neo" w:hAnsi="Apple SD Gothic Neo" w:eastAsia="Apple SD Gothic Neo" w:cs="Apple SD Gothic Neo"/>
+          <w:rFonts w:ascii="AppleGothic" w:hAnsi="AppleGothic" w:eastAsia="AppleGothic" w:cs="AppleGothic"/>
           <w:color w:val="5E7084"/>
           <w:sz w:val="19"/>
         </w:rPr>
@@ -4083,7 +4105,7 @@
       </w:pPr>
       <w:r>
         <w:rPr>
-          <w:rFonts w:ascii="Apple SD Gothic Neo" w:hAnsi="Apple SD Gothic Neo" w:eastAsia="Apple SD Gothic Neo" w:cs="Apple SD Gothic Neo"/>
+          <w:rFonts w:ascii="AppleGothic" w:hAnsi="AppleGothic" w:eastAsia="AppleGothic" w:cs="AppleGothic"/>
           <w:b/>
           <w:color w:val="000000"/>
           <w:sz w:val="30"/>
@@ -4097,7 +4119,7 @@
       </w:pPr>
       <w:r>
         <w:rPr>
-          <w:rFonts w:ascii="Apple SD Gothic Neo" w:hAnsi="Apple SD Gothic Neo" w:eastAsia="Apple SD Gothic Neo" w:cs="Apple SD Gothic Neo"/>
+          <w:rFonts w:ascii="AppleGothic" w:hAnsi="AppleGothic" w:eastAsia="AppleGothic" w:cs="AppleGothic"/>
           <w:b/>
           <w:color w:val="246BCE"/>
           <w:sz w:val="21"/>
@@ -4106,7 +4128,7 @@
       </w:r>
       <w:r>
         <w:rPr>
-          <w:rFonts w:ascii="Apple SD Gothic Neo" w:hAnsi="Apple SD Gothic Neo" w:eastAsia="Apple SD Gothic Neo" w:cs="Apple SD Gothic Neo"/>
+          <w:rFonts w:ascii="AppleGothic" w:hAnsi="AppleGothic" w:eastAsia="AppleGothic" w:cs="AppleGothic"/>
           <w:color w:val="182433"/>
           <w:sz w:val="21"/>
         </w:rPr>
@@ -4119,7 +4141,7 @@
       </w:pPr>
       <w:r>
         <w:rPr>
-          <w:rFonts w:ascii="Apple SD Gothic Neo" w:hAnsi="Apple SD Gothic Neo" w:eastAsia="Apple SD Gothic Neo" w:cs="Apple SD Gothic Neo"/>
+          <w:rFonts w:ascii="AppleGothic" w:hAnsi="AppleGothic" w:eastAsia="AppleGothic" w:cs="AppleGothic"/>
           <w:b/>
           <w:color w:val="14866D"/>
           <w:sz w:val="21"/>
@@ -4128,7 +4150,7 @@
       </w:r>
       <w:r>
         <w:rPr>
-          <w:rFonts w:ascii="Apple SD Gothic Neo" w:hAnsi="Apple SD Gothic Neo" w:eastAsia="Apple SD Gothic Neo" w:cs="Apple SD Gothic Neo"/>
+          <w:rFonts w:ascii="AppleGothic" w:hAnsi="AppleGothic" w:eastAsia="AppleGothic" w:cs="AppleGothic"/>
           <w:color w:val="182433"/>
           <w:sz w:val="21"/>
         </w:rPr>
@@ -4142,7 +4164,7 @@
       </w:pPr>
       <w:r>
         <w:rPr>
-          <w:rFonts w:ascii="Apple SD Gothic Neo" w:hAnsi="Apple SD Gothic Neo" w:eastAsia="Apple SD Gothic Neo" w:cs="Apple SD Gothic Neo"/>
+          <w:rFonts w:ascii="AppleGothic" w:hAnsi="AppleGothic" w:eastAsia="AppleGothic" w:cs="AppleGothic"/>
           <w:color w:val="182433"/>
           <w:sz w:val="20"/>
         </w:rPr>
@@ -4156,7 +4178,7 @@
       </w:pPr>
       <w:r>
         <w:rPr>
-          <w:rFonts w:ascii="Apple SD Gothic Neo" w:hAnsi="Apple SD Gothic Neo" w:eastAsia="Apple SD Gothic Neo" w:cs="Apple SD Gothic Neo"/>
+          <w:rFonts w:ascii="AppleGothic" w:hAnsi="AppleGothic" w:eastAsia="AppleGothic" w:cs="AppleGothic"/>
           <w:color w:val="182433"/>
           <w:sz w:val="20"/>
         </w:rPr>
@@ -4170,7 +4192,7 @@
       </w:pPr>
       <w:r>
         <w:rPr>
-          <w:rFonts w:ascii="Apple SD Gothic Neo" w:hAnsi="Apple SD Gothic Neo" w:eastAsia="Apple SD Gothic Neo" w:cs="Apple SD Gothic Neo"/>
+          <w:rFonts w:ascii="AppleGothic" w:hAnsi="AppleGothic" w:eastAsia="AppleGothic" w:cs="AppleGothic"/>
           <w:color w:val="182433"/>
           <w:sz w:val="20"/>
         </w:rPr>
@@ -4184,7 +4206,7 @@
       </w:pPr>
       <w:r>
         <w:rPr>
-          <w:rFonts w:ascii="Apple SD Gothic Neo" w:hAnsi="Apple SD Gothic Neo" w:eastAsia="Apple SD Gothic Neo" w:cs="Apple SD Gothic Neo"/>
+          <w:rFonts w:ascii="AppleGothic" w:hAnsi="AppleGothic" w:eastAsia="AppleGothic" w:cs="AppleGothic"/>
           <w:b/>
           <w:color w:val="A56A00"/>
           <w:sz w:val="19"/>
@@ -4193,7 +4215,7 @@
       </w:r>
       <w:r>
         <w:rPr>
-          <w:rFonts w:ascii="Apple SD Gothic Neo" w:hAnsi="Apple SD Gothic Neo" w:eastAsia="Apple SD Gothic Neo" w:cs="Apple SD Gothic Neo"/>
+          <w:rFonts w:ascii="AppleGothic" w:hAnsi="AppleGothic" w:eastAsia="AppleGothic" w:cs="AppleGothic"/>
           <w:color w:val="5E7084"/>
           <w:sz w:val="19"/>
         </w:rPr>
@@ -4208,7 +4230,7 @@
       </w:pPr>
       <w:r>
         <w:rPr>
-          <w:rFonts w:ascii="Apple SD Gothic Neo" w:hAnsi="Apple SD Gothic Neo" w:eastAsia="Apple SD Gothic Neo" w:cs="Apple SD Gothic Neo"/>
+          <w:rFonts w:ascii="AppleGothic" w:hAnsi="AppleGothic" w:eastAsia="AppleGothic" w:cs="AppleGothic"/>
           <w:b/>
           <w:color w:val="000000"/>
           <w:sz w:val="40"/>
@@ -4224,7 +4246,7 @@
       </w:pPr>
       <w:r>
         <w:rPr>
-          <w:rFonts w:ascii="Apple SD Gothic Neo" w:hAnsi="Apple SD Gothic Neo" w:eastAsia="Apple SD Gothic Neo" w:cs="Apple SD Gothic Neo"/>
+          <w:rFonts w:ascii="AppleGothic" w:hAnsi="AppleGothic" w:eastAsia="AppleGothic" w:cs="AppleGothic"/>
           <w:b/>
           <w:color w:val="000000"/>
           <w:sz w:val="30"/>
@@ -4238,7 +4260,7 @@
       </w:pPr>
       <w:r>
         <w:rPr>
-          <w:rFonts w:ascii="Apple SD Gothic Neo" w:hAnsi="Apple SD Gothic Neo" w:eastAsia="Apple SD Gothic Neo" w:cs="Apple SD Gothic Neo"/>
+          <w:rFonts w:ascii="AppleGothic" w:hAnsi="AppleGothic" w:eastAsia="AppleGothic" w:cs="AppleGothic"/>
           <w:b/>
           <w:color w:val="246BCE"/>
           <w:sz w:val="21"/>
@@ -4247,7 +4269,7 @@
       </w:r>
       <w:r>
         <w:rPr>
-          <w:rFonts w:ascii="Apple SD Gothic Neo" w:hAnsi="Apple SD Gothic Neo" w:eastAsia="Apple SD Gothic Neo" w:cs="Apple SD Gothic Neo"/>
+          <w:rFonts w:ascii="AppleGothic" w:hAnsi="AppleGothic" w:eastAsia="AppleGothic" w:cs="AppleGothic"/>
           <w:color w:val="182433"/>
           <w:sz w:val="21"/>
         </w:rPr>
@@ -4260,7 +4282,7 @@
       </w:pPr>
       <w:r>
         <w:rPr>
-          <w:rFonts w:ascii="Apple SD Gothic Neo" w:hAnsi="Apple SD Gothic Neo" w:eastAsia="Apple SD Gothic Neo" w:cs="Apple SD Gothic Neo"/>
+          <w:rFonts w:ascii="AppleGothic" w:hAnsi="AppleGothic" w:eastAsia="AppleGothic" w:cs="AppleGothic"/>
           <w:b/>
           <w:color w:val="14866D"/>
           <w:sz w:val="21"/>
@@ -4269,7 +4291,7 @@
       </w:r>
       <w:r>
         <w:rPr>
-          <w:rFonts w:ascii="Apple SD Gothic Neo" w:hAnsi="Apple SD Gothic Neo" w:eastAsia="Apple SD Gothic Neo" w:cs="Apple SD Gothic Neo"/>
+          <w:rFonts w:ascii="AppleGothic" w:hAnsi="AppleGothic" w:eastAsia="AppleGothic" w:cs="AppleGothic"/>
           <w:color w:val="182433"/>
           <w:sz w:val="21"/>
         </w:rPr>
@@ -4283,7 +4305,7 @@
       </w:pPr>
       <w:r>
         <w:rPr>
-          <w:rFonts w:ascii="Apple SD Gothic Neo" w:hAnsi="Apple SD Gothic Neo" w:eastAsia="Apple SD Gothic Neo" w:cs="Apple SD Gothic Neo"/>
+          <w:rFonts w:ascii="AppleGothic" w:hAnsi="AppleGothic" w:eastAsia="AppleGothic" w:cs="AppleGothic"/>
           <w:color w:val="182433"/>
           <w:sz w:val="20"/>
         </w:rPr>
@@ -4297,7 +4319,7 @@
       </w:pPr>
       <w:r>
         <w:rPr>
-          <w:rFonts w:ascii="Apple SD Gothic Neo" w:hAnsi="Apple SD Gothic Neo" w:eastAsia="Apple SD Gothic Neo" w:cs="Apple SD Gothic Neo"/>
+          <w:rFonts w:ascii="AppleGothic" w:hAnsi="AppleGothic" w:eastAsia="AppleGothic" w:cs="AppleGothic"/>
           <w:color w:val="182433"/>
           <w:sz w:val="20"/>
         </w:rPr>
@@ -4311,7 +4333,7 @@
       </w:pPr>
       <w:r>
         <w:rPr>
-          <w:rFonts w:ascii="Apple SD Gothic Neo" w:hAnsi="Apple SD Gothic Neo" w:eastAsia="Apple SD Gothic Neo" w:cs="Apple SD Gothic Neo"/>
+          <w:rFonts w:ascii="AppleGothic" w:hAnsi="AppleGothic" w:eastAsia="AppleGothic" w:cs="AppleGothic"/>
           <w:color w:val="182433"/>
           <w:sz w:val="20"/>
         </w:rPr>
@@ -4324,7 +4346,7 @@
       </w:pPr>
       <w:r>
         <w:rPr>
-          <w:rFonts w:ascii="Apple SD Gothic Neo" w:hAnsi="Apple SD Gothic Neo" w:eastAsia="Apple SD Gothic Neo" w:cs="Apple SD Gothic Neo"/>
+          <w:rFonts w:ascii="AppleGothic" w:hAnsi="AppleGothic" w:eastAsia="AppleGothic" w:cs="AppleGothic"/>
         </w:rPr>
         <w:t>Analysis Runtime의 Kubernetes 정보 수집에서 COMPLETE 또는 PARTIAL 상태와 source별 성공, 실패, 건너뜀, 지연을 확인합니다. PARTIAL이면 실패 source를 확인하고 credential, API 연결 또는 권한을 복구한 뒤 같은 범위를 재분석합니다.</w:t>
       </w:r>
@@ -4360,7 +4382,7 @@
       </w:pPr>
       <w:r>
         <w:rPr>
-          <w:rFonts w:ascii="Apple SD Gothic Neo" w:hAnsi="Apple SD Gothic Neo" w:eastAsia="Apple SD Gothic Neo" w:cs="Apple SD Gothic Neo"/>
+          <w:rFonts w:ascii="AppleGothic" w:hAnsi="AppleGothic" w:eastAsia="AppleGothic" w:cs="AppleGothic"/>
           <w:color w:val="182433"/>
           <w:sz w:val="20"/>
         </w:rPr>
@@ -4374,7 +4396,7 @@
       </w:pPr>
       <w:r>
         <w:rPr>
-          <w:rFonts w:ascii="Apple SD Gothic Neo" w:hAnsi="Apple SD Gothic Neo" w:eastAsia="Apple SD Gothic Neo" w:cs="Apple SD Gothic Neo"/>
+          <w:rFonts w:ascii="AppleGothic" w:hAnsi="AppleGothic" w:eastAsia="AppleGothic" w:cs="AppleGothic"/>
           <w:b/>
           <w:color w:val="A56A00"/>
           <w:sz w:val="19"/>
@@ -4383,7 +4405,7 @@
       </w:r>
       <w:r>
         <w:rPr>
-          <w:rFonts w:ascii="Apple SD Gothic Neo" w:hAnsi="Apple SD Gothic Neo" w:eastAsia="Apple SD Gothic Neo" w:cs="Apple SD Gothic Neo"/>
+          <w:rFonts w:ascii="AppleGothic" w:hAnsi="AppleGothic" w:eastAsia="AppleGothic" w:cs="AppleGothic"/>
           <w:color w:val="5E7084"/>
           <w:sz w:val="19"/>
         </w:rPr>
@@ -4397,7 +4419,7 @@
       </w:pPr>
       <w:r>
         <w:rPr>
-          <w:rFonts w:ascii="Apple SD Gothic Neo" w:hAnsi="Apple SD Gothic Neo" w:eastAsia="Apple SD Gothic Neo" w:cs="Apple SD Gothic Neo"/>
+          <w:rFonts w:ascii="AppleGothic" w:hAnsi="AppleGothic" w:eastAsia="AppleGothic" w:cs="AppleGothic"/>
           <w:b/>
           <w:color w:val="B42318"/>
           <w:sz w:val="19"/>
@@ -4406,7 +4428,7 @@
       </w:r>
       <w:r>
         <w:rPr>
-          <w:rFonts w:ascii="Apple SD Gothic Neo" w:hAnsi="Apple SD Gothic Neo" w:eastAsia="Apple SD Gothic Neo" w:cs="Apple SD Gothic Neo"/>
+          <w:rFonts w:ascii="AppleGothic" w:hAnsi="AppleGothic" w:eastAsia="AppleGothic" w:cs="AppleGothic"/>
           <w:color w:val="5E7084"/>
           <w:sz w:val="19"/>
         </w:rPr>
@@ -4421,7 +4443,7 @@
       </w:pPr>
       <w:r>
         <w:rPr>
-          <w:rFonts w:ascii="Apple SD Gothic Neo" w:hAnsi="Apple SD Gothic Neo" w:eastAsia="Apple SD Gothic Neo" w:cs="Apple SD Gothic Neo"/>
+          <w:rFonts w:ascii="AppleGothic" w:hAnsi="AppleGothic" w:eastAsia="AppleGothic" w:cs="AppleGothic"/>
           <w:b/>
           <w:color w:val="000000"/>
           <w:sz w:val="30"/>
@@ -4435,7 +4457,7 @@
       </w:pPr>
       <w:r>
         <w:rPr>
-          <w:rFonts w:ascii="Apple SD Gothic Neo" w:hAnsi="Apple SD Gothic Neo" w:eastAsia="Apple SD Gothic Neo" w:cs="Apple SD Gothic Neo"/>
+          <w:rFonts w:ascii="AppleGothic" w:hAnsi="AppleGothic" w:eastAsia="AppleGothic" w:cs="AppleGothic"/>
           <w:b/>
           <w:color w:val="246BCE"/>
           <w:sz w:val="21"/>
@@ -4444,7 +4466,7 @@
       </w:r>
       <w:r>
         <w:rPr>
-          <w:rFonts w:ascii="Apple SD Gothic Neo" w:hAnsi="Apple SD Gothic Neo" w:eastAsia="Apple SD Gothic Neo" w:cs="Apple SD Gothic Neo"/>
+          <w:rFonts w:ascii="AppleGothic" w:hAnsi="AppleGothic" w:eastAsia="AppleGothic" w:cs="AppleGothic"/>
           <w:color w:val="182433"/>
           <w:sz w:val="21"/>
         </w:rPr>
@@ -4457,7 +4479,7 @@
       </w:pPr>
       <w:r>
         <w:rPr>
-          <w:rFonts w:ascii="Apple SD Gothic Neo" w:hAnsi="Apple SD Gothic Neo" w:eastAsia="Apple SD Gothic Neo" w:cs="Apple SD Gothic Neo"/>
+          <w:rFonts w:ascii="AppleGothic" w:hAnsi="AppleGothic" w:eastAsia="AppleGothic" w:cs="AppleGothic"/>
           <w:b/>
           <w:color w:val="14866D"/>
           <w:sz w:val="21"/>
@@ -4466,7 +4488,7 @@
       </w:r>
       <w:r>
         <w:rPr>
-          <w:rFonts w:ascii="Apple SD Gothic Neo" w:hAnsi="Apple SD Gothic Neo" w:eastAsia="Apple SD Gothic Neo" w:cs="Apple SD Gothic Neo"/>
+          <w:rFonts w:ascii="AppleGothic" w:hAnsi="AppleGothic" w:eastAsia="AppleGothic" w:cs="AppleGothic"/>
           <w:color w:val="182433"/>
           <w:sz w:val="21"/>
         </w:rPr>
@@ -4480,7 +4502,7 @@
       </w:pPr>
       <w:r>
         <w:rPr>
-          <w:rFonts w:ascii="Apple SD Gothic Neo" w:hAnsi="Apple SD Gothic Neo" w:eastAsia="Apple SD Gothic Neo" w:cs="Apple SD Gothic Neo"/>
+          <w:rFonts w:ascii="AppleGothic" w:hAnsi="AppleGothic" w:eastAsia="AppleGothic" w:cs="AppleGothic"/>
           <w:color w:val="182433"/>
           <w:sz w:val="20"/>
         </w:rPr>
@@ -4494,7 +4516,7 @@
       </w:pPr>
       <w:r>
         <w:rPr>
-          <w:rFonts w:ascii="Apple SD Gothic Neo" w:hAnsi="Apple SD Gothic Neo" w:eastAsia="Apple SD Gothic Neo" w:cs="Apple SD Gothic Neo"/>
+          <w:rFonts w:ascii="AppleGothic" w:hAnsi="AppleGothic" w:eastAsia="AppleGothic" w:cs="AppleGothic"/>
           <w:color w:val="182433"/>
           <w:sz w:val="20"/>
         </w:rPr>
@@ -4508,7 +4530,7 @@
       </w:pPr>
       <w:r>
         <w:rPr>
-          <w:rFonts w:ascii="Apple SD Gothic Neo" w:hAnsi="Apple SD Gothic Neo" w:eastAsia="Apple SD Gothic Neo" w:cs="Apple SD Gothic Neo"/>
+          <w:rFonts w:ascii="AppleGothic" w:hAnsi="AppleGothic" w:eastAsia="AppleGothic" w:cs="AppleGothic"/>
           <w:color w:val="182433"/>
           <w:sz w:val="20"/>
         </w:rPr>
@@ -4522,7 +4544,7 @@
       </w:pPr>
       <w:r>
         <w:rPr>
-          <w:rFonts w:ascii="Apple SD Gothic Neo" w:hAnsi="Apple SD Gothic Neo" w:eastAsia="Apple SD Gothic Neo" w:cs="Apple SD Gothic Neo"/>
+          <w:rFonts w:ascii="AppleGothic" w:hAnsi="AppleGothic" w:eastAsia="AppleGothic" w:cs="AppleGothic"/>
           <w:b/>
           <w:color w:val="A56A00"/>
           <w:sz w:val="19"/>
@@ -4531,7 +4553,7 @@
       </w:r>
       <w:r>
         <w:rPr>
-          <w:rFonts w:ascii="Apple SD Gothic Neo" w:hAnsi="Apple SD Gothic Neo" w:eastAsia="Apple SD Gothic Neo" w:cs="Apple SD Gothic Neo"/>
+          <w:rFonts w:ascii="AppleGothic" w:hAnsi="AppleGothic" w:eastAsia="AppleGothic" w:cs="AppleGothic"/>
           <w:color w:val="5E7084"/>
           <w:sz w:val="19"/>
         </w:rPr>
@@ -4545,7 +4567,7 @@
       </w:pPr>
       <w:r>
         <w:rPr>
-          <w:rFonts w:ascii="Apple SD Gothic Neo" w:hAnsi="Apple SD Gothic Neo" w:eastAsia="Apple SD Gothic Neo" w:cs="Apple SD Gothic Neo"/>
+          <w:rFonts w:ascii="AppleGothic" w:hAnsi="AppleGothic" w:eastAsia="AppleGothic" w:cs="AppleGothic"/>
           <w:b/>
           <w:color w:val="B42318"/>
           <w:sz w:val="19"/>
@@ -4554,7 +4576,7 @@
       </w:r>
       <w:r>
         <w:rPr>
-          <w:rFonts w:ascii="Apple SD Gothic Neo" w:hAnsi="Apple SD Gothic Neo" w:eastAsia="Apple SD Gothic Neo" w:cs="Apple SD Gothic Neo"/>
+          <w:rFonts w:ascii="AppleGothic" w:hAnsi="AppleGothic" w:eastAsia="AppleGothic" w:cs="AppleGothic"/>
           <w:color w:val="5E7084"/>
           <w:sz w:val="19"/>
         </w:rPr>
@@ -4569,7 +4591,7 @@
       </w:pPr>
       <w:r>
         <w:rPr>
-          <w:rFonts w:ascii="Apple SD Gothic Neo" w:hAnsi="Apple SD Gothic Neo" w:eastAsia="Apple SD Gothic Neo" w:cs="Apple SD Gothic Neo"/>
+          <w:rFonts w:ascii="AppleGothic" w:hAnsi="AppleGothic" w:eastAsia="AppleGothic" w:cs="AppleGothic"/>
           <w:b/>
           <w:color w:val="000000"/>
           <w:sz w:val="40"/>
@@ -4585,7 +4607,7 @@
       </w:pPr>
       <w:r>
         <w:rPr>
-          <w:rFonts w:ascii="Apple SD Gothic Neo" w:hAnsi="Apple SD Gothic Neo" w:eastAsia="Apple SD Gothic Neo" w:cs="Apple SD Gothic Neo"/>
+          <w:rFonts w:ascii="AppleGothic" w:hAnsi="AppleGothic" w:eastAsia="AppleGothic" w:cs="AppleGothic"/>
           <w:b/>
           <w:color w:val="000000"/>
           <w:sz w:val="30"/>
@@ -4599,7 +4621,7 @@
       </w:pPr>
       <w:r>
         <w:rPr>
-          <w:rFonts w:ascii="Apple SD Gothic Neo" w:hAnsi="Apple SD Gothic Neo" w:eastAsia="Apple SD Gothic Neo" w:cs="Apple SD Gothic Neo"/>
+          <w:rFonts w:ascii="AppleGothic" w:hAnsi="AppleGothic" w:eastAsia="AppleGothic" w:cs="AppleGothic"/>
           <w:b/>
           <w:color w:val="246BCE"/>
           <w:sz w:val="21"/>
@@ -4608,7 +4630,7 @@
       </w:r>
       <w:r>
         <w:rPr>
-          <w:rFonts w:ascii="Apple SD Gothic Neo" w:hAnsi="Apple SD Gothic Neo" w:eastAsia="Apple SD Gothic Neo" w:cs="Apple SD Gothic Neo"/>
+          <w:rFonts w:ascii="AppleGothic" w:hAnsi="AppleGothic" w:eastAsia="AppleGothic" w:cs="AppleGothic"/>
           <w:color w:val="182433"/>
           <w:sz w:val="21"/>
         </w:rPr>
@@ -4621,7 +4643,7 @@
       </w:pPr>
       <w:r>
         <w:rPr>
-          <w:rFonts w:ascii="Apple SD Gothic Neo" w:hAnsi="Apple SD Gothic Neo" w:eastAsia="Apple SD Gothic Neo" w:cs="Apple SD Gothic Neo"/>
+          <w:rFonts w:ascii="AppleGothic" w:hAnsi="AppleGothic" w:eastAsia="AppleGothic" w:cs="AppleGothic"/>
           <w:b/>
           <w:color w:val="14866D"/>
           <w:sz w:val="21"/>
@@ -4630,7 +4652,7 @@
       </w:r>
       <w:r>
         <w:rPr>
-          <w:rFonts w:ascii="Apple SD Gothic Neo" w:hAnsi="Apple SD Gothic Neo" w:eastAsia="Apple SD Gothic Neo" w:cs="Apple SD Gothic Neo"/>
+          <w:rFonts w:ascii="AppleGothic" w:hAnsi="AppleGothic" w:eastAsia="AppleGothic" w:cs="AppleGothic"/>
           <w:color w:val="182433"/>
           <w:sz w:val="21"/>
         </w:rPr>
@@ -4644,7 +4666,7 @@
       </w:pPr>
       <w:r>
         <w:rPr>
-          <w:rFonts w:ascii="Apple SD Gothic Neo" w:hAnsi="Apple SD Gothic Neo" w:eastAsia="Apple SD Gothic Neo" w:cs="Apple SD Gothic Neo"/>
+          <w:rFonts w:ascii="AppleGothic" w:hAnsi="AppleGothic" w:eastAsia="AppleGothic" w:cs="AppleGothic"/>
           <w:color w:val="182433"/>
           <w:sz w:val="20"/>
         </w:rPr>
@@ -4658,7 +4680,7 @@
       </w:pPr>
       <w:r>
         <w:rPr>
-          <w:rFonts w:ascii="Apple SD Gothic Neo" w:hAnsi="Apple SD Gothic Neo" w:eastAsia="Apple SD Gothic Neo" w:cs="Apple SD Gothic Neo"/>
+          <w:rFonts w:ascii="AppleGothic" w:hAnsi="AppleGothic" w:eastAsia="AppleGothic" w:cs="AppleGothic"/>
           <w:color w:val="182433"/>
           <w:sz w:val="20"/>
         </w:rPr>
@@ -4672,7 +4694,7 @@
       </w:pPr>
       <w:r>
         <w:rPr>
-          <w:rFonts w:ascii="Apple SD Gothic Neo" w:hAnsi="Apple SD Gothic Neo" w:eastAsia="Apple SD Gothic Neo" w:cs="Apple SD Gothic Neo"/>
+          <w:rFonts w:ascii="AppleGothic" w:hAnsi="AppleGothic" w:eastAsia="AppleGothic" w:cs="AppleGothic"/>
           <w:color w:val="182433"/>
           <w:sz w:val="20"/>
         </w:rPr>
@@ -4686,7 +4708,7 @@
       </w:pPr>
       <w:r>
         <w:rPr>
-          <w:rFonts w:ascii="Apple SD Gothic Neo" w:hAnsi="Apple SD Gothic Neo" w:eastAsia="Apple SD Gothic Neo" w:cs="Apple SD Gothic Neo"/>
+          <w:rFonts w:ascii="AppleGothic" w:hAnsi="AppleGothic" w:eastAsia="AppleGothic" w:cs="AppleGothic"/>
           <w:color w:val="182433"/>
           <w:sz w:val="20"/>
         </w:rPr>
@@ -4700,7 +4722,7 @@
       </w:pPr>
       <w:r>
         <w:rPr>
-          <w:rFonts w:ascii="Apple SD Gothic Neo" w:hAnsi="Apple SD Gothic Neo" w:eastAsia="Apple SD Gothic Neo" w:cs="Apple SD Gothic Neo"/>
+          <w:rFonts w:ascii="AppleGothic" w:hAnsi="AppleGothic" w:eastAsia="AppleGothic" w:cs="AppleGothic"/>
           <w:color w:val="182433"/>
           <w:sz w:val="20"/>
         </w:rPr>
@@ -4714,7 +4736,7 @@
       </w:pPr>
       <w:r>
         <w:rPr>
-          <w:rFonts w:ascii="Apple SD Gothic Neo" w:hAnsi="Apple SD Gothic Neo" w:eastAsia="Apple SD Gothic Neo" w:cs="Apple SD Gothic Neo"/>
+          <w:rFonts w:ascii="AppleGothic" w:hAnsi="AppleGothic" w:eastAsia="AppleGothic" w:cs="AppleGothic"/>
           <w:color w:val="182433"/>
           <w:sz w:val="20"/>
         </w:rPr>
@@ -4728,7 +4750,7 @@
       </w:pPr>
       <w:r>
         <w:rPr>
-          <w:rFonts w:ascii="Apple SD Gothic Neo" w:hAnsi="Apple SD Gothic Neo" w:eastAsia="Apple SD Gothic Neo" w:cs="Apple SD Gothic Neo"/>
+          <w:rFonts w:ascii="AppleGothic" w:hAnsi="AppleGothic" w:eastAsia="AppleGothic" w:cs="AppleGothic"/>
           <w:b/>
           <w:color w:val="A56A00"/>
           <w:sz w:val="19"/>
@@ -4737,7 +4759,7 @@
       </w:r>
       <w:r>
         <w:rPr>
-          <w:rFonts w:ascii="Apple SD Gothic Neo" w:hAnsi="Apple SD Gothic Neo" w:eastAsia="Apple SD Gothic Neo" w:cs="Apple SD Gothic Neo"/>
+          <w:rFonts w:ascii="AppleGothic" w:hAnsi="AppleGothic" w:eastAsia="AppleGothic" w:cs="AppleGothic"/>
           <w:color w:val="5E7084"/>
           <w:sz w:val="19"/>
         </w:rPr>
@@ -4751,7 +4773,7 @@
       </w:pPr>
       <w:r>
         <w:rPr>
-          <w:rFonts w:ascii="Apple SD Gothic Neo" w:hAnsi="Apple SD Gothic Neo" w:eastAsia="Apple SD Gothic Neo" w:cs="Apple SD Gothic Neo"/>
+          <w:rFonts w:ascii="AppleGothic" w:hAnsi="AppleGothic" w:eastAsia="AppleGothic" w:cs="AppleGothic"/>
           <w:b/>
           <w:color w:val="B42318"/>
           <w:sz w:val="19"/>
@@ -4760,7 +4782,7 @@
       </w:r>
       <w:r>
         <w:rPr>
-          <w:rFonts w:ascii="Apple SD Gothic Neo" w:hAnsi="Apple SD Gothic Neo" w:eastAsia="Apple SD Gothic Neo" w:cs="Apple SD Gothic Neo"/>
+          <w:rFonts w:ascii="AppleGothic" w:hAnsi="AppleGothic" w:eastAsia="AppleGothic" w:cs="AppleGothic"/>
           <w:color w:val="5E7084"/>
           <w:sz w:val="19"/>
         </w:rPr>
@@ -4775,7 +4797,7 @@
       </w:pPr>
       <w:r>
         <w:rPr>
-          <w:rFonts w:ascii="Apple SD Gothic Neo" w:hAnsi="Apple SD Gothic Neo" w:eastAsia="Apple SD Gothic Neo" w:cs="Apple SD Gothic Neo"/>
+          <w:rFonts w:ascii="AppleGothic" w:hAnsi="AppleGothic" w:eastAsia="AppleGothic" w:cs="AppleGothic"/>
           <w:b/>
           <w:color w:val="000000"/>
           <w:sz w:val="30"/>
@@ -4789,7 +4811,7 @@
       </w:pPr>
       <w:r>
         <w:rPr>
-          <w:rFonts w:ascii="Apple SD Gothic Neo" w:hAnsi="Apple SD Gothic Neo" w:eastAsia="Apple SD Gothic Neo" w:cs="Apple SD Gothic Neo"/>
+          <w:rFonts w:ascii="AppleGothic" w:hAnsi="AppleGothic" w:eastAsia="AppleGothic" w:cs="AppleGothic"/>
           <w:b/>
           <w:color w:val="246BCE"/>
           <w:sz w:val="21"/>
@@ -4798,7 +4820,7 @@
       </w:r>
       <w:r>
         <w:rPr>
-          <w:rFonts w:ascii="Apple SD Gothic Neo" w:hAnsi="Apple SD Gothic Neo" w:eastAsia="Apple SD Gothic Neo" w:cs="Apple SD Gothic Neo"/>
+          <w:rFonts w:ascii="AppleGothic" w:hAnsi="AppleGothic" w:eastAsia="AppleGothic" w:cs="AppleGothic"/>
           <w:color w:val="182433"/>
           <w:sz w:val="21"/>
         </w:rPr>
@@ -4811,7 +4833,7 @@
       </w:pPr>
       <w:r>
         <w:rPr>
-          <w:rFonts w:ascii="Apple SD Gothic Neo" w:hAnsi="Apple SD Gothic Neo" w:eastAsia="Apple SD Gothic Neo" w:cs="Apple SD Gothic Neo"/>
+          <w:rFonts w:ascii="AppleGothic" w:hAnsi="AppleGothic" w:eastAsia="AppleGothic" w:cs="AppleGothic"/>
           <w:b/>
           <w:color w:val="14866D"/>
           <w:sz w:val="21"/>
@@ -4820,7 +4842,7 @@
       </w:r>
       <w:r>
         <w:rPr>
-          <w:rFonts w:ascii="Apple SD Gothic Neo" w:hAnsi="Apple SD Gothic Neo" w:eastAsia="Apple SD Gothic Neo" w:cs="Apple SD Gothic Neo"/>
+          <w:rFonts w:ascii="AppleGothic" w:hAnsi="AppleGothic" w:eastAsia="AppleGothic" w:cs="AppleGothic"/>
           <w:color w:val="182433"/>
           <w:sz w:val="21"/>
         </w:rPr>
@@ -4834,7 +4856,7 @@
       </w:pPr>
       <w:r>
         <w:rPr>
-          <w:rFonts w:ascii="Apple SD Gothic Neo" w:hAnsi="Apple SD Gothic Neo" w:eastAsia="Apple SD Gothic Neo" w:cs="Apple SD Gothic Neo"/>
+          <w:rFonts w:ascii="AppleGothic" w:hAnsi="AppleGothic" w:eastAsia="AppleGothic" w:cs="AppleGothic"/>
           <w:color w:val="182433"/>
           <w:sz w:val="20"/>
         </w:rPr>
@@ -4848,7 +4870,7 @@
       </w:pPr>
       <w:r>
         <w:rPr>
-          <w:rFonts w:ascii="Apple SD Gothic Neo" w:hAnsi="Apple SD Gothic Neo" w:eastAsia="Apple SD Gothic Neo" w:cs="Apple SD Gothic Neo"/>
+          <w:rFonts w:ascii="AppleGothic" w:hAnsi="AppleGothic" w:eastAsia="AppleGothic" w:cs="AppleGothic"/>
           <w:color w:val="182433"/>
           <w:sz w:val="20"/>
         </w:rPr>
@@ -4862,7 +4884,7 @@
       </w:pPr>
       <w:r>
         <w:rPr>
-          <w:rFonts w:ascii="Apple SD Gothic Neo" w:hAnsi="Apple SD Gothic Neo" w:eastAsia="Apple SD Gothic Neo" w:cs="Apple SD Gothic Neo"/>
+          <w:rFonts w:ascii="AppleGothic" w:hAnsi="AppleGothic" w:eastAsia="AppleGothic" w:cs="AppleGothic"/>
           <w:color w:val="182433"/>
           <w:sz w:val="20"/>
         </w:rPr>
@@ -4876,7 +4898,7 @@
       </w:pPr>
       <w:r>
         <w:rPr>
-          <w:rFonts w:ascii="Apple SD Gothic Neo" w:hAnsi="Apple SD Gothic Neo" w:eastAsia="Apple SD Gothic Neo" w:cs="Apple SD Gothic Neo"/>
+          <w:rFonts w:ascii="AppleGothic" w:hAnsi="AppleGothic" w:eastAsia="AppleGothic" w:cs="AppleGothic"/>
           <w:b/>
           <w:color w:val="A56A00"/>
           <w:sz w:val="19"/>
@@ -4885,7 +4907,7 @@
       </w:r>
       <w:r>
         <w:rPr>
-          <w:rFonts w:ascii="Apple SD Gothic Neo" w:hAnsi="Apple SD Gothic Neo" w:eastAsia="Apple SD Gothic Neo" w:cs="Apple SD Gothic Neo"/>
+          <w:rFonts w:ascii="AppleGothic" w:hAnsi="AppleGothic" w:eastAsia="AppleGothic" w:cs="AppleGothic"/>
           <w:color w:val="5E7084"/>
           <w:sz w:val="19"/>
         </w:rPr>
@@ -4900,7 +4922,7 @@
       </w:pPr>
       <w:r>
         <w:rPr>
-          <w:rFonts w:ascii="Apple SD Gothic Neo" w:hAnsi="Apple SD Gothic Neo" w:eastAsia="Apple SD Gothic Neo" w:cs="Apple SD Gothic Neo"/>
+          <w:rFonts w:ascii="AppleGothic" w:hAnsi="AppleGothic" w:eastAsia="AppleGothic" w:cs="AppleGothic"/>
           <w:b/>
           <w:color w:val="000000"/>
           <w:sz w:val="40"/>
@@ -4916,7 +4938,7 @@
       </w:pPr>
       <w:r>
         <w:rPr>
-          <w:rFonts w:ascii="Apple SD Gothic Neo" w:hAnsi="Apple SD Gothic Neo" w:eastAsia="Apple SD Gothic Neo" w:cs="Apple SD Gothic Neo"/>
+          <w:rFonts w:ascii="AppleGothic" w:hAnsi="AppleGothic" w:eastAsia="AppleGothic" w:cs="AppleGothic"/>
           <w:b/>
           <w:color w:val="000000"/>
           <w:sz w:val="30"/>
@@ -4930,7 +4952,7 @@
       </w:pPr>
       <w:r>
         <w:rPr>
-          <w:rFonts w:ascii="Apple SD Gothic Neo" w:hAnsi="Apple SD Gothic Neo" w:eastAsia="Apple SD Gothic Neo" w:cs="Apple SD Gothic Neo"/>
+          <w:rFonts w:ascii="AppleGothic" w:hAnsi="AppleGothic" w:eastAsia="AppleGothic" w:cs="AppleGothic"/>
           <w:b/>
           <w:color w:val="246BCE"/>
           <w:sz w:val="21"/>
@@ -4939,7 +4961,7 @@
       </w:r>
       <w:r>
         <w:rPr>
-          <w:rFonts w:ascii="Apple SD Gothic Neo" w:hAnsi="Apple SD Gothic Neo" w:eastAsia="Apple SD Gothic Neo" w:cs="Apple SD Gothic Neo"/>
+          <w:rFonts w:ascii="AppleGothic" w:hAnsi="AppleGothic" w:eastAsia="AppleGothic" w:cs="AppleGothic"/>
           <w:color w:val="182433"/>
           <w:sz w:val="21"/>
         </w:rPr>
@@ -4952,7 +4974,7 @@
       </w:pPr>
       <w:r>
         <w:rPr>
-          <w:rFonts w:ascii="Apple SD Gothic Neo" w:hAnsi="Apple SD Gothic Neo" w:eastAsia="Apple SD Gothic Neo" w:cs="Apple SD Gothic Neo"/>
+          <w:rFonts w:ascii="AppleGothic" w:hAnsi="AppleGothic" w:eastAsia="AppleGothic" w:cs="AppleGothic"/>
           <w:b/>
           <w:color w:val="14866D"/>
           <w:sz w:val="21"/>
@@ -4961,7 +4983,7 @@
       </w:r>
       <w:r>
         <w:rPr>
-          <w:rFonts w:ascii="Apple SD Gothic Neo" w:hAnsi="Apple SD Gothic Neo" w:eastAsia="Apple SD Gothic Neo" w:cs="Apple SD Gothic Neo"/>
+          <w:rFonts w:ascii="AppleGothic" w:hAnsi="AppleGothic" w:eastAsia="AppleGothic" w:cs="AppleGothic"/>
           <w:color w:val="182433"/>
           <w:sz w:val="21"/>
         </w:rPr>
@@ -4975,7 +4997,7 @@
       </w:pPr>
       <w:r>
         <w:rPr>
-          <w:rFonts w:ascii="Apple SD Gothic Neo" w:hAnsi="Apple SD Gothic Neo" w:eastAsia="Apple SD Gothic Neo" w:cs="Apple SD Gothic Neo"/>
+          <w:rFonts w:ascii="AppleGothic" w:hAnsi="AppleGothic" w:eastAsia="AppleGothic" w:cs="AppleGothic"/>
           <w:color w:val="182433"/>
           <w:sz w:val="20"/>
         </w:rPr>
@@ -4989,7 +5011,7 @@
       </w:pPr>
       <w:r>
         <w:rPr>
-          <w:rFonts w:ascii="Apple SD Gothic Neo" w:hAnsi="Apple SD Gothic Neo" w:eastAsia="Apple SD Gothic Neo" w:cs="Apple SD Gothic Neo"/>
+          <w:rFonts w:ascii="AppleGothic" w:hAnsi="AppleGothic" w:eastAsia="AppleGothic" w:cs="AppleGothic"/>
           <w:color w:val="182433"/>
           <w:sz w:val="20"/>
         </w:rPr>
@@ -5003,7 +5025,7 @@
       </w:pPr>
       <w:r>
         <w:rPr>
-          <w:rFonts w:ascii="Apple SD Gothic Neo" w:hAnsi="Apple SD Gothic Neo" w:eastAsia="Apple SD Gothic Neo" w:cs="Apple SD Gothic Neo"/>
+          <w:rFonts w:ascii="AppleGothic" w:hAnsi="AppleGothic" w:eastAsia="AppleGothic" w:cs="AppleGothic"/>
           <w:color w:val="182433"/>
           <w:sz w:val="20"/>
         </w:rPr>
@@ -5017,7 +5039,7 @@
       </w:pPr>
       <w:r>
         <w:rPr>
-          <w:rFonts w:ascii="Apple SD Gothic Neo" w:hAnsi="Apple SD Gothic Neo" w:eastAsia="Apple SD Gothic Neo" w:cs="Apple SD Gothic Neo"/>
+          <w:rFonts w:ascii="AppleGothic" w:hAnsi="AppleGothic" w:eastAsia="AppleGothic" w:cs="AppleGothic"/>
           <w:b/>
           <w:color w:val="A56A00"/>
           <w:sz w:val="19"/>
@@ -5026,7 +5048,7 @@
       </w:r>
       <w:r>
         <w:rPr>
-          <w:rFonts w:ascii="Apple SD Gothic Neo" w:hAnsi="Apple SD Gothic Neo" w:eastAsia="Apple SD Gothic Neo" w:cs="Apple SD Gothic Neo"/>
+          <w:rFonts w:ascii="AppleGothic" w:hAnsi="AppleGothic" w:eastAsia="AppleGothic" w:cs="AppleGothic"/>
           <w:color w:val="5E7084"/>
           <w:sz w:val="19"/>
         </w:rPr>
@@ -5041,7 +5063,7 @@
       </w:pPr>
       <w:r>
         <w:rPr>
-          <w:rFonts w:ascii="Apple SD Gothic Neo" w:hAnsi="Apple SD Gothic Neo" w:eastAsia="Apple SD Gothic Neo" w:cs="Apple SD Gothic Neo"/>
+          <w:rFonts w:ascii="AppleGothic" w:hAnsi="AppleGothic" w:eastAsia="AppleGothic" w:cs="AppleGothic"/>
           <w:b/>
           <w:color w:val="000000"/>
           <w:sz w:val="30"/>
@@ -5055,7 +5077,7 @@
       </w:pPr>
       <w:r>
         <w:rPr>
-          <w:rFonts w:ascii="Apple SD Gothic Neo" w:hAnsi="Apple SD Gothic Neo" w:eastAsia="Apple SD Gothic Neo" w:cs="Apple SD Gothic Neo"/>
+          <w:rFonts w:ascii="AppleGothic" w:hAnsi="AppleGothic" w:eastAsia="AppleGothic" w:cs="AppleGothic"/>
           <w:b/>
           <w:color w:val="246BCE"/>
           <w:sz w:val="21"/>
@@ -5064,7 +5086,7 @@
       </w:r>
       <w:r>
         <w:rPr>
-          <w:rFonts w:ascii="Apple SD Gothic Neo" w:hAnsi="Apple SD Gothic Neo" w:eastAsia="Apple SD Gothic Neo" w:cs="Apple SD Gothic Neo"/>
+          <w:rFonts w:ascii="AppleGothic" w:hAnsi="AppleGothic" w:eastAsia="AppleGothic" w:cs="AppleGothic"/>
           <w:color w:val="182433"/>
           <w:sz w:val="21"/>
         </w:rPr>
@@ -5077,7 +5099,7 @@
       </w:pPr>
       <w:r>
         <w:rPr>
-          <w:rFonts w:ascii="Apple SD Gothic Neo" w:hAnsi="Apple SD Gothic Neo" w:eastAsia="Apple SD Gothic Neo" w:cs="Apple SD Gothic Neo"/>
+          <w:rFonts w:ascii="AppleGothic" w:hAnsi="AppleGothic" w:eastAsia="AppleGothic" w:cs="AppleGothic"/>
           <w:b/>
           <w:color w:val="14866D"/>
           <w:sz w:val="21"/>
@@ -5086,7 +5108,7 @@
       </w:r>
       <w:r>
         <w:rPr>
-          <w:rFonts w:ascii="Apple SD Gothic Neo" w:hAnsi="Apple SD Gothic Neo" w:eastAsia="Apple SD Gothic Neo" w:cs="Apple SD Gothic Neo"/>
+          <w:rFonts w:ascii="AppleGothic" w:hAnsi="AppleGothic" w:eastAsia="AppleGothic" w:cs="AppleGothic"/>
           <w:color w:val="182433"/>
           <w:sz w:val="21"/>
         </w:rPr>
@@ -5100,7 +5122,7 @@
       </w:pPr>
       <w:r>
         <w:rPr>
-          <w:rFonts w:ascii="Apple SD Gothic Neo" w:hAnsi="Apple SD Gothic Neo" w:eastAsia="Apple SD Gothic Neo" w:cs="Apple SD Gothic Neo"/>
+          <w:rFonts w:ascii="AppleGothic" w:hAnsi="AppleGothic" w:eastAsia="AppleGothic" w:cs="AppleGothic"/>
           <w:color w:val="182433"/>
           <w:sz w:val="20"/>
         </w:rPr>
@@ -5113,7 +5135,7 @@
       </w:pPr>
       <w:r>
         <w:rPr>
-          <w:rFonts w:ascii="Apple SD Gothic Neo" w:hAnsi="Apple SD Gothic Neo" w:eastAsia="Apple SD Gothic Neo" w:cs="Apple SD Gothic Neo"/>
+          <w:rFonts w:ascii="AppleGothic" w:hAnsi="AppleGothic" w:eastAsia="AppleGothic" w:cs="AppleGothic"/>
         </w:rPr>
         <w:t>Audit log와 완료된 Command execution 보관 기간도 설정할 수 있습니다. 미리보기에서 삭제 건수를 확인한 뒤 정리를 실행하며, 실행 중인 명령과 Kubernetes 실제 리소스는 삭제하지 않습니다.</w:t>
       </w:r>
@@ -5125,7 +5147,7 @@
       </w:pPr>
       <w:r>
         <w:rPr>
-          <w:rFonts w:ascii="Apple SD Gothic Neo" w:hAnsi="Apple SD Gothic Neo" w:eastAsia="Apple SD Gothic Neo" w:cs="Apple SD Gothic Neo"/>
+          <w:rFonts w:ascii="AppleGothic" w:hAnsi="AppleGothic" w:eastAsia="AppleGothic" w:cs="AppleGothic"/>
           <w:color w:val="182433"/>
           <w:sz w:val="20"/>
         </w:rPr>
@@ -5139,7 +5161,7 @@
       </w:pPr>
       <w:r>
         <w:rPr>
-          <w:rFonts w:ascii="Apple SD Gothic Neo" w:hAnsi="Apple SD Gothic Neo" w:eastAsia="Apple SD Gothic Neo" w:cs="Apple SD Gothic Neo"/>
+          <w:rFonts w:ascii="AppleGothic" w:hAnsi="AppleGothic" w:eastAsia="AppleGothic" w:cs="AppleGothic"/>
           <w:color w:val="182433"/>
           <w:sz w:val="20"/>
         </w:rPr>
@@ -5153,7 +5175,7 @@
       </w:pPr>
       <w:r>
         <w:rPr>
-          <w:rFonts w:ascii="Apple SD Gothic Neo" w:hAnsi="Apple SD Gothic Neo" w:eastAsia="Apple SD Gothic Neo" w:cs="Apple SD Gothic Neo"/>
+          <w:rFonts w:ascii="AppleGothic" w:hAnsi="AppleGothic" w:eastAsia="AppleGothic" w:cs="AppleGothic"/>
           <w:color w:val="182433"/>
           <w:sz w:val="20"/>
         </w:rPr>
@@ -5167,7 +5189,7 @@
       </w:pPr>
       <w:r>
         <w:rPr>
-          <w:rFonts w:ascii="Apple SD Gothic Neo" w:hAnsi="Apple SD Gothic Neo" w:eastAsia="Apple SD Gothic Neo" w:cs="Apple SD Gothic Neo"/>
+          <w:rFonts w:ascii="AppleGothic" w:hAnsi="AppleGothic" w:eastAsia="AppleGothic" w:cs="AppleGothic"/>
           <w:b/>
           <w:color w:val="A56A00"/>
           <w:sz w:val="19"/>
@@ -5176,7 +5198,7 @@
       </w:r>
       <w:r>
         <w:rPr>
-          <w:rFonts w:ascii="Apple SD Gothic Neo" w:hAnsi="Apple SD Gothic Neo" w:eastAsia="Apple SD Gothic Neo" w:cs="Apple SD Gothic Neo"/>
+          <w:rFonts w:ascii="AppleGothic" w:hAnsi="AppleGothic" w:eastAsia="AppleGothic" w:cs="AppleGothic"/>
           <w:color w:val="5E7084"/>
           <w:sz w:val="19"/>
         </w:rPr>
@@ -5190,7 +5212,7 @@
       </w:pPr>
       <w:r>
         <w:rPr>
-          <w:rFonts w:ascii="Apple SD Gothic Neo" w:hAnsi="Apple SD Gothic Neo" w:eastAsia="Apple SD Gothic Neo" w:cs="Apple SD Gothic Neo"/>
+          <w:rFonts w:ascii="AppleGothic" w:hAnsi="AppleGothic" w:eastAsia="AppleGothic" w:cs="AppleGothic"/>
           <w:b/>
           <w:color w:val="B42318"/>
           <w:sz w:val="19"/>
@@ -5199,7 +5221,7 @@
       </w:r>
       <w:r>
         <w:rPr>
-          <w:rFonts w:ascii="Apple SD Gothic Neo" w:hAnsi="Apple SD Gothic Neo" w:eastAsia="Apple SD Gothic Neo" w:cs="Apple SD Gothic Neo"/>
+          <w:rFonts w:ascii="AppleGothic" w:hAnsi="AppleGothic" w:eastAsia="AppleGothic" w:cs="AppleGothic"/>
           <w:color w:val="5E7084"/>
           <w:sz w:val="19"/>
         </w:rPr>
@@ -5214,7 +5236,7 @@
       </w:pPr>
       <w:r>
         <w:rPr>
-          <w:rFonts w:ascii="Apple SD Gothic Neo" w:hAnsi="Apple SD Gothic Neo" w:eastAsia="Apple SD Gothic Neo" w:cs="Apple SD Gothic Neo"/>
+          <w:rFonts w:ascii="AppleGothic" w:hAnsi="AppleGothic" w:eastAsia="AppleGothic" w:cs="AppleGothic"/>
           <w:b/>
           <w:color w:val="000000"/>
           <w:sz w:val="30"/>
@@ -5228,7 +5250,7 @@
       </w:pPr>
       <w:r>
         <w:rPr>
-          <w:rFonts w:ascii="Apple SD Gothic Neo" w:hAnsi="Apple SD Gothic Neo" w:eastAsia="Apple SD Gothic Neo" w:cs="Apple SD Gothic Neo"/>
+          <w:rFonts w:ascii="AppleGothic" w:hAnsi="AppleGothic" w:eastAsia="AppleGothic" w:cs="AppleGothic"/>
           <w:b/>
           <w:color w:val="246BCE"/>
           <w:sz w:val="21"/>
@@ -5237,7 +5259,7 @@
       </w:r>
       <w:r>
         <w:rPr>
-          <w:rFonts w:ascii="Apple SD Gothic Neo" w:hAnsi="Apple SD Gothic Neo" w:eastAsia="Apple SD Gothic Neo" w:cs="Apple SD Gothic Neo"/>
+          <w:rFonts w:ascii="AppleGothic" w:hAnsi="AppleGothic" w:eastAsia="AppleGothic" w:cs="AppleGothic"/>
           <w:color w:val="182433"/>
           <w:sz w:val="21"/>
         </w:rPr>
@@ -5250,7 +5272,7 @@
       </w:pPr>
       <w:r>
         <w:rPr>
-          <w:rFonts w:ascii="Apple SD Gothic Neo" w:hAnsi="Apple SD Gothic Neo" w:eastAsia="Apple SD Gothic Neo" w:cs="Apple SD Gothic Neo"/>
+          <w:rFonts w:ascii="AppleGothic" w:hAnsi="AppleGothic" w:eastAsia="AppleGothic" w:cs="AppleGothic"/>
           <w:b/>
           <w:color w:val="14866D"/>
           <w:sz w:val="21"/>
@@ -5259,7 +5281,7 @@
       </w:r>
       <w:r>
         <w:rPr>
-          <w:rFonts w:ascii="Apple SD Gothic Neo" w:hAnsi="Apple SD Gothic Neo" w:eastAsia="Apple SD Gothic Neo" w:cs="Apple SD Gothic Neo"/>
+          <w:rFonts w:ascii="AppleGothic" w:hAnsi="AppleGothic" w:eastAsia="AppleGothic" w:cs="AppleGothic"/>
           <w:color w:val="182433"/>
           <w:sz w:val="21"/>
         </w:rPr>
@@ -5273,7 +5295,7 @@
       </w:pPr>
       <w:r>
         <w:rPr>
-          <w:rFonts w:ascii="Apple SD Gothic Neo" w:hAnsi="Apple SD Gothic Neo" w:eastAsia="Apple SD Gothic Neo" w:cs="Apple SD Gothic Neo"/>
+          <w:rFonts w:ascii="AppleGothic" w:hAnsi="AppleGothic" w:eastAsia="AppleGothic" w:cs="AppleGothic"/>
           <w:color w:val="182433"/>
           <w:sz w:val="20"/>
         </w:rPr>
@@ -5287,7 +5309,7 @@
       </w:pPr>
       <w:r>
         <w:rPr>
-          <w:rFonts w:ascii="Apple SD Gothic Neo" w:hAnsi="Apple SD Gothic Neo" w:eastAsia="Apple SD Gothic Neo" w:cs="Apple SD Gothic Neo"/>
+          <w:rFonts w:ascii="AppleGothic" w:hAnsi="AppleGothic" w:eastAsia="AppleGothic" w:cs="AppleGothic"/>
           <w:color w:val="182433"/>
           <w:sz w:val="20"/>
         </w:rPr>
@@ -5301,7 +5323,7 @@
       </w:pPr>
       <w:r>
         <w:rPr>
-          <w:rFonts w:ascii="Apple SD Gothic Neo" w:hAnsi="Apple SD Gothic Neo" w:eastAsia="Apple SD Gothic Neo" w:cs="Apple SD Gothic Neo"/>
+          <w:rFonts w:ascii="AppleGothic" w:hAnsi="AppleGothic" w:eastAsia="AppleGothic" w:cs="AppleGothic"/>
           <w:color w:val="182433"/>
           <w:sz w:val="20"/>
         </w:rPr>
@@ -5315,7 +5337,7 @@
       </w:pPr>
       <w:r>
         <w:rPr>
-          <w:rFonts w:ascii="Apple SD Gothic Neo" w:hAnsi="Apple SD Gothic Neo" w:eastAsia="Apple SD Gothic Neo" w:cs="Apple SD Gothic Neo"/>
+          <w:rFonts w:ascii="AppleGothic" w:hAnsi="AppleGothic" w:eastAsia="AppleGothic" w:cs="AppleGothic"/>
           <w:b/>
           <w:color w:val="A56A00"/>
           <w:sz w:val="19"/>
@@ -5324,7 +5346,7 @@
       </w:r>
       <w:r>
         <w:rPr>
-          <w:rFonts w:ascii="Apple SD Gothic Neo" w:hAnsi="Apple SD Gothic Neo" w:eastAsia="Apple SD Gothic Neo" w:cs="Apple SD Gothic Neo"/>
+          <w:rFonts w:ascii="AppleGothic" w:hAnsi="AppleGothic" w:eastAsia="AppleGothic" w:cs="AppleGothic"/>
           <w:color w:val="5E7084"/>
           <w:sz w:val="19"/>
         </w:rPr>
@@ -5339,7 +5361,7 @@
       </w:pPr>
       <w:r>
         <w:rPr>
-          <w:rFonts w:ascii="Apple SD Gothic Neo" w:hAnsi="Apple SD Gothic Neo" w:eastAsia="Apple SD Gothic Neo" w:cs="Apple SD Gothic Neo"/>
+          <w:rFonts w:ascii="AppleGothic" w:hAnsi="AppleGothic" w:eastAsia="AppleGothic" w:cs="AppleGothic"/>
           <w:b/>
           <w:color w:val="000000"/>
           <w:sz w:val="40"/>
@@ -5353,7 +5375,7 @@
       </w:pPr>
       <w:r>
         <w:rPr>
-          <w:rFonts w:ascii="Apple SD Gothic Neo" w:hAnsi="Apple SD Gothic Neo" w:eastAsia="Apple SD Gothic Neo" w:cs="Apple SD Gothic Neo"/>
+          <w:rFonts w:ascii="AppleGothic" w:hAnsi="AppleGothic" w:eastAsia="AppleGothic" w:cs="AppleGothic"/>
         </w:rPr>
         <w:t>AI Provider와 Local Models</w:t>
       </w:r>
@@ -5362,7 +5384,7 @@
       <w:pPr/>
       <w:r>
         <w:rPr>
-          <w:rFonts w:ascii="Apple SD Gothic Neo" w:hAnsi="Apple SD Gothic Neo" w:eastAsia="Apple SD Gothic Neo" w:cs="Apple SD Gothic Neo"/>
+          <w:rFonts w:ascii="AppleGothic" w:hAnsi="AppleGothic" w:eastAsia="AppleGothic" w:cs="AppleGothic"/>
         </w:rPr>
         <w:t>목적  Local Ollama와 선택형 외부 LLM 연결, 모델과 Tenant 목적별 사용 경로를 관리합니다.</w:t>
       </w:r>
@@ -5371,7 +5393,7 @@
       <w:pPr/>
       <w:r>
         <w:rPr>
-          <w:rFonts w:ascii="Apple SD Gothic Neo" w:hAnsi="Apple SD Gothic Neo" w:eastAsia="Apple SD Gothic Neo" w:cs="Apple SD Gothic Neo"/>
+          <w:rFonts w:ascii="AppleGothic" w:hAnsi="AppleGothic" w:eastAsia="AppleGothic" w:cs="AppleGothic"/>
         </w:rPr>
         <w:t>사용 시점  AI Analysis, AI Chat과 Helm Values 제안에 사용할 Provider나 모델을 변경할 때 사용합니다.</w:t>
       </w:r>
@@ -5382,7 +5404,7 @@
       </w:pPr>
       <w:r>
         <w:rPr>
-          <w:rFonts w:ascii="Apple SD Gothic Neo" w:hAnsi="Apple SD Gothic Neo" w:eastAsia="Apple SD Gothic Neo" w:cs="Apple SD Gothic Neo"/>
+          <w:rFonts w:ascii="AppleGothic" w:hAnsi="AppleGothic" w:eastAsia="AppleGothic" w:cs="AppleGothic"/>
         </w:rPr>
         <w:t>Platform Manager는 Provider profile과 credential을 등록하고 연결을 검증합니다.</w:t>
       </w:r>
@@ -5393,7 +5415,7 @@
       </w:pPr>
       <w:r>
         <w:rPr>
-          <w:rFonts w:ascii="Apple SD Gothic Neo" w:hAnsi="Apple SD Gothic Neo" w:eastAsia="Apple SD Gothic Neo" w:cs="Apple SD Gothic Neo"/>
+          <w:rFonts w:ascii="AppleGothic" w:hAnsi="AppleGothic" w:eastAsia="AppleGothic" w:cs="AppleGothic"/>
         </w:rPr>
         <w:t>Tenant 관리자는 허용된 profile/model을 목적별로 선택하고 외부 전송 여부를 명시적으로 설정합니다.</w:t>
       </w:r>
@@ -5404,7 +5426,7 @@
       </w:pPr>
       <w:r>
         <w:rPr>
-          <w:rFonts w:ascii="Apple SD Gothic Neo" w:hAnsi="Apple SD Gothic Neo" w:eastAsia="Apple SD Gothic Neo" w:cs="Apple SD Gothic Neo"/>
+          <w:rFonts w:ascii="AppleGothic" w:hAnsi="AppleGothic" w:eastAsia="AppleGothic" w:cs="AppleGothic"/>
         </w:rPr>
         <w:t>Local Models에서는 Ollama 설치 모델을 동기화하고 승인 목록의 9B 이하 모델만 추가합니다.</w:t>
       </w:r>
@@ -5415,7 +5437,7 @@
       </w:pPr>
       <w:r>
         <w:rPr>
-          <w:rFonts w:ascii="Apple SD Gothic Neo" w:hAnsi="Apple SD Gothic Neo" w:eastAsia="Apple SD Gothic Neo" w:cs="Apple SD Gothic Neo"/>
+          <w:rFonts w:ascii="AppleGothic" w:hAnsi="AppleGothic" w:eastAsia="AppleGothic" w:cs="AppleGothic"/>
         </w:rPr>
         <w:t>API key와 credential은 저장 후 다시 표시하지 않으며 화면과 로그에서 마스킹합니다.</w:t>
       </w:r>
@@ -5424,7 +5446,7 @@
       <w:pPr/>
       <w:r>
         <w:rPr>
-          <w:rFonts w:ascii="Apple SD Gothic Neo" w:hAnsi="Apple SD Gothic Neo" w:eastAsia="Apple SD Gothic Neo" w:cs="Apple SD Gothic Neo"/>
+          <w:rFonts w:ascii="AppleGothic" w:hAnsi="AppleGothic" w:eastAsia="AppleGothic" w:cs="AppleGothic"/>
         </w:rPr>
         <w:t>주의  외부 Provider 사용은 Tenant 데이터 반출 결정입니다. 전송 범위와 fallback을 확인한 뒤 활성화합니다.</w:t>
       </w:r>
@@ -5437,7 +5459,7 @@
       </w:pPr>
       <w:r>
         <w:rPr>
-          <w:rFonts w:ascii="Apple SD Gothic Neo" w:hAnsi="Apple SD Gothic Neo" w:eastAsia="Apple SD Gothic Neo" w:cs="Apple SD Gothic Neo"/>
+          <w:rFonts w:ascii="AppleGothic" w:hAnsi="AppleGothic" w:eastAsia="AppleGothic" w:cs="AppleGothic"/>
           <w:b/>
           <w:color w:val="000000"/>
           <w:sz w:val="30"/>
@@ -5451,7 +5473,7 @@
       </w:pPr>
       <w:r>
         <w:rPr>
-          <w:rFonts w:ascii="Apple SD Gothic Neo" w:hAnsi="Apple SD Gothic Neo" w:eastAsia="Apple SD Gothic Neo" w:cs="Apple SD Gothic Neo"/>
+          <w:rFonts w:ascii="AppleGothic" w:hAnsi="AppleGothic" w:eastAsia="AppleGothic" w:cs="AppleGothic"/>
           <w:b/>
           <w:color w:val="246BCE"/>
           <w:sz w:val="21"/>
@@ -5460,7 +5482,7 @@
       </w:r>
       <w:r>
         <w:rPr>
-          <w:rFonts w:ascii="Apple SD Gothic Neo" w:hAnsi="Apple SD Gothic Neo" w:eastAsia="Apple SD Gothic Neo" w:cs="Apple SD Gothic Neo"/>
+          <w:rFonts w:ascii="AppleGothic" w:hAnsi="AppleGothic" w:eastAsia="AppleGothic" w:cs="AppleGothic"/>
           <w:color w:val="182433"/>
           <w:sz w:val="21"/>
         </w:rPr>
@@ -5473,7 +5495,7 @@
       </w:pPr>
       <w:r>
         <w:rPr>
-          <w:rFonts w:ascii="Apple SD Gothic Neo" w:hAnsi="Apple SD Gothic Neo" w:eastAsia="Apple SD Gothic Neo" w:cs="Apple SD Gothic Neo"/>
+          <w:rFonts w:ascii="AppleGothic" w:hAnsi="AppleGothic" w:eastAsia="AppleGothic" w:cs="AppleGothic"/>
           <w:b/>
           <w:color w:val="14866D"/>
           <w:sz w:val="21"/>
@@ -5482,7 +5504,7 @@
       </w:r>
       <w:r>
         <w:rPr>
-          <w:rFonts w:ascii="Apple SD Gothic Neo" w:hAnsi="Apple SD Gothic Neo" w:eastAsia="Apple SD Gothic Neo" w:cs="Apple SD Gothic Neo"/>
+          <w:rFonts w:ascii="AppleGothic" w:hAnsi="AppleGothic" w:eastAsia="AppleGothic" w:cs="AppleGothic"/>
           <w:color w:val="182433"/>
           <w:sz w:val="21"/>
         </w:rPr>
@@ -5496,7 +5518,7 @@
       </w:pPr>
       <w:r>
         <w:rPr>
-          <w:rFonts w:ascii="Apple SD Gothic Neo" w:hAnsi="Apple SD Gothic Neo" w:eastAsia="Apple SD Gothic Neo" w:cs="Apple SD Gothic Neo"/>
+          <w:rFonts w:ascii="AppleGothic" w:hAnsi="AppleGothic" w:eastAsia="AppleGothic" w:cs="AppleGothic"/>
           <w:color w:val="182433"/>
           <w:sz w:val="20"/>
         </w:rPr>
@@ -5510,7 +5532,7 @@
       </w:pPr>
       <w:r>
         <w:rPr>
-          <w:rFonts w:ascii="Apple SD Gothic Neo" w:hAnsi="Apple SD Gothic Neo" w:eastAsia="Apple SD Gothic Neo" w:cs="Apple SD Gothic Neo"/>
+          <w:rFonts w:ascii="AppleGothic" w:hAnsi="AppleGothic" w:eastAsia="AppleGothic" w:cs="AppleGothic"/>
           <w:color w:val="182433"/>
           <w:sz w:val="20"/>
         </w:rPr>
@@ -5524,7 +5546,7 @@
       </w:pPr>
       <w:r>
         <w:rPr>
-          <w:rFonts w:ascii="Apple SD Gothic Neo" w:hAnsi="Apple SD Gothic Neo" w:eastAsia="Apple SD Gothic Neo" w:cs="Apple SD Gothic Neo"/>
+          <w:rFonts w:ascii="AppleGothic" w:hAnsi="AppleGothic" w:eastAsia="AppleGothic" w:cs="AppleGothic"/>
           <w:color w:val="182433"/>
           <w:sz w:val="20"/>
         </w:rPr>
@@ -5538,7 +5560,7 @@
       </w:pPr>
       <w:r>
         <w:rPr>
-          <w:rFonts w:ascii="Apple SD Gothic Neo" w:hAnsi="Apple SD Gothic Neo" w:eastAsia="Apple SD Gothic Neo" w:cs="Apple SD Gothic Neo"/>
+          <w:rFonts w:ascii="AppleGothic" w:hAnsi="AppleGothic" w:eastAsia="AppleGothic" w:cs="AppleGothic"/>
           <w:b/>
           <w:color w:val="A56A00"/>
           <w:sz w:val="19"/>
@@ -5547,7 +5569,7 @@
       </w:r>
       <w:r>
         <w:rPr>
-          <w:rFonts w:ascii="Apple SD Gothic Neo" w:hAnsi="Apple SD Gothic Neo" w:eastAsia="Apple SD Gothic Neo" w:cs="Apple SD Gothic Neo"/>
+          <w:rFonts w:ascii="AppleGothic" w:hAnsi="AppleGothic" w:eastAsia="AppleGothic" w:cs="AppleGothic"/>
           <w:color w:val="5E7084"/>
           <w:sz w:val="19"/>
         </w:rPr>
@@ -5561,7 +5583,7 @@
       </w:pPr>
       <w:r>
         <w:rPr>
-          <w:rFonts w:ascii="Apple SD Gothic Neo" w:hAnsi="Apple SD Gothic Neo" w:eastAsia="Apple SD Gothic Neo" w:cs="Apple SD Gothic Neo"/>
+          <w:rFonts w:ascii="AppleGothic" w:hAnsi="AppleGothic" w:eastAsia="AppleGothic" w:cs="AppleGothic"/>
           <w:b/>
           <w:color w:val="B42318"/>
           <w:sz w:val="19"/>
@@ -5570,7 +5592,7 @@
       </w:r>
       <w:r>
         <w:rPr>
-          <w:rFonts w:ascii="Apple SD Gothic Neo" w:hAnsi="Apple SD Gothic Neo" w:eastAsia="Apple SD Gothic Neo" w:cs="Apple SD Gothic Neo"/>
+          <w:rFonts w:ascii="AppleGothic" w:hAnsi="AppleGothic" w:eastAsia="AppleGothic" w:cs="AppleGothic"/>
           <w:color w:val="5E7084"/>
           <w:sz w:val="19"/>
         </w:rPr>
@@ -5585,7 +5607,7 @@
       </w:pPr>
       <w:r>
         <w:rPr>
-          <w:rFonts w:ascii="Apple SD Gothic Neo" w:hAnsi="Apple SD Gothic Neo" w:eastAsia="Apple SD Gothic Neo" w:cs="Apple SD Gothic Neo"/>
+          <w:rFonts w:ascii="AppleGothic" w:hAnsi="AppleGothic" w:eastAsia="AppleGothic" w:cs="AppleGothic"/>
           <w:b/>
           <w:color w:val="000000"/>
           <w:sz w:val="30"/>
@@ -5599,7 +5621,7 @@
       </w:pPr>
       <w:r>
         <w:rPr>
-          <w:rFonts w:ascii="Apple SD Gothic Neo" w:hAnsi="Apple SD Gothic Neo" w:eastAsia="Apple SD Gothic Neo" w:cs="Apple SD Gothic Neo"/>
+          <w:rFonts w:ascii="AppleGothic" w:hAnsi="AppleGothic" w:eastAsia="AppleGothic" w:cs="AppleGothic"/>
           <w:b/>
           <w:color w:val="246BCE"/>
           <w:sz w:val="21"/>
@@ -5608,7 +5630,7 @@
       </w:r>
       <w:r>
         <w:rPr>
-          <w:rFonts w:ascii="Apple SD Gothic Neo" w:hAnsi="Apple SD Gothic Neo" w:eastAsia="Apple SD Gothic Neo" w:cs="Apple SD Gothic Neo"/>
+          <w:rFonts w:ascii="AppleGothic" w:hAnsi="AppleGothic" w:eastAsia="AppleGothic" w:cs="AppleGothic"/>
           <w:color w:val="182433"/>
           <w:sz w:val="21"/>
         </w:rPr>
@@ -5621,7 +5643,7 @@
       </w:pPr>
       <w:r>
         <w:rPr>
-          <w:rFonts w:ascii="Apple SD Gothic Neo" w:hAnsi="Apple SD Gothic Neo" w:eastAsia="Apple SD Gothic Neo" w:cs="Apple SD Gothic Neo"/>
+          <w:rFonts w:ascii="AppleGothic" w:hAnsi="AppleGothic" w:eastAsia="AppleGothic" w:cs="AppleGothic"/>
           <w:b/>
           <w:color w:val="14866D"/>
           <w:sz w:val="21"/>
@@ -5630,7 +5652,7 @@
       </w:r>
       <w:r>
         <w:rPr>
-          <w:rFonts w:ascii="Apple SD Gothic Neo" w:hAnsi="Apple SD Gothic Neo" w:eastAsia="Apple SD Gothic Neo" w:cs="Apple SD Gothic Neo"/>
+          <w:rFonts w:ascii="AppleGothic" w:hAnsi="AppleGothic" w:eastAsia="AppleGothic" w:cs="AppleGothic"/>
           <w:color w:val="182433"/>
           <w:sz w:val="21"/>
         </w:rPr>
@@ -5644,7 +5666,7 @@
       </w:pPr>
       <w:r>
         <w:rPr>
-          <w:rFonts w:ascii="Apple SD Gothic Neo" w:hAnsi="Apple SD Gothic Neo" w:eastAsia="Apple SD Gothic Neo" w:cs="Apple SD Gothic Neo"/>
+          <w:rFonts w:ascii="AppleGothic" w:hAnsi="AppleGothic" w:eastAsia="AppleGothic" w:cs="AppleGothic"/>
           <w:color w:val="182433"/>
           <w:sz w:val="20"/>
         </w:rPr>
@@ -5658,7 +5680,7 @@
       </w:pPr>
       <w:r>
         <w:rPr>
-          <w:rFonts w:ascii="Apple SD Gothic Neo" w:hAnsi="Apple SD Gothic Neo" w:eastAsia="Apple SD Gothic Neo" w:cs="Apple SD Gothic Neo"/>
+          <w:rFonts w:ascii="AppleGothic" w:hAnsi="AppleGothic" w:eastAsia="AppleGothic" w:cs="AppleGothic"/>
           <w:color w:val="182433"/>
           <w:sz w:val="20"/>
         </w:rPr>
@@ -5672,7 +5694,7 @@
       </w:pPr>
       <w:r>
         <w:rPr>
-          <w:rFonts w:ascii="Apple SD Gothic Neo" w:hAnsi="Apple SD Gothic Neo" w:eastAsia="Apple SD Gothic Neo" w:cs="Apple SD Gothic Neo"/>
+          <w:rFonts w:ascii="AppleGothic" w:hAnsi="AppleGothic" w:eastAsia="AppleGothic" w:cs="AppleGothic"/>
           <w:color w:val="182433"/>
           <w:sz w:val="20"/>
         </w:rPr>
@@ -5686,7 +5708,7 @@
       </w:pPr>
       <w:r>
         <w:rPr>
-          <w:rFonts w:ascii="Apple SD Gothic Neo" w:hAnsi="Apple SD Gothic Neo" w:eastAsia="Apple SD Gothic Neo" w:cs="Apple SD Gothic Neo"/>
+          <w:rFonts w:ascii="AppleGothic" w:hAnsi="AppleGothic" w:eastAsia="AppleGothic" w:cs="AppleGothic"/>
           <w:b/>
           <w:color w:val="A56A00"/>
           <w:sz w:val="19"/>
@@ -5695,7 +5717,7 @@
       </w:r>
       <w:r>
         <w:rPr>
-          <w:rFonts w:ascii="Apple SD Gothic Neo" w:hAnsi="Apple SD Gothic Neo" w:eastAsia="Apple SD Gothic Neo" w:cs="Apple SD Gothic Neo"/>
+          <w:rFonts w:ascii="AppleGothic" w:hAnsi="AppleGothic" w:eastAsia="AppleGothic" w:cs="AppleGothic"/>
           <w:color w:val="5E7084"/>
           <w:sz w:val="19"/>
         </w:rPr>
@@ -5709,7 +5731,7 @@
       </w:pPr>
       <w:r>
         <w:rPr>
-          <w:rFonts w:ascii="Apple SD Gothic Neo" w:hAnsi="Apple SD Gothic Neo" w:eastAsia="Apple SD Gothic Neo" w:cs="Apple SD Gothic Neo"/>
+          <w:rFonts w:ascii="AppleGothic" w:hAnsi="AppleGothic" w:eastAsia="AppleGothic" w:cs="AppleGothic"/>
           <w:b/>
           <w:color w:val="B42318"/>
           <w:sz w:val="19"/>
@@ -5718,7 +5740,7 @@
       </w:r>
       <w:r>
         <w:rPr>
-          <w:rFonts w:ascii="Apple SD Gothic Neo" w:hAnsi="Apple SD Gothic Neo" w:eastAsia="Apple SD Gothic Neo" w:cs="Apple SD Gothic Neo"/>
+          <w:rFonts w:ascii="AppleGothic" w:hAnsi="AppleGothic" w:eastAsia="AppleGothic" w:cs="AppleGothic"/>
           <w:color w:val="5E7084"/>
           <w:sz w:val="19"/>
         </w:rPr>
@@ -5731,7 +5753,7 @@
       </w:pPr>
       <w:r>
         <w:rPr>
-          <w:rFonts w:ascii="Apple SD Gothic Neo" w:hAnsi="Apple SD Gothic Neo" w:eastAsia="Apple SD Gothic Neo" w:cs="Apple SD Gothic Neo"/>
+          <w:rFonts w:ascii="AppleGothic" w:hAnsi="AppleGothic" w:eastAsia="AppleGothic" w:cs="AppleGothic"/>
         </w:rPr>
         <w:t>메뉴 권한 매트릭스</w:t>
       </w:r>
@@ -5780,7 +5802,7 @@
             </w:pPr>
             <w:r>
               <w:rPr>
-                <w:rFonts w:ascii="Apple SD Gothic Neo" w:hAnsi="Apple SD Gothic Neo" w:eastAsia="Apple SD Gothic Neo" w:cs="Apple SD Gothic Neo"/>
+                <w:rFonts w:ascii="AppleGothic" w:hAnsi="AppleGothic" w:eastAsia="AppleGothic" w:cs="AppleGothic"/>
                 <w:b/>
                 <w:color w:val="FFFFFF"/>
                 <w:sz w:val="17"/>
@@ -5816,7 +5838,7 @@
             </w:pPr>
             <w:r>
               <w:rPr>
-                <w:rFonts w:ascii="Apple SD Gothic Neo" w:hAnsi="Apple SD Gothic Neo" w:eastAsia="Apple SD Gothic Neo" w:cs="Apple SD Gothic Neo"/>
+                <w:rFonts w:ascii="AppleGothic" w:hAnsi="AppleGothic" w:eastAsia="AppleGothic" w:cs="AppleGothic"/>
                 <w:b/>
                 <w:color w:val="FFFFFF"/>
                 <w:sz w:val="17"/>
@@ -5852,7 +5874,7 @@
             </w:pPr>
             <w:r>
               <w:rPr>
-                <w:rFonts w:ascii="Apple SD Gothic Neo" w:hAnsi="Apple SD Gothic Neo" w:eastAsia="Apple SD Gothic Neo" w:cs="Apple SD Gothic Neo"/>
+                <w:rFonts w:ascii="AppleGothic" w:hAnsi="AppleGothic" w:eastAsia="AppleGothic" w:cs="AppleGothic"/>
                 <w:b/>
                 <w:color w:val="FFFFFF"/>
                 <w:sz w:val="17"/>
@@ -5893,7 +5915,7 @@
             </w:pPr>
             <w:r>
               <w:rPr>
-                <w:rFonts w:ascii="Apple SD Gothic Neo" w:hAnsi="Apple SD Gothic Neo" w:eastAsia="Apple SD Gothic Neo" w:cs="Apple SD Gothic Neo"/>
+                <w:rFonts w:ascii="AppleGothic" w:hAnsi="AppleGothic" w:eastAsia="AppleGothic" w:cs="AppleGothic"/>
                 <w:color w:val="182433"/>
                 <w:sz w:val="16"/>
               </w:rPr>
@@ -5928,7 +5950,7 @@
             </w:pPr>
             <w:r>
               <w:rPr>
-                <w:rFonts w:ascii="Apple SD Gothic Neo" w:hAnsi="Apple SD Gothic Neo" w:eastAsia="Apple SD Gothic Neo" w:cs="Apple SD Gothic Neo"/>
+                <w:rFonts w:ascii="AppleGothic" w:hAnsi="AppleGothic" w:eastAsia="AppleGothic" w:cs="AppleGothic"/>
                 <w:color w:val="182433"/>
                 <w:sz w:val="16"/>
               </w:rPr>
@@ -5963,7 +5985,7 @@
             </w:pPr>
             <w:r>
               <w:rPr>
-                <w:rFonts w:ascii="Apple SD Gothic Neo" w:hAnsi="Apple SD Gothic Neo" w:eastAsia="Apple SD Gothic Neo" w:cs="Apple SD Gothic Neo"/>
+                <w:rFonts w:ascii="AppleGothic" w:hAnsi="AppleGothic" w:eastAsia="AppleGothic" w:cs="AppleGothic"/>
                 <w:color w:val="182433"/>
                 <w:sz w:val="16"/>
               </w:rPr>
@@ -6003,7 +6025,7 @@
             </w:pPr>
             <w:r>
               <w:rPr>
-                <w:rFonts w:ascii="Apple SD Gothic Neo" w:hAnsi="Apple SD Gothic Neo" w:eastAsia="Apple SD Gothic Neo" w:cs="Apple SD Gothic Neo"/>
+                <w:rFonts w:ascii="AppleGothic" w:hAnsi="AppleGothic" w:eastAsia="AppleGothic" w:cs="AppleGothic"/>
                 <w:color w:val="182433"/>
                 <w:sz w:val="16"/>
               </w:rPr>
@@ -6038,7 +6060,7 @@
             </w:pPr>
             <w:r>
               <w:rPr>
-                <w:rFonts w:ascii="Apple SD Gothic Neo" w:hAnsi="Apple SD Gothic Neo" w:eastAsia="Apple SD Gothic Neo" w:cs="Apple SD Gothic Neo"/>
+                <w:rFonts w:ascii="AppleGothic" w:hAnsi="AppleGothic" w:eastAsia="AppleGothic" w:cs="AppleGothic"/>
                 <w:color w:val="182433"/>
                 <w:sz w:val="16"/>
               </w:rPr>
@@ -6073,7 +6095,7 @@
             </w:pPr>
             <w:r>
               <w:rPr>
-                <w:rFonts w:ascii="Apple SD Gothic Neo" w:hAnsi="Apple SD Gothic Neo" w:eastAsia="Apple SD Gothic Neo" w:cs="Apple SD Gothic Neo"/>
+                <w:rFonts w:ascii="AppleGothic" w:hAnsi="AppleGothic" w:eastAsia="AppleGothic" w:cs="AppleGothic"/>
                 <w:color w:val="182433"/>
                 <w:sz w:val="16"/>
               </w:rPr>
@@ -6113,7 +6135,7 @@
             </w:pPr>
             <w:r>
               <w:rPr>
-                <w:rFonts w:ascii="Apple SD Gothic Neo" w:hAnsi="Apple SD Gothic Neo" w:eastAsia="Apple SD Gothic Neo" w:cs="Apple SD Gothic Neo"/>
+                <w:rFonts w:ascii="AppleGothic" w:hAnsi="AppleGothic" w:eastAsia="AppleGothic" w:cs="AppleGothic"/>
                 <w:color w:val="182433"/>
                 <w:sz w:val="16"/>
               </w:rPr>
@@ -6148,7 +6170,7 @@
             </w:pPr>
             <w:r>
               <w:rPr>
-                <w:rFonts w:ascii="Apple SD Gothic Neo" w:hAnsi="Apple SD Gothic Neo" w:eastAsia="Apple SD Gothic Neo" w:cs="Apple SD Gothic Neo"/>
+                <w:rFonts w:ascii="AppleGothic" w:hAnsi="AppleGothic" w:eastAsia="AppleGothic" w:cs="AppleGothic"/>
                 <w:color w:val="182433"/>
                 <w:sz w:val="16"/>
               </w:rPr>
@@ -6183,7 +6205,7 @@
             </w:pPr>
             <w:r>
               <w:rPr>
-                <w:rFonts w:ascii="Apple SD Gothic Neo" w:hAnsi="Apple SD Gothic Neo" w:eastAsia="Apple SD Gothic Neo" w:cs="Apple SD Gothic Neo"/>
+                <w:rFonts w:ascii="AppleGothic" w:hAnsi="AppleGothic" w:eastAsia="AppleGothic" w:cs="AppleGothic"/>
                 <w:color w:val="182433"/>
                 <w:sz w:val="16"/>
               </w:rPr>
@@ -6223,7 +6245,7 @@
             </w:pPr>
             <w:r>
               <w:rPr>
-                <w:rFonts w:ascii="Apple SD Gothic Neo" w:hAnsi="Apple SD Gothic Neo" w:eastAsia="Apple SD Gothic Neo" w:cs="Apple SD Gothic Neo"/>
+                <w:rFonts w:ascii="AppleGothic" w:hAnsi="AppleGothic" w:eastAsia="AppleGothic" w:cs="AppleGothic"/>
                 <w:color w:val="182433"/>
                 <w:sz w:val="16"/>
               </w:rPr>
@@ -6258,7 +6280,7 @@
             </w:pPr>
             <w:r>
               <w:rPr>
-                <w:rFonts w:ascii="Apple SD Gothic Neo" w:hAnsi="Apple SD Gothic Neo" w:eastAsia="Apple SD Gothic Neo" w:cs="Apple SD Gothic Neo"/>
+                <w:rFonts w:ascii="AppleGothic" w:hAnsi="AppleGothic" w:eastAsia="AppleGothic" w:cs="AppleGothic"/>
                 <w:color w:val="182433"/>
                 <w:sz w:val="16"/>
               </w:rPr>
@@ -6293,7 +6315,7 @@
             </w:pPr>
             <w:r>
               <w:rPr>
-                <w:rFonts w:ascii="Apple SD Gothic Neo" w:hAnsi="Apple SD Gothic Neo" w:eastAsia="Apple SD Gothic Neo" w:cs="Apple SD Gothic Neo"/>
+                <w:rFonts w:ascii="AppleGothic" w:hAnsi="AppleGothic" w:eastAsia="AppleGothic" w:cs="AppleGothic"/>
                 <w:color w:val="182433"/>
                 <w:sz w:val="16"/>
               </w:rPr>
@@ -6333,7 +6355,7 @@
             </w:pPr>
             <w:r>
               <w:rPr>
-                <w:rFonts w:ascii="Apple SD Gothic Neo" w:hAnsi="Apple SD Gothic Neo" w:eastAsia="Apple SD Gothic Neo" w:cs="Apple SD Gothic Neo"/>
+                <w:rFonts w:ascii="AppleGothic" w:hAnsi="AppleGothic" w:eastAsia="AppleGothic" w:cs="AppleGothic"/>
                 <w:color w:val="182433"/>
                 <w:sz w:val="16"/>
               </w:rPr>
@@ -6368,7 +6390,7 @@
             </w:pPr>
             <w:r>
               <w:rPr>
-                <w:rFonts w:ascii="Apple SD Gothic Neo" w:hAnsi="Apple SD Gothic Neo" w:eastAsia="Apple SD Gothic Neo" w:cs="Apple SD Gothic Neo"/>
+                <w:rFonts w:ascii="AppleGothic" w:hAnsi="AppleGothic" w:eastAsia="AppleGothic" w:cs="AppleGothic"/>
                 <w:color w:val="182433"/>
                 <w:sz w:val="16"/>
               </w:rPr>
@@ -6403,7 +6425,7 @@
             </w:pPr>
             <w:r>
               <w:rPr>
-                <w:rFonts w:ascii="Apple SD Gothic Neo" w:hAnsi="Apple SD Gothic Neo" w:eastAsia="Apple SD Gothic Neo" w:cs="Apple SD Gothic Neo"/>
+                <w:rFonts w:ascii="AppleGothic" w:hAnsi="AppleGothic" w:eastAsia="AppleGothic" w:cs="AppleGothic"/>
                 <w:color w:val="182433"/>
                 <w:sz w:val="16"/>
               </w:rPr>
@@ -6443,7 +6465,7 @@
             </w:pPr>
             <w:r>
               <w:rPr>
-                <w:rFonts w:ascii="Apple SD Gothic Neo" w:hAnsi="Apple SD Gothic Neo" w:eastAsia="Apple SD Gothic Neo" w:cs="Apple SD Gothic Neo"/>
+                <w:rFonts w:ascii="AppleGothic" w:hAnsi="AppleGothic" w:eastAsia="AppleGothic" w:cs="AppleGothic"/>
                 <w:color w:val="182433"/>
                 <w:sz w:val="16"/>
               </w:rPr>
@@ -6478,7 +6500,7 @@
             </w:pPr>
             <w:r>
               <w:rPr>
-                <w:rFonts w:ascii="Apple SD Gothic Neo" w:hAnsi="Apple SD Gothic Neo" w:eastAsia="Apple SD Gothic Neo" w:cs="Apple SD Gothic Neo"/>
+                <w:rFonts w:ascii="AppleGothic" w:hAnsi="AppleGothic" w:eastAsia="AppleGothic" w:cs="AppleGothic"/>
                 <w:color w:val="182433"/>
                 <w:sz w:val="16"/>
               </w:rPr>
@@ -6513,7 +6535,7 @@
             </w:pPr>
             <w:r>
               <w:rPr>
-                <w:rFonts w:ascii="Apple SD Gothic Neo" w:hAnsi="Apple SD Gothic Neo" w:eastAsia="Apple SD Gothic Neo" w:cs="Apple SD Gothic Neo"/>
+                <w:rFonts w:ascii="AppleGothic" w:hAnsi="AppleGothic" w:eastAsia="AppleGothic" w:cs="AppleGothic"/>
                 <w:color w:val="182433"/>
                 <w:sz w:val="16"/>
               </w:rPr>
@@ -6531,7 +6553,7 @@
       </w:pPr>
       <w:r>
         <w:rPr>
-          <w:rFonts w:ascii="Apple SD Gothic Neo" w:hAnsi="Apple SD Gothic Neo" w:eastAsia="Apple SD Gothic Neo" w:cs="Apple SD Gothic Neo"/>
+          <w:rFonts w:ascii="AppleGothic" w:hAnsi="AppleGothic" w:eastAsia="AppleGothic" w:cs="AppleGothic"/>
         </w:rPr>
         <w:t>12 Application Delivery 운영 경계</w:t>
       </w:r>
@@ -6539,7 +6561,7 @@
     <w:p>
       <w:r>
         <w:rPr>
-          <w:rFonts w:ascii="Apple SD Gothic Neo" w:hAnsi="Apple SD Gothic Neo" w:eastAsia="Apple SD Gothic Neo" w:cs="Apple SD Gothic Neo"/>
+          <w:rFonts w:ascii="AppleGothic" w:hAnsi="AppleGothic" w:eastAsia="AppleGothic" w:cs="AppleGothic"/>
         </w:rPr>
         <w:t>Application Delivery는 KlueOps가 관리하는 Helm Release를 명시적으로 배포·변경·삭제합니다. Argo CD나 Flux를 설치하거나 Git 상태를 지속 동기화하지 않으며, Tenant가 별도로 운영하는 GitOps Controller와 책임을 섞지 않습니다.</w:t>
       </w:r>
@@ -6550,7 +6572,7 @@
       </w:pPr>
       <w:r>
         <w:rPr>
-          <w:rFonts w:ascii="Apple SD Gothic Neo" w:hAnsi="Apple SD Gothic Neo" w:eastAsia="Apple SD Gothic Neo" w:cs="Apple SD Gothic Neo"/>
+          <w:rFonts w:ascii="AppleGothic" w:hAnsi="AppleGothic" w:eastAsia="AppleGothic" w:cs="AppleGothic"/>
         </w:rPr>
         <w:t>안전한 운영 순서</w:t>
       </w:r>
@@ -6562,7 +6584,7 @@
       </w:pPr>
       <w:r>
         <w:rPr>
-          <w:rFonts w:ascii="Apple SD Gothic Neo" w:hAnsi="Apple SD Gothic Neo" w:eastAsia="Apple SD Gothic Neo" w:cs="Apple SD Gothic Neo"/>
+          <w:rFonts w:ascii="AppleGothic" w:hAnsi="AppleGothic" w:eastAsia="AppleGothic" w:cs="AppleGothic"/>
         </w:rPr>
         <w:t>1.  Tenant Library의 Chart 버전과 Values revision을 고정하고 대상 Cluster와 Namespace를 확인합니다.</w:t>
       </w:r>
@@ -6574,7 +6596,7 @@
       </w:pPr>
       <w:r>
         <w:rPr>
-          <w:rFonts w:ascii="Apple SD Gothic Neo" w:hAnsi="Apple SD Gothic Neo" w:eastAsia="Apple SD Gothic Neo" w:cs="Apple SD Gothic Neo"/>
+          <w:rFonts w:ascii="AppleGothic" w:hAnsi="AppleGothic" w:eastAsia="AppleGothic" w:cs="AppleGothic"/>
         </w:rPr>
         <w:t>2.  Preview에서 렌더링 결과, Secret 마스킹, Namespace와 Exposure 계획을 확인합니다.</w:t>
       </w:r>
@@ -6586,9 +6608,9 @@
       </w:pPr>
       <w:r>
         <w:rPr>
-          <w:rFonts w:ascii="Apple SD Gothic Neo" w:hAnsi="Apple SD Gothic Neo" w:eastAsia="Apple SD Gothic Neo" w:cs="Apple SD Gothic Neo"/>
+          <w:rFonts w:eastAsia="AppleGothic" w:ascii="AppleGothic" w:hAnsi="AppleGothic" w:cs="AppleGothic"/>
         </w:rPr>
-        <w:t>3.  정확한 확인 문구로 Helm 작업을 시작하고 Job과 Application History에서 진행·실패 단계를 추적합니다.</w:t>
+        <w:t>3.  정확한 확인 문구로 Helm 작업을 시작하고 Job Center와 Application History에서 진행 및 실패 단계를 추적합니다. Uninstall 성공 후에는 상세 metadata가 제거되므로 완료 결과는 Job Center와 Audit에서 확인합니다.</w:t>
       </w:r>
     </w:p>
     <w:p>
@@ -6598,7 +6620,7 @@
       </w:pPr>
       <w:r>
         <w:rPr>
-          <w:rFonts w:ascii="Apple SD Gothic Neo" w:hAnsi="Apple SD Gothic Neo" w:eastAsia="Apple SD Gothic Neo" w:cs="Apple SD Gothic Neo"/>
+          <w:rFonts w:ascii="AppleGothic" w:hAnsi="AppleGothic" w:eastAsia="AppleGothic" w:cs="AppleGothic"/>
         </w:rPr>
         <w:t>4.  작업 후 workload/Pod, Service와 Ingress/HTTPRoute endpoint 상태를 검증하고 필요할 때 preview 후 rollback 또는 uninstall합니다.</w:t>
       </w:r>
@@ -6611,7 +6633,7 @@
       </w:pPr>
       <w:r>
         <w:rPr>
-          <w:rFonts w:ascii="Apple SD Gothic Neo" w:hAnsi="Apple SD Gothic Neo" w:eastAsia="Apple SD Gothic Neo" w:cs="Apple SD Gothic Neo"/>
+          <w:rFonts w:ascii="AppleGothic" w:hAnsi="AppleGothic" w:eastAsia="AppleGothic" w:cs="AppleGothic"/>
           <w:b/>
           <w:color w:val="000000"/>
           <w:sz w:val="40"/>
@@ -6625,7 +6647,7 @@
       </w:pPr>
       <w:r>
         <w:rPr>
-          <w:rFonts w:ascii="Apple SD Gothic Neo" w:hAnsi="Apple SD Gothic Neo" w:eastAsia="Apple SD Gothic Neo" w:cs="Apple SD Gothic Neo"/>
+          <w:rFonts w:ascii="AppleGothic" w:hAnsi="AppleGothic" w:eastAsia="AppleGothic" w:cs="AppleGothic"/>
         </w:rPr>
         <w:t>초보 운영자</w:t>
       </w:r>
@@ -6637,7 +6659,7 @@
       </w:pPr>
       <w:r>
         <w:rPr>
-          <w:rFonts w:ascii="Apple SD Gothic Neo" w:hAnsi="Apple SD Gothic Neo" w:eastAsia="Apple SD Gothic Neo" w:cs="Apple SD Gothic Neo"/>
+          <w:rFonts w:ascii="AppleGothic" w:hAnsi="AppleGothic" w:eastAsia="AppleGothic" w:cs="AppleGothic"/>
           <w:color w:val="182433"/>
           <w:sz w:val="20"/>
         </w:rPr>
@@ -6651,7 +6673,7 @@
       </w:pPr>
       <w:r>
         <w:rPr>
-          <w:rFonts w:ascii="Apple SD Gothic Neo" w:hAnsi="Apple SD Gothic Neo" w:eastAsia="Apple SD Gothic Neo" w:cs="Apple SD Gothic Neo"/>
+          <w:rFonts w:ascii="AppleGothic" w:hAnsi="AppleGothic" w:eastAsia="AppleGothic" w:cs="AppleGothic"/>
           <w:color w:val="182433"/>
           <w:sz w:val="20"/>
         </w:rPr>
@@ -6665,7 +6687,7 @@
       </w:pPr>
       <w:r>
         <w:rPr>
-          <w:rFonts w:ascii="Apple SD Gothic Neo" w:hAnsi="Apple SD Gothic Neo" w:eastAsia="Apple SD Gothic Neo" w:cs="Apple SD Gothic Neo"/>
+          <w:rFonts w:ascii="AppleGothic" w:hAnsi="AppleGothic" w:eastAsia="AppleGothic" w:cs="AppleGothic"/>
           <w:color w:val="182433"/>
           <w:sz w:val="20"/>
         </w:rPr>
@@ -6679,7 +6701,7 @@
       </w:pPr>
       <w:r>
         <w:rPr>
-          <w:rFonts w:ascii="Apple SD Gothic Neo" w:hAnsi="Apple SD Gothic Neo" w:eastAsia="Apple SD Gothic Neo" w:cs="Apple SD Gothic Neo"/>
+          <w:rFonts w:ascii="AppleGothic" w:hAnsi="AppleGothic" w:eastAsia="AppleGothic" w:cs="AppleGothic"/>
           <w:color w:val="182433"/>
           <w:sz w:val="20"/>
         </w:rPr>
@@ -6693,7 +6715,7 @@
       </w:pPr>
       <w:r>
         <w:rPr>
-          <w:rFonts w:ascii="Apple SD Gothic Neo" w:hAnsi="Apple SD Gothic Neo" w:eastAsia="Apple SD Gothic Neo" w:cs="Apple SD Gothic Neo"/>
+          <w:rFonts w:ascii="AppleGothic" w:hAnsi="AppleGothic" w:eastAsia="AppleGothic" w:cs="AppleGothic"/>
           <w:color w:val="182433"/>
           <w:sz w:val="20"/>
         </w:rPr>
@@ -6706,7 +6728,7 @@
       </w:pPr>
       <w:r>
         <w:rPr>
-          <w:rFonts w:ascii="Apple SD Gothic Neo" w:hAnsi="Apple SD Gothic Neo" w:eastAsia="Apple SD Gothic Neo" w:cs="Apple SD Gothic Neo"/>
+          <w:rFonts w:ascii="AppleGothic" w:hAnsi="AppleGothic" w:eastAsia="AppleGothic" w:cs="AppleGothic"/>
         </w:rPr>
         <w:t>숙련 운영자</w:t>
       </w:r>
@@ -6718,7 +6740,7 @@
       </w:pPr>
       <w:r>
         <w:rPr>
-          <w:rFonts w:ascii="Apple SD Gothic Neo" w:hAnsi="Apple SD Gothic Neo" w:eastAsia="Apple SD Gothic Neo" w:cs="Apple SD Gothic Neo"/>
+          <w:rFonts w:ascii="AppleGothic" w:hAnsi="AppleGothic" w:eastAsia="AppleGothic" w:cs="AppleGothic"/>
           <w:color w:val="182433"/>
           <w:sz w:val="20"/>
         </w:rPr>
@@ -6732,7 +6754,7 @@
       </w:pPr>
       <w:r>
         <w:rPr>
-          <w:rFonts w:ascii="Apple SD Gothic Neo" w:hAnsi="Apple SD Gothic Neo" w:eastAsia="Apple SD Gothic Neo" w:cs="Apple SD Gothic Neo"/>
+          <w:rFonts w:ascii="AppleGothic" w:hAnsi="AppleGothic" w:eastAsia="AppleGothic" w:cs="AppleGothic"/>
           <w:color w:val="182433"/>
           <w:sz w:val="20"/>
         </w:rPr>
@@ -6746,7 +6768,7 @@
       </w:pPr>
       <w:r>
         <w:rPr>
-          <w:rFonts w:ascii="Apple SD Gothic Neo" w:hAnsi="Apple SD Gothic Neo" w:eastAsia="Apple SD Gothic Neo" w:cs="Apple SD Gothic Neo"/>
+          <w:rFonts w:ascii="AppleGothic" w:hAnsi="AppleGothic" w:eastAsia="AppleGothic" w:cs="AppleGothic"/>
           <w:color w:val="182433"/>
           <w:sz w:val="20"/>
         </w:rPr>
@@ -6760,7 +6782,7 @@
       </w:pPr>
       <w:r>
         <w:rPr>
-          <w:rFonts w:ascii="Apple SD Gothic Neo" w:hAnsi="Apple SD Gothic Neo" w:eastAsia="Apple SD Gothic Neo" w:cs="Apple SD Gothic Neo"/>
+          <w:rFonts w:ascii="AppleGothic" w:hAnsi="AppleGothic" w:eastAsia="AppleGothic" w:cs="AppleGothic"/>
           <w:color w:val="182433"/>
           <w:sz w:val="20"/>
         </w:rPr>
@@ -6773,7 +6795,7 @@
       </w:pPr>
       <w:r>
         <w:rPr>
-          <w:rFonts w:ascii="Apple SD Gothic Neo" w:hAnsi="Apple SD Gothic Neo" w:eastAsia="Apple SD Gothic Neo" w:cs="Apple SD Gothic Neo"/>
+          <w:rFonts w:ascii="AppleGothic" w:hAnsi="AppleGothic" w:eastAsia="AppleGothic" w:cs="AppleGothic"/>
         </w:rPr>
         <w:t>플랫폼 관리자</w:t>
       </w:r>
@@ -6785,7 +6807,7 @@
       </w:pPr>
       <w:r>
         <w:rPr>
-          <w:rFonts w:ascii="Apple SD Gothic Neo" w:hAnsi="Apple SD Gothic Neo" w:eastAsia="Apple SD Gothic Neo" w:cs="Apple SD Gothic Neo"/>
+          <w:rFonts w:ascii="AppleGothic" w:hAnsi="AppleGothic" w:eastAsia="AppleGothic" w:cs="AppleGothic"/>
           <w:color w:val="182433"/>
           <w:sz w:val="20"/>
         </w:rPr>
@@ -6799,7 +6821,7 @@
       </w:pPr>
       <w:r>
         <w:rPr>
-          <w:rFonts w:ascii="Apple SD Gothic Neo" w:hAnsi="Apple SD Gothic Neo" w:eastAsia="Apple SD Gothic Neo" w:cs="Apple SD Gothic Neo"/>
+          <w:rFonts w:ascii="AppleGothic" w:hAnsi="AppleGothic" w:eastAsia="AppleGothic" w:cs="AppleGothic"/>
           <w:color w:val="182433"/>
           <w:sz w:val="20"/>
         </w:rPr>
@@ -6813,7 +6835,7 @@
       </w:pPr>
       <w:r>
         <w:rPr>
-          <w:rFonts w:ascii="Apple SD Gothic Neo" w:hAnsi="Apple SD Gothic Neo" w:eastAsia="Apple SD Gothic Neo" w:cs="Apple SD Gothic Neo"/>
+          <w:rFonts w:ascii="AppleGothic" w:hAnsi="AppleGothic" w:eastAsia="AppleGothic" w:cs="AppleGothic"/>
           <w:color w:val="182433"/>
           <w:sz w:val="20"/>
         </w:rPr>
@@ -6828,7 +6850,7 @@
       </w:pPr>
       <w:r>
         <w:rPr>
-          <w:rFonts w:ascii="Apple SD Gothic Neo" w:hAnsi="Apple SD Gothic Neo" w:eastAsia="Apple SD Gothic Neo" w:cs="Apple SD Gothic Neo"/>
+          <w:rFonts w:ascii="AppleGothic" w:hAnsi="AppleGothic" w:eastAsia="AppleGothic" w:cs="AppleGothic"/>
           <w:b/>
           <w:color w:val="000000"/>
           <w:sz w:val="40"/>
@@ -6878,7 +6900,7 @@
             </w:pPr>
             <w:r>
               <w:rPr>
-                <w:rFonts w:ascii="Apple SD Gothic Neo" w:hAnsi="Apple SD Gothic Neo" w:eastAsia="Apple SD Gothic Neo" w:cs="Apple SD Gothic Neo"/>
+                <w:rFonts w:ascii="AppleGothic" w:hAnsi="AppleGothic" w:eastAsia="AppleGothic" w:cs="AppleGothic"/>
                 <w:b/>
                 <w:color w:val="FFFFFF"/>
                 <w:sz w:val="19"/>
@@ -6913,7 +6935,7 @@
             </w:pPr>
             <w:r>
               <w:rPr>
-                <w:rFonts w:ascii="Apple SD Gothic Neo" w:hAnsi="Apple SD Gothic Neo" w:eastAsia="Apple SD Gothic Neo" w:cs="Apple SD Gothic Neo"/>
+                <w:rFonts w:ascii="AppleGothic" w:hAnsi="AppleGothic" w:eastAsia="AppleGothic" w:cs="AppleGothic"/>
                 <w:b/>
                 <w:color w:val="FFFFFF"/>
                 <w:sz w:val="19"/>
@@ -6948,7 +6970,7 @@
             </w:pPr>
             <w:r>
               <w:rPr>
-                <w:rFonts w:ascii="Apple SD Gothic Neo" w:hAnsi="Apple SD Gothic Neo" w:eastAsia="Apple SD Gothic Neo" w:cs="Apple SD Gothic Neo"/>
+                <w:rFonts w:ascii="AppleGothic" w:hAnsi="AppleGothic" w:eastAsia="AppleGothic" w:cs="AppleGothic"/>
                 <w:b/>
                 <w:color w:val="FFFFFF"/>
                 <w:sz w:val="19"/>
@@ -6985,7 +7007,7 @@
             </w:pPr>
             <w:r>
               <w:rPr>
-                <w:rFonts w:ascii="Apple SD Gothic Neo" w:hAnsi="Apple SD Gothic Neo" w:eastAsia="Apple SD Gothic Neo" w:cs="Apple SD Gothic Neo"/>
+                <w:rFonts w:ascii="AppleGothic" w:hAnsi="AppleGothic" w:eastAsia="AppleGothic" w:cs="AppleGothic"/>
                 <w:color w:val="182433"/>
                 <w:sz w:val="18"/>
               </w:rPr>
@@ -7019,7 +7041,7 @@
             </w:pPr>
             <w:r>
               <w:rPr>
-                <w:rFonts w:ascii="Apple SD Gothic Neo" w:hAnsi="Apple SD Gothic Neo" w:eastAsia="Apple SD Gothic Neo" w:cs="Apple SD Gothic Neo"/>
+                <w:rFonts w:ascii="AppleGothic" w:hAnsi="AppleGothic" w:eastAsia="AppleGothic" w:cs="AppleGothic"/>
                 <w:color w:val="182433"/>
                 <w:sz w:val="18"/>
               </w:rPr>
@@ -7053,7 +7075,7 @@
             </w:pPr>
             <w:r>
               <w:rPr>
-                <w:rFonts w:ascii="Apple SD Gothic Neo" w:hAnsi="Apple SD Gothic Neo" w:eastAsia="Apple SD Gothic Neo" w:cs="Apple SD Gothic Neo"/>
+                <w:rFonts w:ascii="AppleGothic" w:hAnsi="AppleGothic" w:eastAsia="AppleGothic" w:cs="AppleGothic"/>
                 <w:color w:val="182433"/>
                 <w:sz w:val="18"/>
               </w:rPr>
@@ -7089,7 +7111,7 @@
             </w:pPr>
             <w:r>
               <w:rPr>
-                <w:rFonts w:ascii="Apple SD Gothic Neo" w:hAnsi="Apple SD Gothic Neo" w:eastAsia="Apple SD Gothic Neo" w:cs="Apple SD Gothic Neo"/>
+                <w:rFonts w:ascii="AppleGothic" w:hAnsi="AppleGothic" w:eastAsia="AppleGothic" w:cs="AppleGothic"/>
                 <w:color w:val="182433"/>
                 <w:sz w:val="18"/>
               </w:rPr>
@@ -7123,7 +7145,7 @@
             </w:pPr>
             <w:r>
               <w:rPr>
-                <w:rFonts w:ascii="Apple SD Gothic Neo" w:hAnsi="Apple SD Gothic Neo" w:eastAsia="Apple SD Gothic Neo" w:cs="Apple SD Gothic Neo"/>
+                <w:rFonts w:ascii="AppleGothic" w:hAnsi="AppleGothic" w:eastAsia="AppleGothic" w:cs="AppleGothic"/>
                 <w:color w:val="182433"/>
                 <w:sz w:val="18"/>
               </w:rPr>
@@ -7157,7 +7179,7 @@
             </w:pPr>
             <w:r>
               <w:rPr>
-                <w:rFonts w:ascii="Apple SD Gothic Neo" w:hAnsi="Apple SD Gothic Neo" w:eastAsia="Apple SD Gothic Neo" w:cs="Apple SD Gothic Neo"/>
+                <w:rFonts w:ascii="AppleGothic" w:hAnsi="AppleGothic" w:eastAsia="AppleGothic" w:cs="AppleGothic"/>
                 <w:color w:val="182433"/>
                 <w:sz w:val="18"/>
               </w:rPr>
@@ -7193,7 +7215,7 @@
             </w:pPr>
             <w:r>
               <w:rPr>
-                <w:rFonts w:ascii="Apple SD Gothic Neo" w:hAnsi="Apple SD Gothic Neo" w:eastAsia="Apple SD Gothic Neo" w:cs="Apple SD Gothic Neo"/>
+                <w:rFonts w:ascii="AppleGothic" w:hAnsi="AppleGothic" w:eastAsia="AppleGothic" w:cs="AppleGothic"/>
                 <w:color w:val="182433"/>
                 <w:sz w:val="18"/>
               </w:rPr>
@@ -7227,7 +7249,7 @@
             </w:pPr>
             <w:r>
               <w:rPr>
-                <w:rFonts w:ascii="Apple SD Gothic Neo" w:hAnsi="Apple SD Gothic Neo" w:eastAsia="Apple SD Gothic Neo" w:cs="Apple SD Gothic Neo"/>
+                <w:rFonts w:ascii="AppleGothic" w:hAnsi="AppleGothic" w:eastAsia="AppleGothic" w:cs="AppleGothic"/>
                 <w:color w:val="182433"/>
                 <w:sz w:val="18"/>
               </w:rPr>
@@ -7261,7 +7283,7 @@
             </w:pPr>
             <w:r>
               <w:rPr>
-                <w:rFonts w:ascii="Apple SD Gothic Neo" w:hAnsi="Apple SD Gothic Neo" w:eastAsia="Apple SD Gothic Neo" w:cs="Apple SD Gothic Neo"/>
+                <w:rFonts w:ascii="AppleGothic" w:hAnsi="AppleGothic" w:eastAsia="AppleGothic" w:cs="AppleGothic"/>
                 <w:color w:val="182433"/>
                 <w:sz w:val="18"/>
               </w:rPr>
@@ -7297,7 +7319,7 @@
             </w:pPr>
             <w:r>
               <w:rPr>
-                <w:rFonts w:ascii="Apple SD Gothic Neo" w:hAnsi="Apple SD Gothic Neo" w:eastAsia="Apple SD Gothic Neo" w:cs="Apple SD Gothic Neo"/>
+                <w:rFonts w:ascii="AppleGothic" w:hAnsi="AppleGothic" w:eastAsia="AppleGothic" w:cs="AppleGothic"/>
                 <w:color w:val="182433"/>
                 <w:sz w:val="18"/>
               </w:rPr>
@@ -7331,7 +7353,7 @@
             </w:pPr>
             <w:r>
               <w:rPr>
-                <w:rFonts w:ascii="Apple SD Gothic Neo" w:hAnsi="Apple SD Gothic Neo" w:eastAsia="Apple SD Gothic Neo" w:cs="Apple SD Gothic Neo"/>
+                <w:rFonts w:ascii="AppleGothic" w:hAnsi="AppleGothic" w:eastAsia="AppleGothic" w:cs="AppleGothic"/>
                 <w:color w:val="182433"/>
                 <w:sz w:val="18"/>
               </w:rPr>
@@ -7365,7 +7387,7 @@
             </w:pPr>
             <w:r>
               <w:rPr>
-                <w:rFonts w:ascii="Apple SD Gothic Neo" w:hAnsi="Apple SD Gothic Neo" w:eastAsia="Apple SD Gothic Neo" w:cs="Apple SD Gothic Neo"/>
+                <w:rFonts w:ascii="AppleGothic" w:hAnsi="AppleGothic" w:eastAsia="AppleGothic" w:cs="AppleGothic"/>
                 <w:color w:val="182433"/>
                 <w:sz w:val="18"/>
               </w:rPr>
@@ -7401,7 +7423,7 @@
             </w:pPr>
             <w:r>
               <w:rPr>
-                <w:rFonts w:ascii="Apple SD Gothic Neo" w:hAnsi="Apple SD Gothic Neo" w:eastAsia="Apple SD Gothic Neo" w:cs="Apple SD Gothic Neo"/>
+                <w:rFonts w:ascii="AppleGothic" w:hAnsi="AppleGothic" w:eastAsia="AppleGothic" w:cs="AppleGothic"/>
                 <w:color w:val="182433"/>
                 <w:sz w:val="18"/>
               </w:rPr>
@@ -7435,7 +7457,7 @@
             </w:pPr>
             <w:r>
               <w:rPr>
-                <w:rFonts w:ascii="Apple SD Gothic Neo" w:hAnsi="Apple SD Gothic Neo" w:eastAsia="Apple SD Gothic Neo" w:cs="Apple SD Gothic Neo"/>
+                <w:rFonts w:ascii="AppleGothic" w:hAnsi="AppleGothic" w:eastAsia="AppleGothic" w:cs="AppleGothic"/>
                 <w:color w:val="182433"/>
                 <w:sz w:val="18"/>
               </w:rPr>
@@ -7469,7 +7491,7 @@
             </w:pPr>
             <w:r>
               <w:rPr>
-                <w:rFonts w:ascii="Apple SD Gothic Neo" w:hAnsi="Apple SD Gothic Neo" w:eastAsia="Apple SD Gothic Neo" w:cs="Apple SD Gothic Neo"/>
+                <w:rFonts w:ascii="AppleGothic" w:hAnsi="AppleGothic" w:eastAsia="AppleGothic" w:cs="AppleGothic"/>
                 <w:color w:val="182433"/>
                 <w:sz w:val="18"/>
               </w:rPr>
@@ -7505,7 +7527,7 @@
             </w:pPr>
             <w:r>
               <w:rPr>
-                <w:rFonts w:ascii="Apple SD Gothic Neo" w:hAnsi="Apple SD Gothic Neo" w:eastAsia="Apple SD Gothic Neo" w:cs="Apple SD Gothic Neo"/>
+                <w:rFonts w:ascii="AppleGothic" w:hAnsi="AppleGothic" w:eastAsia="AppleGothic" w:cs="AppleGothic"/>
                 <w:color w:val="182433"/>
                 <w:sz w:val="18"/>
               </w:rPr>
@@ -7539,7 +7561,7 @@
             </w:pPr>
             <w:r>
               <w:rPr>
-                <w:rFonts w:ascii="Apple SD Gothic Neo" w:hAnsi="Apple SD Gothic Neo" w:eastAsia="Apple SD Gothic Neo" w:cs="Apple SD Gothic Neo"/>
+                <w:rFonts w:ascii="AppleGothic" w:hAnsi="AppleGothic" w:eastAsia="AppleGothic" w:cs="AppleGothic"/>
                 <w:color w:val="182433"/>
                 <w:sz w:val="18"/>
               </w:rPr>
@@ -7573,7 +7595,7 @@
             </w:pPr>
             <w:r>
               <w:rPr>
-                <w:rFonts w:ascii="Apple SD Gothic Neo" w:hAnsi="Apple SD Gothic Neo" w:eastAsia="Apple SD Gothic Neo" w:cs="Apple SD Gothic Neo"/>
+                <w:rFonts w:ascii="AppleGothic" w:hAnsi="AppleGothic" w:eastAsia="AppleGothic" w:cs="AppleGothic"/>
                 <w:color w:val="182433"/>
                 <w:sz w:val="18"/>
               </w:rPr>
@@ -7609,7 +7631,7 @@
             </w:pPr>
             <w:r>
               <w:rPr>
-                <w:rFonts w:ascii="Apple SD Gothic Neo" w:hAnsi="Apple SD Gothic Neo" w:eastAsia="Apple SD Gothic Neo" w:cs="Apple SD Gothic Neo"/>
+                <w:rFonts w:ascii="AppleGothic" w:hAnsi="AppleGothic" w:eastAsia="AppleGothic" w:cs="AppleGothic"/>
                 <w:color w:val="182433"/>
                 <w:sz w:val="18"/>
               </w:rPr>
@@ -7643,7 +7665,7 @@
             </w:pPr>
             <w:r>
               <w:rPr>
-                <w:rFonts w:ascii="Apple SD Gothic Neo" w:hAnsi="Apple SD Gothic Neo" w:eastAsia="Apple SD Gothic Neo" w:cs="Apple SD Gothic Neo"/>
+                <w:rFonts w:ascii="AppleGothic" w:hAnsi="AppleGothic" w:eastAsia="AppleGothic" w:cs="AppleGothic"/>
                 <w:color w:val="182433"/>
                 <w:sz w:val="18"/>
               </w:rPr>
@@ -7677,7 +7699,7 @@
             </w:pPr>
             <w:r>
               <w:rPr>
-                <w:rFonts w:ascii="Apple SD Gothic Neo" w:hAnsi="Apple SD Gothic Neo" w:eastAsia="Apple SD Gothic Neo" w:cs="Apple SD Gothic Neo"/>
+                <w:rFonts w:ascii="AppleGothic" w:hAnsi="AppleGothic" w:eastAsia="AppleGothic" w:cs="AppleGothic"/>
                 <w:color w:val="182433"/>
                 <w:sz w:val="18"/>
               </w:rPr>
@@ -7713,7 +7735,7 @@
             </w:pPr>
             <w:r>
               <w:rPr>
-                <w:rFonts w:ascii="Apple SD Gothic Neo" w:hAnsi="Apple SD Gothic Neo" w:eastAsia="Apple SD Gothic Neo" w:cs="Apple SD Gothic Neo"/>
+                <w:rFonts w:ascii="AppleGothic" w:hAnsi="AppleGothic" w:eastAsia="AppleGothic" w:cs="AppleGothic"/>
                 <w:color w:val="182433"/>
                 <w:sz w:val="18"/>
               </w:rPr>
@@ -7747,7 +7769,7 @@
             </w:pPr>
             <w:r>
               <w:rPr>
-                <w:rFonts w:ascii="Apple SD Gothic Neo" w:hAnsi="Apple SD Gothic Neo" w:eastAsia="Apple SD Gothic Neo" w:cs="Apple SD Gothic Neo"/>
+                <w:rFonts w:ascii="AppleGothic" w:hAnsi="AppleGothic" w:eastAsia="AppleGothic" w:cs="AppleGothic"/>
                 <w:color w:val="182433"/>
                 <w:sz w:val="18"/>
               </w:rPr>
@@ -7781,7 +7803,7 @@
             </w:pPr>
             <w:r>
               <w:rPr>
-                <w:rFonts w:ascii="Apple SD Gothic Neo" w:hAnsi="Apple SD Gothic Neo" w:eastAsia="Apple SD Gothic Neo" w:cs="Apple SD Gothic Neo"/>
+                <w:rFonts w:ascii="AppleGothic" w:hAnsi="AppleGothic" w:eastAsia="AppleGothic" w:cs="AppleGothic"/>
                 <w:color w:val="182433"/>
                 <w:sz w:val="18"/>
               </w:rPr>
@@ -7817,7 +7839,7 @@
             </w:pPr>
             <w:r>
               <w:rPr>
-                <w:rFonts w:ascii="Apple SD Gothic Neo" w:hAnsi="Apple SD Gothic Neo" w:eastAsia="Apple SD Gothic Neo" w:cs="Apple SD Gothic Neo"/>
+                <w:rFonts w:ascii="AppleGothic" w:hAnsi="AppleGothic" w:eastAsia="AppleGothic" w:cs="AppleGothic"/>
                 <w:color w:val="182433"/>
                 <w:sz w:val="18"/>
               </w:rPr>
@@ -7851,7 +7873,7 @@
             </w:pPr>
             <w:r>
               <w:rPr>
-                <w:rFonts w:ascii="Apple SD Gothic Neo" w:hAnsi="Apple SD Gothic Neo" w:eastAsia="Apple SD Gothic Neo" w:cs="Apple SD Gothic Neo"/>
+                <w:rFonts w:ascii="AppleGothic" w:hAnsi="AppleGothic" w:eastAsia="AppleGothic" w:cs="AppleGothic"/>
                 <w:color w:val="182433"/>
                 <w:sz w:val="18"/>
               </w:rPr>
@@ -7885,7 +7907,7 @@
             </w:pPr>
             <w:r>
               <w:rPr>
-                <w:rFonts w:ascii="Apple SD Gothic Neo" w:hAnsi="Apple SD Gothic Neo" w:eastAsia="Apple SD Gothic Neo" w:cs="Apple SD Gothic Neo"/>
+                <w:rFonts w:ascii="AppleGothic" w:hAnsi="AppleGothic" w:eastAsia="AppleGothic" w:cs="AppleGothic"/>
                 <w:color w:val="182433"/>
                 <w:sz w:val="18"/>
               </w:rPr>
@@ -7921,7 +7943,7 @@
             </w:pPr>
             <w:r>
               <w:rPr>
-                <w:rFonts w:ascii="Apple SD Gothic Neo" w:hAnsi="Apple SD Gothic Neo" w:eastAsia="Apple SD Gothic Neo" w:cs="Apple SD Gothic Neo"/>
+                <w:rFonts w:ascii="AppleGothic" w:hAnsi="AppleGothic" w:eastAsia="AppleGothic" w:cs="AppleGothic"/>
                 <w:color w:val="182433"/>
                 <w:sz w:val="18"/>
               </w:rPr>
@@ -7955,7 +7977,7 @@
             </w:pPr>
             <w:r>
               <w:rPr>
-                <w:rFonts w:ascii="Apple SD Gothic Neo" w:hAnsi="Apple SD Gothic Neo" w:eastAsia="Apple SD Gothic Neo" w:cs="Apple SD Gothic Neo"/>
+                <w:rFonts w:ascii="AppleGothic" w:hAnsi="AppleGothic" w:eastAsia="AppleGothic" w:cs="AppleGothic"/>
                 <w:color w:val="182433"/>
                 <w:sz w:val="18"/>
               </w:rPr>
@@ -7989,7 +8011,7 @@
             </w:pPr>
             <w:r>
               <w:rPr>
-                <w:rFonts w:ascii="Apple SD Gothic Neo" w:hAnsi="Apple SD Gothic Neo" w:eastAsia="Apple SD Gothic Neo" w:cs="Apple SD Gothic Neo"/>
+                <w:rFonts w:ascii="AppleGothic" w:hAnsi="AppleGothic" w:eastAsia="AppleGothic" w:cs="AppleGothic"/>
                 <w:color w:val="182433"/>
                 <w:sz w:val="18"/>
               </w:rPr>
@@ -8025,7 +8047,7 @@
             </w:pPr>
             <w:r>
               <w:rPr>
-                <w:rFonts w:ascii="Apple SD Gothic Neo" w:hAnsi="Apple SD Gothic Neo" w:eastAsia="Apple SD Gothic Neo" w:cs="Apple SD Gothic Neo"/>
+                <w:rFonts w:ascii="AppleGothic" w:hAnsi="AppleGothic" w:eastAsia="AppleGothic" w:cs="AppleGothic"/>
                 <w:color w:val="182433"/>
                 <w:sz w:val="18"/>
               </w:rPr>
@@ -8059,7 +8081,7 @@
             </w:pPr>
             <w:r>
               <w:rPr>
-                <w:rFonts w:ascii="Apple SD Gothic Neo" w:hAnsi="Apple SD Gothic Neo" w:eastAsia="Apple SD Gothic Neo" w:cs="Apple SD Gothic Neo"/>
+                <w:rFonts w:ascii="AppleGothic" w:hAnsi="AppleGothic" w:eastAsia="AppleGothic" w:cs="AppleGothic"/>
                 <w:color w:val="182433"/>
                 <w:sz w:val="18"/>
               </w:rPr>
@@ -8093,7 +8115,7 @@
             </w:pPr>
             <w:r>
               <w:rPr>
-                <w:rFonts w:ascii="Apple SD Gothic Neo" w:hAnsi="Apple SD Gothic Neo" w:eastAsia="Apple SD Gothic Neo" w:cs="Apple SD Gothic Neo"/>
+                <w:rFonts w:ascii="AppleGothic" w:hAnsi="AppleGothic" w:eastAsia="AppleGothic" w:cs="AppleGothic"/>
                 <w:color w:val="182433"/>
                 <w:sz w:val="18"/>
               </w:rPr>
@@ -8129,7 +8151,7 @@
             </w:pPr>
             <w:r>
               <w:rPr>
-                <w:rFonts w:ascii="Apple SD Gothic Neo" w:hAnsi="Apple SD Gothic Neo" w:eastAsia="Apple SD Gothic Neo" w:cs="Apple SD Gothic Neo"/>
+                <w:rFonts w:ascii="AppleGothic" w:hAnsi="AppleGothic" w:eastAsia="AppleGothic" w:cs="AppleGothic"/>
                 <w:color w:val="182433"/>
                 <w:sz w:val="18"/>
               </w:rPr>
@@ -8163,7 +8185,7 @@
             </w:pPr>
             <w:r>
               <w:rPr>
-                <w:rFonts w:ascii="Apple SD Gothic Neo" w:hAnsi="Apple SD Gothic Neo" w:eastAsia="Apple SD Gothic Neo" w:cs="Apple SD Gothic Neo"/>
+                <w:rFonts w:ascii="AppleGothic" w:hAnsi="AppleGothic" w:eastAsia="AppleGothic" w:cs="AppleGothic"/>
                 <w:color w:val="182433"/>
                 <w:sz w:val="18"/>
               </w:rPr>
@@ -8197,7 +8219,7 @@
             </w:pPr>
             <w:r>
               <w:rPr>
-                <w:rFonts w:ascii="Apple SD Gothic Neo" w:hAnsi="Apple SD Gothic Neo" w:eastAsia="Apple SD Gothic Neo" w:cs="Apple SD Gothic Neo"/>
+                <w:rFonts w:ascii="AppleGothic" w:hAnsi="AppleGothic" w:eastAsia="AppleGothic" w:cs="AppleGothic"/>
                 <w:color w:val="182433"/>
                 <w:sz w:val="18"/>
               </w:rPr>
@@ -8233,7 +8255,7 @@
             </w:pPr>
             <w:r>
               <w:rPr>
-                <w:rFonts w:ascii="Apple SD Gothic Neo" w:hAnsi="Apple SD Gothic Neo" w:eastAsia="Apple SD Gothic Neo" w:cs="Apple SD Gothic Neo"/>
+                <w:rFonts w:ascii="AppleGothic" w:hAnsi="AppleGothic" w:eastAsia="AppleGothic" w:cs="AppleGothic"/>
                 <w:color w:val="182433"/>
                 <w:sz w:val="18"/>
               </w:rPr>
@@ -8267,7 +8289,7 @@
             </w:pPr>
             <w:r>
               <w:rPr>
-                <w:rFonts w:ascii="Apple SD Gothic Neo" w:hAnsi="Apple SD Gothic Neo" w:eastAsia="Apple SD Gothic Neo" w:cs="Apple SD Gothic Neo"/>
+                <w:rFonts w:ascii="AppleGothic" w:hAnsi="AppleGothic" w:eastAsia="AppleGothic" w:cs="AppleGothic"/>
                 <w:color w:val="182433"/>
                 <w:sz w:val="18"/>
               </w:rPr>
@@ -8301,7 +8323,7 @@
             </w:pPr>
             <w:r>
               <w:rPr>
-                <w:rFonts w:ascii="Apple SD Gothic Neo" w:hAnsi="Apple SD Gothic Neo" w:eastAsia="Apple SD Gothic Neo" w:cs="Apple SD Gothic Neo"/>
+                <w:rFonts w:ascii="AppleGothic" w:hAnsi="AppleGothic" w:eastAsia="AppleGothic" w:cs="AppleGothic"/>
                 <w:color w:val="182433"/>
                 <w:sz w:val="18"/>
               </w:rPr>
@@ -8337,7 +8359,7 @@
             </w:pPr>
             <w:r>
               <w:rPr>
-                <w:rFonts w:ascii="Apple SD Gothic Neo" w:hAnsi="Apple SD Gothic Neo" w:eastAsia="Apple SD Gothic Neo" w:cs="Apple SD Gothic Neo"/>
+                <w:rFonts w:ascii="AppleGothic" w:hAnsi="AppleGothic" w:eastAsia="AppleGothic" w:cs="AppleGothic"/>
                 <w:color w:val="182433"/>
                 <w:sz w:val="18"/>
               </w:rPr>
@@ -8371,7 +8393,7 @@
             </w:pPr>
             <w:r>
               <w:rPr>
-                <w:rFonts w:ascii="Apple SD Gothic Neo" w:hAnsi="Apple SD Gothic Neo" w:eastAsia="Apple SD Gothic Neo" w:cs="Apple SD Gothic Neo"/>
+                <w:rFonts w:ascii="AppleGothic" w:hAnsi="AppleGothic" w:eastAsia="AppleGothic" w:cs="AppleGothic"/>
                 <w:color w:val="182433"/>
                 <w:sz w:val="18"/>
               </w:rPr>
@@ -8405,7 +8427,7 @@
             </w:pPr>
             <w:r>
               <w:rPr>
-                <w:rFonts w:ascii="Apple SD Gothic Neo" w:hAnsi="Apple SD Gothic Neo" w:eastAsia="Apple SD Gothic Neo" w:cs="Apple SD Gothic Neo"/>
+                <w:rFonts w:ascii="AppleGothic" w:hAnsi="AppleGothic" w:eastAsia="AppleGothic" w:cs="AppleGothic"/>
                 <w:color w:val="182433"/>
                 <w:sz w:val="18"/>
               </w:rPr>
@@ -8441,7 +8463,7 @@
             </w:pPr>
             <w:r>
               <w:rPr>
-                <w:rFonts w:ascii="Apple SD Gothic Neo" w:hAnsi="Apple SD Gothic Neo" w:eastAsia="Apple SD Gothic Neo" w:cs="Apple SD Gothic Neo"/>
+                <w:rFonts w:ascii="AppleGothic" w:hAnsi="AppleGothic" w:eastAsia="AppleGothic" w:cs="AppleGothic"/>
                 <w:color w:val="182433"/>
                 <w:sz w:val="18"/>
               </w:rPr>
@@ -8475,7 +8497,7 @@
             </w:pPr>
             <w:r>
               <w:rPr>
-                <w:rFonts w:ascii="Apple SD Gothic Neo" w:hAnsi="Apple SD Gothic Neo" w:eastAsia="Apple SD Gothic Neo" w:cs="Apple SD Gothic Neo"/>
+                <w:rFonts w:ascii="AppleGothic" w:hAnsi="AppleGothic" w:eastAsia="AppleGothic" w:cs="AppleGothic"/>
                 <w:color w:val="182433"/>
                 <w:sz w:val="18"/>
               </w:rPr>
@@ -8509,7 +8531,7 @@
             </w:pPr>
             <w:r>
               <w:rPr>
-                <w:rFonts w:ascii="Apple SD Gothic Neo" w:hAnsi="Apple SD Gothic Neo" w:eastAsia="Apple SD Gothic Neo" w:cs="Apple SD Gothic Neo"/>
+                <w:rFonts w:ascii="AppleGothic" w:hAnsi="AppleGothic" w:eastAsia="AppleGothic" w:cs="AppleGothic"/>
                 <w:color w:val="182433"/>
                 <w:sz w:val="18"/>
               </w:rPr>
@@ -8545,7 +8567,7 @@
             </w:pPr>
             <w:r>
               <w:rPr>
-                <w:rFonts w:ascii="Apple SD Gothic Neo" w:hAnsi="Apple SD Gothic Neo" w:eastAsia="Apple SD Gothic Neo" w:cs="Apple SD Gothic Neo"/>
+                <w:rFonts w:ascii="AppleGothic" w:hAnsi="AppleGothic" w:eastAsia="AppleGothic" w:cs="AppleGothic"/>
                 <w:color w:val="182433"/>
                 <w:sz w:val="18"/>
               </w:rPr>
@@ -8579,7 +8601,7 @@
             </w:pPr>
             <w:r>
               <w:rPr>
-                <w:rFonts w:ascii="Apple SD Gothic Neo" w:hAnsi="Apple SD Gothic Neo" w:eastAsia="Apple SD Gothic Neo" w:cs="Apple SD Gothic Neo"/>
+                <w:rFonts w:ascii="AppleGothic" w:hAnsi="AppleGothic" w:eastAsia="AppleGothic" w:cs="AppleGothic"/>
                 <w:color w:val="182433"/>
                 <w:sz w:val="18"/>
               </w:rPr>
@@ -8613,7 +8635,7 @@
             </w:pPr>
             <w:r>
               <w:rPr>
-                <w:rFonts w:ascii="Apple SD Gothic Neo" w:hAnsi="Apple SD Gothic Neo" w:eastAsia="Apple SD Gothic Neo" w:cs="Apple SD Gothic Neo"/>
+                <w:rFonts w:ascii="AppleGothic" w:hAnsi="AppleGothic" w:eastAsia="AppleGothic" w:cs="AppleGothic"/>
                 <w:color w:val="182433"/>
                 <w:sz w:val="18"/>
               </w:rPr>
@@ -8634,7 +8656,7 @@
       </w:pPr>
       <w:r>
         <w:rPr>
-          <w:rFonts w:ascii="Apple SD Gothic Neo" w:hAnsi="Apple SD Gothic Neo" w:eastAsia="Apple SD Gothic Neo" w:cs="Apple SD Gothic Neo"/>
+          <w:rFonts w:ascii="AppleGothic" w:hAnsi="AppleGothic" w:eastAsia="AppleGothic" w:cs="AppleGothic"/>
         </w:rPr>
         <w:t>참고 자료</w:t>
       </w:r>
@@ -8646,7 +8668,7 @@
       </w:pPr>
       <w:r>
         <w:rPr>
-          <w:rFonts w:ascii="Apple SD Gothic Neo" w:hAnsi="Apple SD Gothic Neo" w:eastAsia="Apple SD Gothic Neo" w:cs="Apple SD Gothic Neo"/>
+          <w:rFonts w:ascii="AppleGothic" w:hAnsi="AppleGothic" w:eastAsia="AppleGothic" w:cs="AppleGothic"/>
           <w:color w:val="182433"/>
           <w:sz w:val="20"/>
         </w:rPr>
@@ -8660,7 +8682,7 @@
       </w:pPr>
       <w:r>
         <w:rPr>
-          <w:rFonts w:ascii="Apple SD Gothic Neo" w:hAnsi="Apple SD Gothic Neo" w:eastAsia="Apple SD Gothic Neo" w:cs="Apple SD Gothic Neo"/>
+          <w:rFonts w:ascii="AppleGothic" w:hAnsi="AppleGothic" w:eastAsia="AppleGothic" w:cs="AppleGothic"/>
           <w:color w:val="182433"/>
           <w:sz w:val="20"/>
         </w:rPr>
@@ -8674,7 +8696,7 @@
       </w:pPr>
       <w:r>
         <w:rPr>
-          <w:rFonts w:ascii="Apple SD Gothic Neo" w:hAnsi="Apple SD Gothic Neo" w:eastAsia="Apple SD Gothic Neo" w:cs="Apple SD Gothic Neo"/>
+          <w:rFonts w:ascii="AppleGothic" w:hAnsi="AppleGothic" w:eastAsia="AppleGothic" w:cs="AppleGothic"/>
           <w:color w:val="182433"/>
           <w:sz w:val="20"/>
         </w:rPr>
@@ -8688,7 +8710,7 @@
       </w:pPr>
       <w:r>
         <w:rPr>
-          <w:rFonts w:ascii="Apple SD Gothic Neo" w:hAnsi="Apple SD Gothic Neo" w:eastAsia="Apple SD Gothic Neo" w:cs="Apple SD Gothic Neo"/>
+          <w:rFonts w:ascii="AppleGothic" w:hAnsi="AppleGothic" w:eastAsia="AppleGothic" w:cs="AppleGothic"/>
           <w:color w:val="182433"/>
           <w:sz w:val="20"/>
         </w:rPr>
@@ -8702,7 +8724,7 @@
       </w:pPr>
       <w:r>
         <w:rPr>
-          <w:rFonts w:ascii="Apple SD Gothic Neo" w:hAnsi="Apple SD Gothic Neo" w:eastAsia="Apple SD Gothic Neo" w:cs="Apple SD Gothic Neo"/>
+          <w:rFonts w:ascii="AppleGothic" w:hAnsi="AppleGothic" w:eastAsia="AppleGothic" w:cs="AppleGothic"/>
           <w:color w:val="182433"/>
           <w:sz w:val="20"/>
         </w:rPr>
@@ -8711,6 +8733,7 @@
     </w:p>
     <w:sectPr>
       <w:footerReference w:type="default" r:id="rId9"/>
+      <w:headerReference w:type="default" r:id="rId14"/>
       <w:pgSz w:w="11906" w:h="16838"/>
       <w:pgMar w:top="1020" w:right="1077" w:bottom="964" w:left="1077" w:header="720" w:footer="720" w:gutter="0"/>
       <w:cols w:space="720"/>
@@ -8729,7 +8752,7 @@
     </w:pPr>
     <w:r>
       <w:rPr>
-        <w:rFonts w:ascii="Noto Sans CJK KR" w:hAnsi="Noto Sans CJK KR" w:eastAsia="Noto Sans CJK KR" w:cs="Noto Sans CJK KR"/>
+        <w:rFonts w:ascii="AppleGothic" w:hAnsi="AppleGothic" w:eastAsia="AppleGothic" w:cs="AppleGothic"/>
         <w:color w:val="5E7084"/>
         <w:sz w:val="17"/>
       </w:rPr>
@@ -8740,6 +8763,16 @@
     </w:r>
   </w:p>
 </w:ftr>
+</file>
+
+<file path=word/header1.xml><?xml version="1.0" encoding="utf-8"?>
+<w:hdr xmlns:m="http://schemas.openxmlformats.org/officeDocument/2006/math" xmlns:mc="http://schemas.openxmlformats.org/markup-compatibility/2006" xmlns:mo="http://schemas.microsoft.com/office/mac/office/2008/main" xmlns:mv="urn:schemas-microsoft-com:mac:vml" xmlns:o="urn:schemas-microsoft-com:office:office" xmlns:r="http://schemas.openxmlformats.org/officeDocument/2006/relationships" xmlns:v="urn:schemas-microsoft-com:vml" xmlns:w10="urn:schemas-microsoft-com:office:word" xmlns:w14="http://schemas.microsoft.com/office/word/2010/wordml" xmlns:w="http://schemas.openxmlformats.org/wordprocessingml/2006/main" xmlns:wne="http://schemas.microsoft.com/office/word/2006/wordml" xmlns:wp14="http://schemas.microsoft.com/office/word/2010/wordprocessingDrawing" xmlns:wp="http://schemas.openxmlformats.org/drawingml/2006/wordprocessingDrawing" xmlns:wpc="http://schemas.microsoft.com/office/word/2010/wordprocessingCanvas" xmlns:wpg="http://schemas.microsoft.com/office/word/2010/wordprocessingGroup" xmlns:wpi="http://schemas.microsoft.com/office/word/2010/wordprocessingInk" xmlns:wps="http://schemas.microsoft.com/office/word/2010/wordprocessingShape" mc:Ignorable="w14 wp14">
+  <w:p>
+    <w:pPr>
+      <w:pStyle w:val="Header"/>
+    </w:pPr>
+  </w:p>
+</w:hdr>
 </file>
 
 <file path=word/numbering.xml><?xml version="1.0" encoding="utf-8"?>
@@ -9109,7 +9142,7 @@
       <w:spacing w:after="120" w:line="278" w:lineRule="auto"/>
     </w:pPr>
     <w:rPr>
-      <w:rFonts w:ascii="Apple SD Gothic Neo" w:hAnsi="Apple SD Gothic Neo" w:eastAsia="Apple SD Gothic Neo" w:cs="Apple SD Gothic Neo"/>
+      <w:rFonts w:ascii="AppleGothic" w:hAnsi="AppleGothic" w:eastAsia="AppleGothic" w:cs="AppleGothic"/>
       <w:color w:val="182433"/>
       <w:sz w:val="20"/>
     </w:rPr>
@@ -9129,7 +9162,7 @@
       <w:spacing w:after="0" w:line="240" w:lineRule="auto"/>
     </w:pPr>
     <w:rPr>
-      <w:rFonts w:ascii="Apple SD Gothic Neo" w:hAnsi="Apple SD Gothic Neo" w:eastAsia="Apple SD Gothic Neo" w:cs="Apple SD Gothic Neo"/>
+      <w:rFonts w:ascii="AppleGothic" w:hAnsi="AppleGothic" w:eastAsia="AppleGothic" w:cs="AppleGothic"/>
     </w:rPr>
   </w:style>
   <w:style w:type="character" w:customStyle="1" w:styleId="HeaderChar">
@@ -9157,7 +9190,7 @@
       <w:spacing w:after="0" w:line="240" w:lineRule="auto"/>
     </w:pPr>
     <w:rPr>
-      <w:rFonts w:ascii="Apple SD Gothic Neo" w:hAnsi="Apple SD Gothic Neo" w:eastAsia="Apple SD Gothic Neo" w:cs="Apple SD Gothic Neo"/>
+      <w:rFonts w:ascii="AppleGothic" w:hAnsi="AppleGothic" w:eastAsia="AppleGothic" w:cs="AppleGothic"/>
     </w:rPr>
   </w:style>
   <w:style w:type="character" w:customStyle="1" w:styleId="FooterChar">
@@ -9185,7 +9218,7 @@
       <w:outlineLvl w:val="0"/>
     </w:pPr>
     <w:rPr>
-      <w:rFonts w:asciiTheme="majorHAnsi" w:eastAsiaTheme="majorEastAsia" w:hAnsiTheme="majorHAnsi" w:cstheme="majorBidi" w:ascii="Apple SD Gothic Neo" w:hAnsi="Apple SD Gothic Neo" w:eastAsia="Apple SD Gothic Neo" w:cs="Apple SD Gothic Neo"/>
+      <w:rFonts w:ascii="AppleGothic" w:hAnsi="AppleGothic" w:eastAsia="AppleGothic" w:cs="AppleGothic"/>
       <w:b/>
       <w:bCs/>
       <w:color w:val="000000"/>
@@ -9209,7 +9242,7 @@
       <w:outlineLvl w:val="1"/>
     </w:pPr>
     <w:rPr>
-      <w:rFonts w:asciiTheme="majorHAnsi" w:eastAsiaTheme="majorEastAsia" w:hAnsiTheme="majorHAnsi" w:cstheme="majorBidi" w:ascii="Apple SD Gothic Neo" w:hAnsi="Apple SD Gothic Neo" w:eastAsia="Apple SD Gothic Neo" w:cs="Apple SD Gothic Neo"/>
+      <w:rFonts w:ascii="AppleGothic" w:hAnsi="AppleGothic" w:eastAsia="AppleGothic" w:cs="AppleGothic"/>
       <w:b/>
       <w:bCs/>
       <w:color w:val="000000"/>
@@ -9233,7 +9266,7 @@
       <w:outlineLvl w:val="2"/>
     </w:pPr>
     <w:rPr>
-      <w:rFonts w:asciiTheme="majorHAnsi" w:eastAsiaTheme="majorEastAsia" w:hAnsiTheme="majorHAnsi" w:cstheme="majorBidi" w:ascii="Apple SD Gothic Neo" w:hAnsi="Apple SD Gothic Neo" w:eastAsia="Apple SD Gothic Neo" w:cs="Apple SD Gothic Neo"/>
+      <w:rFonts w:ascii="AppleGothic" w:hAnsi="AppleGothic" w:eastAsia="AppleGothic" w:cs="AppleGothic"/>
       <w:b/>
       <w:bCs/>
       <w:color w:val="000000"/>
@@ -9257,7 +9290,7 @@
       <w:outlineLvl w:val="3"/>
     </w:pPr>
     <w:rPr>
-      <w:rFonts w:asciiTheme="majorHAnsi" w:eastAsiaTheme="majorEastAsia" w:hAnsiTheme="majorHAnsi" w:cstheme="majorBidi" w:ascii="Apple SD Gothic Neo" w:hAnsi="Apple SD Gothic Neo" w:eastAsia="Apple SD Gothic Neo" w:cs="Apple SD Gothic Neo"/>
+      <w:rFonts w:ascii="AppleGothic" w:hAnsi="AppleGothic" w:eastAsia="AppleGothic" w:cs="AppleGothic"/>
       <w:b/>
       <w:bCs/>
       <w:i/>
@@ -9282,7 +9315,7 @@
       <w:outlineLvl w:val="4"/>
     </w:pPr>
     <w:rPr>
-      <w:rFonts w:asciiTheme="majorHAnsi" w:eastAsiaTheme="majorEastAsia" w:hAnsiTheme="majorHAnsi" w:cstheme="majorBidi" w:ascii="Apple SD Gothic Neo" w:hAnsi="Apple SD Gothic Neo" w:eastAsia="Apple SD Gothic Neo" w:cs="Apple SD Gothic Neo"/>
+      <w:rFonts w:ascii="AppleGothic" w:hAnsi="AppleGothic" w:eastAsia="AppleGothic" w:cs="AppleGothic"/>
       <w:color w:val="243F60" w:themeColor="accent1" w:themeShade="7F"/>
     </w:rPr>
   </w:style>
@@ -9303,7 +9336,7 @@
       <w:outlineLvl w:val="5"/>
     </w:pPr>
     <w:rPr>
-      <w:rFonts w:asciiTheme="majorHAnsi" w:eastAsiaTheme="majorEastAsia" w:hAnsiTheme="majorHAnsi" w:cstheme="majorBidi" w:ascii="Apple SD Gothic Neo" w:hAnsi="Apple SD Gothic Neo" w:eastAsia="Apple SD Gothic Neo" w:cs="Apple SD Gothic Neo"/>
+      <w:rFonts w:ascii="AppleGothic" w:hAnsi="AppleGothic" w:eastAsia="AppleGothic" w:cs="AppleGothic"/>
       <w:i/>
       <w:iCs/>
       <w:color w:val="243F60" w:themeColor="accent1" w:themeShade="7F"/>
@@ -9326,7 +9359,7 @@
       <w:outlineLvl w:val="6"/>
     </w:pPr>
     <w:rPr>
-      <w:rFonts w:asciiTheme="majorHAnsi" w:eastAsiaTheme="majorEastAsia" w:hAnsiTheme="majorHAnsi" w:cstheme="majorBidi" w:ascii="Apple SD Gothic Neo" w:hAnsi="Apple SD Gothic Neo" w:eastAsia="Apple SD Gothic Neo" w:cs="Apple SD Gothic Neo"/>
+      <w:rFonts w:ascii="AppleGothic" w:hAnsi="AppleGothic" w:eastAsia="AppleGothic" w:cs="AppleGothic"/>
       <w:i/>
       <w:iCs/>
       <w:color w:val="404040" w:themeColor="text1" w:themeTint="BF"/>
@@ -9349,7 +9382,7 @@
       <w:outlineLvl w:val="7"/>
     </w:pPr>
     <w:rPr>
-      <w:rFonts w:asciiTheme="majorHAnsi" w:eastAsiaTheme="majorEastAsia" w:hAnsiTheme="majorHAnsi" w:cstheme="majorBidi" w:ascii="Apple SD Gothic Neo" w:hAnsi="Apple SD Gothic Neo" w:eastAsia="Apple SD Gothic Neo" w:cs="Apple SD Gothic Neo"/>
+      <w:rFonts w:ascii="AppleGothic" w:hAnsi="AppleGothic" w:eastAsia="AppleGothic" w:cs="AppleGothic"/>
       <w:color w:val="4F81BD" w:themeColor="accent1"/>
       <w:sz w:val="20"/>
       <w:szCs w:val="20"/>
@@ -9372,7 +9405,7 @@
       <w:outlineLvl w:val="8"/>
     </w:pPr>
     <w:rPr>
-      <w:rFonts w:asciiTheme="majorHAnsi" w:eastAsiaTheme="majorEastAsia" w:hAnsiTheme="majorHAnsi" w:cstheme="majorBidi" w:ascii="Apple SD Gothic Neo" w:hAnsi="Apple SD Gothic Neo" w:eastAsia="Apple SD Gothic Neo" w:cs="Apple SD Gothic Neo"/>
+      <w:rFonts w:ascii="AppleGothic" w:hAnsi="AppleGothic" w:eastAsia="AppleGothic" w:cs="AppleGothic"/>
       <w:i/>
       <w:iCs/>
       <w:color w:val="404040" w:themeColor="text1" w:themeTint="BF"/>
@@ -9422,7 +9455,7 @@
       <w:spacing w:after="0" w:line="240" w:lineRule="auto"/>
     </w:pPr>
     <w:rPr>
-      <w:rFonts w:ascii="Apple SD Gothic Neo" w:hAnsi="Apple SD Gothic Neo" w:eastAsia="Apple SD Gothic Neo" w:cs="Apple SD Gothic Neo"/>
+      <w:rFonts w:ascii="AppleGothic" w:hAnsi="AppleGothic" w:eastAsia="AppleGothic" w:cs="AppleGothic"/>
     </w:rPr>
   </w:style>
   <w:style w:type="character" w:customStyle="1" w:styleId="Heading1Char">
@@ -9481,7 +9514,7 @@
       <w:contextualSpacing/>
     </w:pPr>
     <w:rPr>
-      <w:rFonts w:asciiTheme="majorHAnsi" w:eastAsiaTheme="majorEastAsia" w:hAnsiTheme="majorHAnsi" w:cstheme="majorBidi" w:ascii="Apple SD Gothic Neo" w:hAnsi="Apple SD Gothic Neo" w:eastAsia="Apple SD Gothic Neo" w:cs="Apple SD Gothic Neo"/>
+      <w:rFonts w:ascii="AppleGothic" w:hAnsi="AppleGothic" w:eastAsia="AppleGothic" w:cs="AppleGothic"/>
       <w:b/>
       <w:color w:val="000000"/>
       <w:spacing w:val="5"/>
@@ -9519,7 +9552,7 @@
       </w:numPr>
     </w:pPr>
     <w:rPr>
-      <w:rFonts w:asciiTheme="majorHAnsi" w:eastAsiaTheme="majorEastAsia" w:hAnsiTheme="majorHAnsi" w:cstheme="majorBidi" w:ascii="Apple SD Gothic Neo" w:hAnsi="Apple SD Gothic Neo" w:eastAsia="Apple SD Gothic Neo" w:cs="Apple SD Gothic Neo"/>
+      <w:rFonts w:ascii="AppleGothic" w:hAnsi="AppleGothic" w:eastAsia="AppleGothic" w:cs="AppleGothic"/>
       <w:i/>
       <w:iCs/>
       <w:color w:val="4F81BD" w:themeColor="accent1"/>
@@ -9555,7 +9588,7 @@
       <w:contextualSpacing/>
     </w:pPr>
     <w:rPr>
-      <w:rFonts w:ascii="Apple SD Gothic Neo" w:hAnsi="Apple SD Gothic Neo" w:eastAsia="Apple SD Gothic Neo" w:cs="Apple SD Gothic Neo"/>
+      <w:rFonts w:ascii="AppleGothic" w:hAnsi="AppleGothic" w:eastAsia="AppleGothic" w:cs="AppleGothic"/>
     </w:rPr>
   </w:style>
   <w:style w:type="paragraph" w:styleId="BodyText">
@@ -9569,7 +9602,7 @@
       <w:spacing w:after="120"/>
     </w:pPr>
     <w:rPr>
-      <w:rFonts w:ascii="Apple SD Gothic Neo" w:hAnsi="Apple SD Gothic Neo" w:eastAsia="Apple SD Gothic Neo" w:cs="Apple SD Gothic Neo"/>
+      <w:rFonts w:ascii="AppleGothic" w:hAnsi="AppleGothic" w:eastAsia="AppleGothic" w:cs="AppleGothic"/>
     </w:rPr>
   </w:style>
   <w:style w:type="character" w:customStyle="1" w:styleId="BodyTextChar">
@@ -9593,7 +9626,7 @@
       <w:spacing w:after="120" w:line="480" w:lineRule="auto"/>
     </w:pPr>
     <w:rPr>
-      <w:rFonts w:ascii="Apple SD Gothic Neo" w:hAnsi="Apple SD Gothic Neo" w:eastAsia="Apple SD Gothic Neo" w:cs="Apple SD Gothic Neo"/>
+      <w:rFonts w:ascii="AppleGothic" w:hAnsi="AppleGothic" w:eastAsia="AppleGothic" w:cs="AppleGothic"/>
     </w:rPr>
   </w:style>
   <w:style w:type="character" w:customStyle="1" w:styleId="BodyText2Char">
@@ -9617,7 +9650,7 @@
       <w:spacing w:after="120"/>
     </w:pPr>
     <w:rPr>
-      <w:rFonts w:ascii="Apple SD Gothic Neo" w:hAnsi="Apple SD Gothic Neo" w:eastAsia="Apple SD Gothic Neo" w:cs="Apple SD Gothic Neo"/>
+      <w:rFonts w:ascii="AppleGothic" w:hAnsi="AppleGothic" w:eastAsia="AppleGothic" w:cs="AppleGothic"/>
       <w:sz w:val="16"/>
       <w:szCs w:val="16"/>
     </w:rPr>
@@ -9645,7 +9678,7 @@
       <w:contextualSpacing/>
     </w:pPr>
     <w:rPr>
-      <w:rFonts w:ascii="Apple SD Gothic Neo" w:hAnsi="Apple SD Gothic Neo" w:eastAsia="Apple SD Gothic Neo" w:cs="Apple SD Gothic Neo"/>
+      <w:rFonts w:ascii="AppleGothic" w:hAnsi="AppleGothic" w:eastAsia="AppleGothic" w:cs="AppleGothic"/>
     </w:rPr>
   </w:style>
   <w:style w:type="paragraph" w:styleId="List2">
@@ -9659,7 +9692,7 @@
       <w:contextualSpacing/>
     </w:pPr>
     <w:rPr>
-      <w:rFonts w:ascii="Apple SD Gothic Neo" w:hAnsi="Apple SD Gothic Neo" w:eastAsia="Apple SD Gothic Neo" w:cs="Apple SD Gothic Neo"/>
+      <w:rFonts w:ascii="AppleGothic" w:hAnsi="AppleGothic" w:eastAsia="AppleGothic" w:cs="AppleGothic"/>
     </w:rPr>
   </w:style>
   <w:style w:type="paragraph" w:styleId="List3">
@@ -9673,7 +9706,7 @@
       <w:contextualSpacing/>
     </w:pPr>
     <w:rPr>
-      <w:rFonts w:ascii="Apple SD Gothic Neo" w:hAnsi="Apple SD Gothic Neo" w:eastAsia="Apple SD Gothic Neo" w:cs="Apple SD Gothic Neo"/>
+      <w:rFonts w:ascii="AppleGothic" w:hAnsi="AppleGothic" w:eastAsia="AppleGothic" w:cs="AppleGothic"/>
     </w:rPr>
   </w:style>
   <w:style w:type="paragraph" w:styleId="ListBullet">
@@ -9689,7 +9722,7 @@
       <w:contextualSpacing/>
     </w:pPr>
     <w:rPr>
-      <w:rFonts w:ascii="Apple SD Gothic Neo" w:hAnsi="Apple SD Gothic Neo" w:eastAsia="Apple SD Gothic Neo" w:cs="Apple SD Gothic Neo"/>
+      <w:rFonts w:ascii="AppleGothic" w:hAnsi="AppleGothic" w:eastAsia="AppleGothic" w:cs="AppleGothic"/>
     </w:rPr>
   </w:style>
   <w:style w:type="paragraph" w:styleId="ListBullet2">
@@ -9705,7 +9738,7 @@
       <w:contextualSpacing/>
     </w:pPr>
     <w:rPr>
-      <w:rFonts w:ascii="Apple SD Gothic Neo" w:hAnsi="Apple SD Gothic Neo" w:eastAsia="Apple SD Gothic Neo" w:cs="Apple SD Gothic Neo"/>
+      <w:rFonts w:ascii="AppleGothic" w:hAnsi="AppleGothic" w:eastAsia="AppleGothic" w:cs="AppleGothic"/>
     </w:rPr>
   </w:style>
   <w:style w:type="paragraph" w:styleId="ListBullet3">
@@ -9721,7 +9754,7 @@
       <w:contextualSpacing/>
     </w:pPr>
     <w:rPr>
-      <w:rFonts w:ascii="Apple SD Gothic Neo" w:hAnsi="Apple SD Gothic Neo" w:eastAsia="Apple SD Gothic Neo" w:cs="Apple SD Gothic Neo"/>
+      <w:rFonts w:ascii="AppleGothic" w:hAnsi="AppleGothic" w:eastAsia="AppleGothic" w:cs="AppleGothic"/>
     </w:rPr>
   </w:style>
   <w:style w:type="paragraph" w:styleId="ListNumber">
@@ -9737,7 +9770,7 @@
       <w:contextualSpacing/>
     </w:pPr>
     <w:rPr>
-      <w:rFonts w:ascii="Apple SD Gothic Neo" w:hAnsi="Apple SD Gothic Neo" w:eastAsia="Apple SD Gothic Neo" w:cs="Apple SD Gothic Neo"/>
+      <w:rFonts w:ascii="AppleGothic" w:hAnsi="AppleGothic" w:eastAsia="AppleGothic" w:cs="AppleGothic"/>
     </w:rPr>
   </w:style>
   <w:style w:type="paragraph" w:styleId="ListNumber2">
@@ -9753,7 +9786,7 @@
       <w:contextualSpacing/>
     </w:pPr>
     <w:rPr>
-      <w:rFonts w:ascii="Apple SD Gothic Neo" w:hAnsi="Apple SD Gothic Neo" w:eastAsia="Apple SD Gothic Neo" w:cs="Apple SD Gothic Neo"/>
+      <w:rFonts w:ascii="AppleGothic" w:hAnsi="AppleGothic" w:eastAsia="AppleGothic" w:cs="AppleGothic"/>
     </w:rPr>
   </w:style>
   <w:style w:type="paragraph" w:styleId="ListNumber3">
@@ -9769,7 +9802,7 @@
       <w:contextualSpacing/>
     </w:pPr>
     <w:rPr>
-      <w:rFonts w:ascii="Apple SD Gothic Neo" w:hAnsi="Apple SD Gothic Neo" w:eastAsia="Apple SD Gothic Neo" w:cs="Apple SD Gothic Neo"/>
+      <w:rFonts w:ascii="AppleGothic" w:hAnsi="AppleGothic" w:eastAsia="AppleGothic" w:cs="AppleGothic"/>
     </w:rPr>
   </w:style>
   <w:style w:type="paragraph" w:styleId="ListContinue">
@@ -9784,7 +9817,7 @@
       <w:contextualSpacing/>
     </w:pPr>
     <w:rPr>
-      <w:rFonts w:ascii="Apple SD Gothic Neo" w:hAnsi="Apple SD Gothic Neo" w:eastAsia="Apple SD Gothic Neo" w:cs="Apple SD Gothic Neo"/>
+      <w:rFonts w:ascii="AppleGothic" w:hAnsi="AppleGothic" w:eastAsia="AppleGothic" w:cs="AppleGothic"/>
     </w:rPr>
   </w:style>
   <w:style w:type="paragraph" w:styleId="ListContinue2">
@@ -9799,7 +9832,7 @@
       <w:contextualSpacing/>
     </w:pPr>
     <w:rPr>
-      <w:rFonts w:ascii="Apple SD Gothic Neo" w:hAnsi="Apple SD Gothic Neo" w:eastAsia="Apple SD Gothic Neo" w:cs="Apple SD Gothic Neo"/>
+      <w:rFonts w:ascii="AppleGothic" w:hAnsi="AppleGothic" w:eastAsia="AppleGothic" w:cs="AppleGothic"/>
     </w:rPr>
   </w:style>
   <w:style w:type="paragraph" w:styleId="ListContinue3">
@@ -9814,7 +9847,7 @@
       <w:contextualSpacing/>
     </w:pPr>
     <w:rPr>
-      <w:rFonts w:ascii="Apple SD Gothic Neo" w:hAnsi="Apple SD Gothic Neo" w:eastAsia="Apple SD Gothic Neo" w:cs="Apple SD Gothic Neo"/>
+      <w:rFonts w:ascii="AppleGothic" w:hAnsi="AppleGothic" w:eastAsia="AppleGothic" w:cs="AppleGothic"/>
     </w:rPr>
   </w:style>
   <w:style w:type="paragraph" w:styleId="MacroText">
@@ -9835,7 +9868,7 @@
       </w:tabs>
     </w:pPr>
     <w:rPr>
-      <w:rFonts w:ascii="Apple SD Gothic Neo" w:hAnsi="Apple SD Gothic Neo" w:eastAsia="Apple SD Gothic Neo" w:cs="Apple SD Gothic Neo"/>
+      <w:rFonts w:ascii="AppleGothic" w:hAnsi="AppleGothic" w:eastAsia="AppleGothic" w:cs="AppleGothic"/>
       <w:sz w:val="20"/>
       <w:szCs w:val="20"/>
     </w:rPr>
@@ -9861,7 +9894,7 @@
     <w:qFormat/>
     <w:rsid w:val="00FC693F"/>
     <w:rPr>
-      <w:rFonts w:ascii="Apple SD Gothic Neo" w:hAnsi="Apple SD Gothic Neo" w:eastAsia="Apple SD Gothic Neo" w:cs="Apple SD Gothic Neo"/>
+      <w:rFonts w:ascii="AppleGothic" w:hAnsi="AppleGothic" w:eastAsia="AppleGothic" w:cs="AppleGothic"/>
       <w:i/>
       <w:iCs/>
       <w:color w:val="000000" w:themeColor="text1"/>
@@ -9979,7 +10012,7 @@
       <w:spacing w:line="240" w:lineRule="auto"/>
     </w:pPr>
     <w:rPr>
-      <w:rFonts w:ascii="Apple SD Gothic Neo" w:hAnsi="Apple SD Gothic Neo" w:eastAsia="Apple SD Gothic Neo" w:cs="Apple SD Gothic Neo"/>
+      <w:rFonts w:ascii="AppleGothic" w:hAnsi="AppleGothic" w:eastAsia="AppleGothic" w:cs="AppleGothic"/>
       <w:b/>
       <w:bCs/>
       <w:color w:val="4F81BD" w:themeColor="accent1"/>
@@ -10027,7 +10060,7 @@
       <w:ind w:left="936" w:right="936"/>
     </w:pPr>
     <w:rPr>
-      <w:rFonts w:ascii="Apple SD Gothic Neo" w:hAnsi="Apple SD Gothic Neo" w:eastAsia="Apple SD Gothic Neo" w:cs="Apple SD Gothic Neo"/>
+      <w:rFonts w:ascii="AppleGothic" w:hAnsi="AppleGothic" w:eastAsia="AppleGothic" w:cs="AppleGothic"/>
       <w:b/>
       <w:bCs/>
       <w:i/>
@@ -10134,7 +10167,7 @@
       <w:outlineLvl w:val="9"/>
     </w:pPr>
     <w:rPr>
-      <w:rFonts w:ascii="Apple SD Gothic Neo" w:hAnsi="Apple SD Gothic Neo" w:eastAsia="Apple SD Gothic Neo" w:cs="Apple SD Gothic Neo"/>
+      <w:rFonts w:ascii="AppleGothic" w:hAnsi="AppleGothic" w:eastAsia="AppleGothic" w:cs="AppleGothic"/>
     </w:rPr>
   </w:style>
   <w:style w:type="table" w:styleId="TableGrid">

</xml_diff>